<commit_message>
Fix ranking attribution: use homepage RDs for keywords where homepage ranks
KW1 (customer loyalty software) and KW5 (customer loyalty program software)
were showing the focus page RDs (2 and 0) even though the homepage is the
actual ranking URL (pos 2 and pos 4). Updated to reflect homepage (728 RDs),
which closes the gap to 0 for both — the issue is content targeting, not
backlinks.

Co-Authored-By: Claude Sonnet 4.6 <noreply@anthropic.com>
Claude-Session: https://claude.ai/code/session_01PUXopWm3tyc7SXkeM8DDZy
</commit_message>
<xml_diff>
--- a/backlink_gap_2026.docx
+++ b/backlink_gap_2026.docx
@@ -494,7 +494,7 @@
                 <w:color w:val="111827"/>
                 <w:sz w:val="16"/>
               </w:rPr>
-              <w:t>/insider/best-loyalty-software-comparison-guide</w:t>
+              <w:t>/ (homepage)</w:t>
             </w:r>
           </w:p>
         </w:tc>
@@ -514,7 +514,7 @@
                 <w:color w:val="111827"/>
                 <w:sz w:val="16"/>
               </w:rPr>
-              <w:t>not ranking (homepage at pos 2)</w:t>
+              <w:t>2</w:t>
             </w:r>
           </w:p>
         </w:tc>
@@ -534,7 +534,7 @@
                 <w:color w:val="111827"/>
                 <w:sz w:val="16"/>
               </w:rPr>
-              <w:t>2</w:t>
+              <w:t>728</w:t>
             </w:r>
           </w:p>
         </w:tc>
@@ -571,11 +571,10 @@
             <w:r>
               <w:rPr>
                 <w:rFonts w:ascii="Calibri" w:hAnsi="Calibri"/>
-                <w:b/>
-                <w:color w:val="DC2626"/>
+                <w:color w:val="059669"/>
                 <w:sz w:val="16"/>
               </w:rPr>
-              <w:t>177</w:t>
+              <w:t>0</w:t>
             </w:r>
           </w:p>
         </w:tc>
@@ -615,7 +614,7 @@
                 <w:color w:val="111827"/>
                 <w:sz w:val="16"/>
               </w:rPr>
-              <w:t>177</w:t>
+              <w:t>0</w:t>
             </w:r>
           </w:p>
         </w:tc>
@@ -1225,7 +1224,7 @@
                 <w:color w:val="111827"/>
                 <w:sz w:val="16"/>
               </w:rPr>
-              <w:t>/technology/loyalty-program-api</w:t>
+              <w:t>/ (homepage)</w:t>
             </w:r>
           </w:p>
         </w:tc>
@@ -1245,7 +1244,7 @@
                 <w:color w:val="111827"/>
                 <w:sz w:val="16"/>
               </w:rPr>
-              <w:t>not ranking (homepage at pos 4)</w:t>
+              <w:t>4</w:t>
             </w:r>
           </w:p>
         </w:tc>
@@ -1265,7 +1264,7 @@
                 <w:color w:val="111827"/>
                 <w:sz w:val="16"/>
               </w:rPr>
-              <w:t>0</w:t>
+              <w:t>728</w:t>
             </w:r>
           </w:p>
         </w:tc>
@@ -1302,11 +1301,10 @@
             <w:r>
               <w:rPr>
                 <w:rFonts w:ascii="Calibri" w:hAnsi="Calibri"/>
-                <w:b/>
-                <w:color w:val="DC2626"/>
+                <w:color w:val="059669"/>
                 <w:sz w:val="16"/>
               </w:rPr>
-              <w:t>179</w:t>
+              <w:t>0</w:t>
             </w:r>
           </w:p>
         </w:tc>
@@ -1346,7 +1344,7 @@
                 <w:color w:val="111827"/>
                 <w:sz w:val="16"/>
               </w:rPr>
-              <w:t>179</w:t>
+              <w:t>0</w:t>
             </w:r>
           </w:p>
         </w:tc>
@@ -2330,7 +2328,7 @@
                 <w:color w:val="1A56DB"/>
                 <w:sz w:val="28"/>
               </w:rPr>
-              <w:t>/insider/best-loyalty-software-comparison-guide</w:t>
+              <w:t>/ (homepage)</w:t>
               <w:br/>
             </w:r>
             <w:r>
@@ -2360,7 +2358,7 @@
                 <w:color w:val="1A56DB"/>
                 <w:sz w:val="28"/>
               </w:rPr>
-              <w:t>not ranking (homepage at pos 2)</w:t>
+              <w:t>2</w:t>
               <w:br/>
             </w:r>
             <w:r>
@@ -2390,7 +2388,7 @@
                 <w:color w:val="1A56DB"/>
                 <w:sz w:val="28"/>
               </w:rPr>
-              <w:t>2</w:t>
+              <w:t>728</w:t>
               <w:br/>
             </w:r>
             <w:r>
@@ -2420,7 +2418,7 @@
                 <w:color w:val="1A56DB"/>
                 <w:sz w:val="28"/>
               </w:rPr>
-              <w:t>+177 RDs</w:t>
+              <w:t>No gap</w:t>
               <w:br/>
             </w:r>
             <w:r>
@@ -7508,7 +7506,7 @@
                 <w:color w:val="1A56DB"/>
                 <w:sz w:val="28"/>
               </w:rPr>
-              <w:t>/technology/loyalty-program-api</w:t>
+              <w:t>/ (homepage)</w:t>
               <w:br/>
             </w:r>
             <w:r>
@@ -7538,7 +7536,7 @@
                 <w:color w:val="1A56DB"/>
                 <w:sz w:val="28"/>
               </w:rPr>
-              <w:t>not ranking (homepage at pos 4)</w:t>
+              <w:t>4</w:t>
               <w:br/>
             </w:r>
             <w:r>
@@ -7568,7 +7566,7 @@
                 <w:color w:val="1A56DB"/>
                 <w:sz w:val="28"/>
               </w:rPr>
-              <w:t>0</w:t>
+              <w:t>728</w:t>
               <w:br/>
             </w:r>
             <w:r>
@@ -7598,7 +7596,7 @@
                 <w:color w:val="1A56DB"/>
                 <w:sz w:val="28"/>
               </w:rPr>
-              <w:t>+179 RDs</w:t>
+              <w:t>No gap</w:t>
               <w:br/>
             </w:r>
             <w:r>

</xml_diff>

<commit_message>
Add GSC position column (May 2026, US) to backlink gap analysis
Queried GSC Search Analytics API directly for each of the 10 priority
keywords filtered to US, May 2026. Added our_position_gsc_may2026 column
to the CSV and a Pos (GSC May '26) column to the DOCX summary table and
per-keyword KPI strips.

Co-Authored-By: Claude Sonnet 4.6 <noreply@anthropic.com>
Claude-Session: https://claude.ai/code/session_01PUXopWm3tyc7SXkeM8DDZy
</commit_message>
<xml_diff>
--- a/backlink_gap_2026.docx
+++ b/backlink_gap_2026.docx
@@ -241,15 +241,16 @@
         <w:tblLook w:firstColumn="1" w:firstRow="1" w:lastColumn="0" w:lastRow="0" w:noHBand="0" w:noVBand="1" w:val="04A0"/>
       </w:tblPr>
       <w:tblGrid>
-        <w:gridCol w:w="1045"/>
-        <w:gridCol w:w="1045"/>
-        <w:gridCol w:w="1045"/>
-        <w:gridCol w:w="1045"/>
-        <w:gridCol w:w="1045"/>
-        <w:gridCol w:w="1045"/>
-        <w:gridCol w:w="1045"/>
-        <w:gridCol w:w="1045"/>
-        <w:gridCol w:w="1045"/>
+        <w:gridCol w:w="941"/>
+        <w:gridCol w:w="941"/>
+        <w:gridCol w:w="941"/>
+        <w:gridCol w:w="941"/>
+        <w:gridCol w:w="941"/>
+        <w:gridCol w:w="941"/>
+        <w:gridCol w:w="941"/>
+        <w:gridCol w:w="941"/>
+        <w:gridCol w:w="941"/>
+        <w:gridCol w:w="941"/>
       </w:tblGrid>
       <w:tr>
         <w:tc>
@@ -274,7 +275,7 @@
         </w:tc>
         <w:tc>
           <w:tcPr>
-            <w:tcW w:type="dxa" w:w="2381"/>
+            <w:tcW w:type="dxa" w:w="2041"/>
             <w:shd w:val="clear" w:color="auto" w:fill="1A56DB"/>
           </w:tcPr>
           <w:p>
@@ -294,7 +295,7 @@
         </w:tc>
         <w:tc>
           <w:tcPr>
-            <w:tcW w:type="dxa" w:w="2154"/>
+            <w:tcW w:type="dxa" w:w="1928"/>
             <w:shd w:val="clear" w:color="auto" w:fill="1A56DB"/>
           </w:tcPr>
           <w:p>
@@ -314,7 +315,7 @@
         </w:tc>
         <w:tc>
           <w:tcPr>
-            <w:tcW w:type="dxa" w:w="1247"/>
+            <w:tcW w:type="dxa" w:w="850"/>
             <w:shd w:val="clear" w:color="auto" w:fill="1A56DB"/>
           </w:tcPr>
           <w:p>
@@ -328,7 +329,9 @@
                 <w:color w:val="FFFFFF"/>
                 <w:sz w:val="16"/>
               </w:rPr>
-              <w:t>Our Position</w:t>
+              <w:t>Pos</w:t>
+              <w:br/>
+              <w:t>(Ahrefs)</w:t>
             </w:r>
           </w:p>
         </w:tc>
@@ -348,13 +351,15 @@
                 <w:color w:val="FFFFFF"/>
                 <w:sz w:val="16"/>
               </w:rPr>
-              <w:t>Our Page RDs</w:t>
-            </w:r>
-          </w:p>
-        </w:tc>
-        <w:tc>
-          <w:tcPr>
-            <w:tcW w:type="dxa" w:w="1077"/>
+              <w:t>Pos</w:t>
+              <w:br/>
+              <w:t>(GSC May)</w:t>
+            </w:r>
+          </w:p>
+        </w:tc>
+        <w:tc>
+          <w:tcPr>
+            <w:tcW w:type="dxa" w:w="794"/>
             <w:shd w:val="clear" w:color="auto" w:fill="1A56DB"/>
           </w:tcPr>
           <w:p>
@@ -368,6 +373,26 @@
                 <w:color w:val="FFFFFF"/>
                 <w:sz w:val="16"/>
               </w:rPr>
+              <w:t>Our Page RDs</w:t>
+            </w:r>
+          </w:p>
+        </w:tc>
+        <w:tc>
+          <w:tcPr>
+            <w:tcW w:type="dxa" w:w="1020"/>
+            <w:shd w:val="clear" w:color="auto" w:fill="1A56DB"/>
+          </w:tcPr>
+          <w:p>
+            <w:pPr>
+              <w:jc w:val="center"/>
+            </w:pPr>
+            <w:r>
+              <w:rPr>
+                <w:rFonts w:ascii="Calibri" w:hAnsi="Calibri"/>
+                <w:b/>
+                <w:color w:val="FFFFFF"/>
+                <w:sz w:val="16"/>
+              </w:rPr>
               <w:t>Median Comp. RDs</w:t>
               <w:br/>
               <w:t>(top 5)</w:t>
@@ -376,7 +401,7 @@
         </w:tc>
         <w:tc>
           <w:tcPr>
-            <w:tcW w:type="dxa" w:w="680"/>
+            <w:tcW w:type="dxa" w:w="624"/>
             <w:shd w:val="clear" w:color="auto" w:fill="1A56DB"/>
           </w:tcPr>
           <w:p>
@@ -396,7 +421,7 @@
         </w:tc>
         <w:tc>
           <w:tcPr>
-            <w:tcW w:type="dxa" w:w="850"/>
+            <w:tcW w:type="dxa" w:w="794"/>
             <w:shd w:val="clear" w:color="auto" w:fill="1A56DB"/>
           </w:tcPr>
           <w:p>
@@ -416,7 +441,7 @@
         </w:tc>
         <w:tc>
           <w:tcPr>
-            <w:tcW w:type="dxa" w:w="850"/>
+            <w:tcW w:type="dxa" w:w="794"/>
             <w:shd w:val="clear" w:color="auto" w:fill="1A56DB"/>
           </w:tcPr>
           <w:p>
@@ -460,7 +485,7 @@
         </w:tc>
         <w:tc>
           <w:tcPr>
-            <w:tcW w:type="dxa" w:w="2381"/>
+            <w:tcW w:type="dxa" w:w="2041"/>
             <w:shd w:val="clear" w:color="auto" w:fill="F3F4F6"/>
           </w:tcPr>
           <w:p>
@@ -480,7 +505,7 @@
         </w:tc>
         <w:tc>
           <w:tcPr>
-            <w:tcW w:type="dxa" w:w="2154"/>
+            <w:tcW w:type="dxa" w:w="1928"/>
             <w:shd w:val="clear" w:color="auto" w:fill="F3F4F6"/>
           </w:tcPr>
           <w:p>
@@ -500,26 +525,6 @@
         </w:tc>
         <w:tc>
           <w:tcPr>
-            <w:tcW w:type="dxa" w:w="1247"/>
-            <w:shd w:val="clear" w:color="auto" w:fill="F3F4F6"/>
-          </w:tcPr>
-          <w:p>
-            <w:pPr>
-              <w:spacing w:before="40" w:after="40"/>
-              <w:jc w:val="center"/>
-            </w:pPr>
-            <w:r>
-              <w:rPr>
-                <w:rFonts w:ascii="Calibri" w:hAnsi="Calibri"/>
-                <w:color w:val="111827"/>
-                <w:sz w:val="16"/>
-              </w:rPr>
-              <w:t>2</w:t>
-            </w:r>
-          </w:p>
-        </w:tc>
-        <w:tc>
-          <w:tcPr>
             <w:tcW w:type="dxa" w:w="850"/>
             <w:shd w:val="clear" w:color="auto" w:fill="F3F4F6"/>
           </w:tcPr>
@@ -534,13 +539,53 @@
                 <w:color w:val="111827"/>
                 <w:sz w:val="16"/>
               </w:rPr>
+              <w:t>2</w:t>
+            </w:r>
+          </w:p>
+        </w:tc>
+        <w:tc>
+          <w:tcPr>
+            <w:tcW w:type="dxa" w:w="850"/>
+            <w:shd w:val="clear" w:color="auto" w:fill="F3F4F6"/>
+          </w:tcPr>
+          <w:p>
+            <w:pPr>
+              <w:spacing w:before="40" w:after="40"/>
+              <w:jc w:val="center"/>
+            </w:pPr>
+            <w:r>
+              <w:rPr>
+                <w:rFonts w:ascii="Calibri" w:hAnsi="Calibri"/>
+                <w:color w:val="111827"/>
+                <w:sz w:val="16"/>
+              </w:rPr>
+              <w:t>6.8</w:t>
+            </w:r>
+          </w:p>
+        </w:tc>
+        <w:tc>
+          <w:tcPr>
+            <w:tcW w:type="dxa" w:w="794"/>
+            <w:shd w:val="clear" w:color="auto" w:fill="F3F4F6"/>
+          </w:tcPr>
+          <w:p>
+            <w:pPr>
+              <w:spacing w:before="40" w:after="40"/>
+              <w:jc w:val="center"/>
+            </w:pPr>
+            <w:r>
+              <w:rPr>
+                <w:rFonts w:ascii="Calibri" w:hAnsi="Calibri"/>
+                <w:color w:val="111827"/>
+                <w:sz w:val="16"/>
+              </w:rPr>
               <w:t>728</w:t>
             </w:r>
           </w:p>
         </w:tc>
         <w:tc>
           <w:tcPr>
-            <w:tcW w:type="dxa" w:w="1077"/>
+            <w:tcW w:type="dxa" w:w="1020"/>
             <w:shd w:val="clear" w:color="auto" w:fill="F3F4F6"/>
           </w:tcPr>
           <w:p>
@@ -560,7 +605,7 @@
         </w:tc>
         <w:tc>
           <w:tcPr>
-            <w:tcW w:type="dxa" w:w="680"/>
+            <w:tcW w:type="dxa" w:w="624"/>
             <w:shd w:val="clear" w:color="auto" w:fill="F3F4F6"/>
           </w:tcPr>
           <w:p>
@@ -580,7 +625,7 @@
         </w:tc>
         <w:tc>
           <w:tcPr>
-            <w:tcW w:type="dxa" w:w="850"/>
+            <w:tcW w:type="dxa" w:w="794"/>
             <w:shd w:val="clear" w:color="auto" w:fill="F3F4F6"/>
           </w:tcPr>
           <w:p>
@@ -600,7 +645,7 @@
         </w:tc>
         <w:tc>
           <w:tcPr>
-            <w:tcW w:type="dxa" w:w="850"/>
+            <w:tcW w:type="dxa" w:w="794"/>
             <w:shd w:val="clear" w:color="auto" w:fill="F3F4F6"/>
           </w:tcPr>
           <w:p>
@@ -642,7 +687,7 @@
         </w:tc>
         <w:tc>
           <w:tcPr>
-            <w:tcW w:type="dxa" w:w="2381"/>
+            <w:tcW w:type="dxa" w:w="2041"/>
             <w:shd w:val="clear" w:color="auto" w:fill="FFFFFF"/>
           </w:tcPr>
           <w:p>
@@ -662,7 +707,7 @@
         </w:tc>
         <w:tc>
           <w:tcPr>
-            <w:tcW w:type="dxa" w:w="2154"/>
+            <w:tcW w:type="dxa" w:w="1928"/>
             <w:shd w:val="clear" w:color="auto" w:fill="FFFFFF"/>
           </w:tcPr>
           <w:p>
@@ -682,7 +727,7 @@
         </w:tc>
         <w:tc>
           <w:tcPr>
-            <w:tcW w:type="dxa" w:w="1247"/>
+            <w:tcW w:type="dxa" w:w="850"/>
             <w:shd w:val="clear" w:color="auto" w:fill="FFFFFF"/>
           </w:tcPr>
           <w:p>
@@ -716,13 +761,33 @@
                 <w:color w:val="111827"/>
                 <w:sz w:val="16"/>
               </w:rPr>
+              <w:t>5.9</w:t>
+            </w:r>
+          </w:p>
+        </w:tc>
+        <w:tc>
+          <w:tcPr>
+            <w:tcW w:type="dxa" w:w="794"/>
+            <w:shd w:val="clear" w:color="auto" w:fill="FFFFFF"/>
+          </w:tcPr>
+          <w:p>
+            <w:pPr>
+              <w:spacing w:before="40" w:after="40"/>
+              <w:jc w:val="center"/>
+            </w:pPr>
+            <w:r>
+              <w:rPr>
+                <w:rFonts w:ascii="Calibri" w:hAnsi="Calibri"/>
+                <w:color w:val="111827"/>
+                <w:sz w:val="16"/>
+              </w:rPr>
               <w:t>1</w:t>
             </w:r>
           </w:p>
         </w:tc>
         <w:tc>
           <w:tcPr>
-            <w:tcW w:type="dxa" w:w="1077"/>
+            <w:tcW w:type="dxa" w:w="1020"/>
             <w:shd w:val="clear" w:color="auto" w:fill="FFFFFF"/>
           </w:tcPr>
           <w:p>
@@ -742,7 +807,7 @@
         </w:tc>
         <w:tc>
           <w:tcPr>
-            <w:tcW w:type="dxa" w:w="680"/>
+            <w:tcW w:type="dxa" w:w="624"/>
             <w:shd w:val="clear" w:color="auto" w:fill="FFFFFF"/>
           </w:tcPr>
           <w:p>
@@ -763,7 +828,7 @@
         </w:tc>
         <w:tc>
           <w:tcPr>
-            <w:tcW w:type="dxa" w:w="850"/>
+            <w:tcW w:type="dxa" w:w="794"/>
             <w:shd w:val="clear" w:color="auto" w:fill="FFFFFF"/>
           </w:tcPr>
           <w:p>
@@ -783,7 +848,7 @@
         </w:tc>
         <w:tc>
           <w:tcPr>
-            <w:tcW w:type="dxa" w:w="850"/>
+            <w:tcW w:type="dxa" w:w="794"/>
             <w:shd w:val="clear" w:color="auto" w:fill="FFFFFF"/>
           </w:tcPr>
           <w:p>
@@ -825,7 +890,7 @@
         </w:tc>
         <w:tc>
           <w:tcPr>
-            <w:tcW w:type="dxa" w:w="2381"/>
+            <w:tcW w:type="dxa" w:w="2041"/>
             <w:shd w:val="clear" w:color="auto" w:fill="F3F4F6"/>
           </w:tcPr>
           <w:p>
@@ -845,7 +910,7 @@
         </w:tc>
         <w:tc>
           <w:tcPr>
-            <w:tcW w:type="dxa" w:w="2154"/>
+            <w:tcW w:type="dxa" w:w="1928"/>
             <w:shd w:val="clear" w:color="auto" w:fill="F3F4F6"/>
           </w:tcPr>
           <w:p>
@@ -865,26 +930,6 @@
         </w:tc>
         <w:tc>
           <w:tcPr>
-            <w:tcW w:type="dxa" w:w="1247"/>
-            <w:shd w:val="clear" w:color="auto" w:fill="F3F4F6"/>
-          </w:tcPr>
-          <w:p>
-            <w:pPr>
-              <w:spacing w:before="40" w:after="40"/>
-              <w:jc w:val="center"/>
-            </w:pPr>
-            <w:r>
-              <w:rPr>
-                <w:rFonts w:ascii="Calibri" w:hAnsi="Calibri"/>
-                <w:color w:val="111827"/>
-                <w:sz w:val="16"/>
-              </w:rPr>
-              <w:t>not ranking</w:t>
-            </w:r>
-          </w:p>
-        </w:tc>
-        <w:tc>
-          <w:tcPr>
             <w:tcW w:type="dxa" w:w="850"/>
             <w:shd w:val="clear" w:color="auto" w:fill="F3F4F6"/>
           </w:tcPr>
@@ -899,13 +944,53 @@
                 <w:color w:val="111827"/>
                 <w:sz w:val="16"/>
               </w:rPr>
+              <w:t>not ranking</w:t>
+            </w:r>
+          </w:p>
+        </w:tc>
+        <w:tc>
+          <w:tcPr>
+            <w:tcW w:type="dxa" w:w="850"/>
+            <w:shd w:val="clear" w:color="auto" w:fill="F3F4F6"/>
+          </w:tcPr>
+          <w:p>
+            <w:pPr>
+              <w:spacing w:before="40" w:after="40"/>
+              <w:jc w:val="center"/>
+            </w:pPr>
+            <w:r>
+              <w:rPr>
+                <w:rFonts w:ascii="Calibri" w:hAnsi="Calibri"/>
+                <w:color w:val="111827"/>
+                <w:sz w:val="16"/>
+              </w:rPr>
+              <w:t>5.5</w:t>
+            </w:r>
+          </w:p>
+        </w:tc>
+        <w:tc>
+          <w:tcPr>
+            <w:tcW w:type="dxa" w:w="794"/>
+            <w:shd w:val="clear" w:color="auto" w:fill="F3F4F6"/>
+          </w:tcPr>
+          <w:p>
+            <w:pPr>
+              <w:spacing w:before="40" w:after="40"/>
+              <w:jc w:val="center"/>
+            </w:pPr>
+            <w:r>
+              <w:rPr>
+                <w:rFonts w:ascii="Calibri" w:hAnsi="Calibri"/>
+                <w:color w:val="111827"/>
+                <w:sz w:val="16"/>
+              </w:rPr>
               <w:t>2</w:t>
             </w:r>
           </w:p>
         </w:tc>
         <w:tc>
           <w:tcPr>
-            <w:tcW w:type="dxa" w:w="1077"/>
+            <w:tcW w:type="dxa" w:w="1020"/>
             <w:shd w:val="clear" w:color="auto" w:fill="F3F4F6"/>
           </w:tcPr>
           <w:p>
@@ -925,7 +1010,7 @@
         </w:tc>
         <w:tc>
           <w:tcPr>
-            <w:tcW w:type="dxa" w:w="680"/>
+            <w:tcW w:type="dxa" w:w="624"/>
             <w:shd w:val="clear" w:color="auto" w:fill="F3F4F6"/>
           </w:tcPr>
           <w:p>
@@ -946,6 +1031,310 @@
         </w:tc>
         <w:tc>
           <w:tcPr>
+            <w:tcW w:type="dxa" w:w="794"/>
+            <w:shd w:val="clear" w:color="auto" w:fill="F3F4F6"/>
+          </w:tcPr>
+          <w:p>
+            <w:pPr>
+              <w:spacing w:before="40" w:after="40"/>
+              <w:jc w:val="center"/>
+            </w:pPr>
+            <w:r>
+              <w:rPr>
+                <w:rFonts w:ascii="Calibri" w:hAnsi="Calibri"/>
+                <w:color w:val="111827"/>
+                <w:sz w:val="16"/>
+              </w:rPr>
+              <w:t>32</w:t>
+            </w:r>
+          </w:p>
+        </w:tc>
+        <w:tc>
+          <w:tcPr>
+            <w:tcW w:type="dxa" w:w="794"/>
+            <w:shd w:val="clear" w:color="auto" w:fill="F3F4F6"/>
+          </w:tcPr>
+          <w:p>
+            <w:pPr>
+              <w:spacing w:before="40" w:after="40"/>
+              <w:jc w:val="center"/>
+            </w:pPr>
+            <w:r>
+              <w:rPr>
+                <w:rFonts w:ascii="Calibri" w:hAnsi="Calibri"/>
+                <w:color w:val="111827"/>
+                <w:sz w:val="16"/>
+              </w:rPr>
+              <w:t>20</w:t>
+            </w:r>
+          </w:p>
+        </w:tc>
+      </w:tr>
+      <w:tr>
+        <w:tc>
+          <w:tcPr>
+            <w:tcW w:type="dxa" w:w="340"/>
+            <w:shd w:val="clear" w:color="auto" w:fill="FFFFFF"/>
+          </w:tcPr>
+          <w:p>
+            <w:pPr>
+              <w:spacing w:before="40" w:after="40"/>
+              <w:jc w:val="center"/>
+            </w:pPr>
+            <w:r>
+              <w:rPr>
+                <w:rFonts w:ascii="Calibri" w:hAnsi="Calibri"/>
+                <w:color w:val="111827"/>
+                <w:sz w:val="16"/>
+              </w:rPr>
+              <w:t>4</w:t>
+            </w:r>
+          </w:p>
+        </w:tc>
+        <w:tc>
+          <w:tcPr>
+            <w:tcW w:type="dxa" w:w="2041"/>
+            <w:shd w:val="clear" w:color="auto" w:fill="FFFFFF"/>
+          </w:tcPr>
+          <w:p>
+            <w:pPr>
+              <w:spacing w:before="40" w:after="40"/>
+              <w:jc w:val="left"/>
+            </w:pPr>
+            <w:r>
+              <w:rPr>
+                <w:rFonts w:ascii="Calibri" w:hAnsi="Calibri"/>
+                <w:color w:val="111827"/>
+                <w:sz w:val="16"/>
+              </w:rPr>
+              <w:t>loyalty program software</w:t>
+            </w:r>
+          </w:p>
+        </w:tc>
+        <w:tc>
+          <w:tcPr>
+            <w:tcW w:type="dxa" w:w="1928"/>
+            <w:shd w:val="clear" w:color="auto" w:fill="FFFFFF"/>
+          </w:tcPr>
+          <w:p>
+            <w:pPr>
+              <w:spacing w:before="40" w:after="40"/>
+              <w:jc w:val="left"/>
+            </w:pPr>
+            <w:r>
+              <w:rPr>
+                <w:rFonts w:ascii="Calibri" w:hAnsi="Calibri"/>
+                <w:color w:val="111827"/>
+                <w:sz w:val="16"/>
+              </w:rPr>
+              <w:t>/ (homepage)</w:t>
+            </w:r>
+          </w:p>
+        </w:tc>
+        <w:tc>
+          <w:tcPr>
+            <w:tcW w:type="dxa" w:w="850"/>
+            <w:shd w:val="clear" w:color="auto" w:fill="FFFFFF"/>
+          </w:tcPr>
+          <w:p>
+            <w:pPr>
+              <w:spacing w:before="40" w:after="40"/>
+              <w:jc w:val="center"/>
+            </w:pPr>
+            <w:r>
+              <w:rPr>
+                <w:rFonts w:ascii="Calibri" w:hAnsi="Calibri"/>
+                <w:color w:val="111827"/>
+                <w:sz w:val="16"/>
+              </w:rPr>
+              <w:t>4</w:t>
+            </w:r>
+          </w:p>
+        </w:tc>
+        <w:tc>
+          <w:tcPr>
+            <w:tcW w:type="dxa" w:w="850"/>
+            <w:shd w:val="clear" w:color="auto" w:fill="FFFFFF"/>
+          </w:tcPr>
+          <w:p>
+            <w:pPr>
+              <w:spacing w:before="40" w:after="40"/>
+              <w:jc w:val="center"/>
+            </w:pPr>
+            <w:r>
+              <w:rPr>
+                <w:rFonts w:ascii="Calibri" w:hAnsi="Calibri"/>
+                <w:color w:val="111827"/>
+                <w:sz w:val="16"/>
+              </w:rPr>
+              <w:t>12.0</w:t>
+            </w:r>
+          </w:p>
+        </w:tc>
+        <w:tc>
+          <w:tcPr>
+            <w:tcW w:type="dxa" w:w="794"/>
+            <w:shd w:val="clear" w:color="auto" w:fill="FFFFFF"/>
+          </w:tcPr>
+          <w:p>
+            <w:pPr>
+              <w:spacing w:before="40" w:after="40"/>
+              <w:jc w:val="center"/>
+            </w:pPr>
+            <w:r>
+              <w:rPr>
+                <w:rFonts w:ascii="Calibri" w:hAnsi="Calibri"/>
+                <w:color w:val="111827"/>
+                <w:sz w:val="16"/>
+              </w:rPr>
+              <w:t>728</w:t>
+            </w:r>
+          </w:p>
+        </w:tc>
+        <w:tc>
+          <w:tcPr>
+            <w:tcW w:type="dxa" w:w="1020"/>
+            <w:shd w:val="clear" w:color="auto" w:fill="FFFFFF"/>
+          </w:tcPr>
+          <w:p>
+            <w:pPr>
+              <w:spacing w:before="40" w:after="40"/>
+              <w:jc w:val="center"/>
+            </w:pPr>
+            <w:r>
+              <w:rPr>
+                <w:rFonts w:ascii="Calibri" w:hAnsi="Calibri"/>
+                <w:color w:val="111827"/>
+                <w:sz w:val="16"/>
+              </w:rPr>
+              <w:t>179</w:t>
+            </w:r>
+          </w:p>
+        </w:tc>
+        <w:tc>
+          <w:tcPr>
+            <w:tcW w:type="dxa" w:w="624"/>
+            <w:shd w:val="clear" w:color="auto" w:fill="FFFFFF"/>
+          </w:tcPr>
+          <w:p>
+            <w:pPr>
+              <w:spacing w:before="40" w:after="40"/>
+              <w:jc w:val="center"/>
+            </w:pPr>
+            <w:r>
+              <w:rPr>
+                <w:rFonts w:ascii="Calibri" w:hAnsi="Calibri"/>
+                <w:color w:val="059669"/>
+                <w:sz w:val="16"/>
+              </w:rPr>
+              <w:t>0</w:t>
+            </w:r>
+          </w:p>
+        </w:tc>
+        <w:tc>
+          <w:tcPr>
+            <w:tcW w:type="dxa" w:w="794"/>
+            <w:shd w:val="clear" w:color="auto" w:fill="FFFFFF"/>
+          </w:tcPr>
+          <w:p>
+            <w:pPr>
+              <w:spacing w:before="40" w:after="40"/>
+              <w:jc w:val="center"/>
+            </w:pPr>
+            <w:r>
+              <w:rPr>
+                <w:rFonts w:ascii="Calibri" w:hAnsi="Calibri"/>
+                <w:color w:val="111827"/>
+                <w:sz w:val="16"/>
+              </w:rPr>
+              <w:t>189</w:t>
+            </w:r>
+          </w:p>
+        </w:tc>
+        <w:tc>
+          <w:tcPr>
+            <w:tcW w:type="dxa" w:w="794"/>
+            <w:shd w:val="clear" w:color="auto" w:fill="FFFFFF"/>
+          </w:tcPr>
+          <w:p>
+            <w:pPr>
+              <w:spacing w:before="40" w:after="40"/>
+              <w:jc w:val="center"/>
+            </w:pPr>
+            <w:r>
+              <w:rPr>
+                <w:rFonts w:ascii="Calibri" w:hAnsi="Calibri"/>
+                <w:color w:val="111827"/>
+                <w:sz w:val="16"/>
+              </w:rPr>
+              <w:t>0</w:t>
+            </w:r>
+          </w:p>
+        </w:tc>
+      </w:tr>
+      <w:tr>
+        <w:tc>
+          <w:tcPr>
+            <w:tcW w:type="dxa" w:w="340"/>
+            <w:shd w:val="clear" w:color="auto" w:fill="F3F4F6"/>
+          </w:tcPr>
+          <w:p>
+            <w:pPr>
+              <w:spacing w:before="40" w:after="40"/>
+              <w:jc w:val="center"/>
+            </w:pPr>
+            <w:r>
+              <w:rPr>
+                <w:rFonts w:ascii="Calibri" w:hAnsi="Calibri"/>
+                <w:color w:val="111827"/>
+                <w:sz w:val="16"/>
+              </w:rPr>
+              <w:t>5</w:t>
+            </w:r>
+          </w:p>
+        </w:tc>
+        <w:tc>
+          <w:tcPr>
+            <w:tcW w:type="dxa" w:w="2041"/>
+            <w:shd w:val="clear" w:color="auto" w:fill="F3F4F6"/>
+          </w:tcPr>
+          <w:p>
+            <w:pPr>
+              <w:spacing w:before="40" w:after="40"/>
+              <w:jc w:val="left"/>
+            </w:pPr>
+            <w:r>
+              <w:rPr>
+                <w:rFonts w:ascii="Calibri" w:hAnsi="Calibri"/>
+                <w:color w:val="111827"/>
+                <w:sz w:val="16"/>
+              </w:rPr>
+              <w:t>customer loyalty program software</w:t>
+            </w:r>
+          </w:p>
+        </w:tc>
+        <w:tc>
+          <w:tcPr>
+            <w:tcW w:type="dxa" w:w="1928"/>
+            <w:shd w:val="clear" w:color="auto" w:fill="F3F4F6"/>
+          </w:tcPr>
+          <w:p>
+            <w:pPr>
+              <w:spacing w:before="40" w:after="40"/>
+              <w:jc w:val="left"/>
+            </w:pPr>
+            <w:r>
+              <w:rPr>
+                <w:rFonts w:ascii="Calibri" w:hAnsi="Calibri"/>
+                <w:color w:val="111827"/>
+                <w:sz w:val="16"/>
+              </w:rPr>
+              <w:t>/ (homepage)</w:t>
+            </w:r>
+          </w:p>
+        </w:tc>
+        <w:tc>
+          <w:tcPr>
             <w:tcW w:type="dxa" w:w="850"/>
             <w:shd w:val="clear" w:color="auto" w:fill="F3F4F6"/>
           </w:tcPr>
@@ -960,7 +1349,7 @@
                 <w:color w:val="111827"/>
                 <w:sz w:val="16"/>
               </w:rPr>
-              <w:t>32</w:t>
+              <w:t>4</w:t>
             </w:r>
           </w:p>
         </w:tc>
@@ -980,7 +1369,107 @@
                 <w:color w:val="111827"/>
                 <w:sz w:val="16"/>
               </w:rPr>
-              <w:t>20</w:t>
+              <w:t>13.7</w:t>
+            </w:r>
+          </w:p>
+        </w:tc>
+        <w:tc>
+          <w:tcPr>
+            <w:tcW w:type="dxa" w:w="794"/>
+            <w:shd w:val="clear" w:color="auto" w:fill="F3F4F6"/>
+          </w:tcPr>
+          <w:p>
+            <w:pPr>
+              <w:spacing w:before="40" w:after="40"/>
+              <w:jc w:val="center"/>
+            </w:pPr>
+            <w:r>
+              <w:rPr>
+                <w:rFonts w:ascii="Calibri" w:hAnsi="Calibri"/>
+                <w:color w:val="111827"/>
+                <w:sz w:val="16"/>
+              </w:rPr>
+              <w:t>728</w:t>
+            </w:r>
+          </w:p>
+        </w:tc>
+        <w:tc>
+          <w:tcPr>
+            <w:tcW w:type="dxa" w:w="1020"/>
+            <w:shd w:val="clear" w:color="auto" w:fill="F3F4F6"/>
+          </w:tcPr>
+          <w:p>
+            <w:pPr>
+              <w:spacing w:before="40" w:after="40"/>
+              <w:jc w:val="center"/>
+            </w:pPr>
+            <w:r>
+              <w:rPr>
+                <w:rFonts w:ascii="Calibri" w:hAnsi="Calibri"/>
+                <w:color w:val="111827"/>
+                <w:sz w:val="16"/>
+              </w:rPr>
+              <w:t>179</w:t>
+            </w:r>
+          </w:p>
+        </w:tc>
+        <w:tc>
+          <w:tcPr>
+            <w:tcW w:type="dxa" w:w="624"/>
+            <w:shd w:val="clear" w:color="auto" w:fill="F3F4F6"/>
+          </w:tcPr>
+          <w:p>
+            <w:pPr>
+              <w:spacing w:before="40" w:after="40"/>
+              <w:jc w:val="center"/>
+            </w:pPr>
+            <w:r>
+              <w:rPr>
+                <w:rFonts w:ascii="Calibri" w:hAnsi="Calibri"/>
+                <w:color w:val="059669"/>
+                <w:sz w:val="16"/>
+              </w:rPr>
+              <w:t>0</w:t>
+            </w:r>
+          </w:p>
+        </w:tc>
+        <w:tc>
+          <w:tcPr>
+            <w:tcW w:type="dxa" w:w="794"/>
+            <w:shd w:val="clear" w:color="auto" w:fill="F3F4F6"/>
+          </w:tcPr>
+          <w:p>
+            <w:pPr>
+              <w:spacing w:before="40" w:after="40"/>
+              <w:jc w:val="center"/>
+            </w:pPr>
+            <w:r>
+              <w:rPr>
+                <w:rFonts w:ascii="Calibri" w:hAnsi="Calibri"/>
+                <w:color w:val="111827"/>
+                <w:sz w:val="16"/>
+              </w:rPr>
+              <w:t>189</w:t>
+            </w:r>
+          </w:p>
+        </w:tc>
+        <w:tc>
+          <w:tcPr>
+            <w:tcW w:type="dxa" w:w="794"/>
+            <w:shd w:val="clear" w:color="auto" w:fill="F3F4F6"/>
+          </w:tcPr>
+          <w:p>
+            <w:pPr>
+              <w:spacing w:before="40" w:after="40"/>
+              <w:jc w:val="center"/>
+            </w:pPr>
+            <w:r>
+              <w:rPr>
+                <w:rFonts w:ascii="Calibri" w:hAnsi="Calibri"/>
+                <w:color w:val="111827"/>
+                <w:sz w:val="16"/>
+              </w:rPr>
+              <w:t>0</w:t>
             </w:r>
           </w:p>
         </w:tc>
@@ -1002,13 +1491,13 @@
                 <w:color w:val="111827"/>
                 <w:sz w:val="16"/>
               </w:rPr>
-              <w:t>4</w:t>
-            </w:r>
-          </w:p>
-        </w:tc>
-        <w:tc>
-          <w:tcPr>
-            <w:tcW w:type="dxa" w:w="2381"/>
+              <w:t>6</w:t>
+            </w:r>
+          </w:p>
+        </w:tc>
+        <w:tc>
+          <w:tcPr>
+            <w:tcW w:type="dxa" w:w="2041"/>
             <w:shd w:val="clear" w:color="auto" w:fill="FFFFFF"/>
           </w:tcPr>
           <w:p>
@@ -1022,13 +1511,13 @@
                 <w:color w:val="111827"/>
                 <w:sz w:val="16"/>
               </w:rPr>
-              <w:t>loyalty program software</w:t>
-            </w:r>
-          </w:p>
-        </w:tc>
-        <w:tc>
-          <w:tcPr>
-            <w:tcW w:type="dxa" w:w="2154"/>
+              <w:t>customer loyalty platform</w:t>
+            </w:r>
+          </w:p>
+        </w:tc>
+        <w:tc>
+          <w:tcPr>
+            <w:tcW w:type="dxa" w:w="1928"/>
             <w:shd w:val="clear" w:color="auto" w:fill="FFFFFF"/>
           </w:tcPr>
           <w:p>
@@ -1042,13 +1531,13 @@
                 <w:color w:val="111827"/>
                 <w:sz w:val="16"/>
               </w:rPr>
-              <w:t>/ (homepage)</w:t>
-            </w:r>
-          </w:p>
-        </w:tc>
-        <w:tc>
-          <w:tcPr>
-            <w:tcW w:type="dxa" w:w="1247"/>
+              <w:t>/product/reward-management-system</w:t>
+            </w:r>
+          </w:p>
+        </w:tc>
+        <w:tc>
+          <w:tcPr>
+            <w:tcW w:type="dxa" w:w="850"/>
             <w:shd w:val="clear" w:color="auto" w:fill="FFFFFF"/>
           </w:tcPr>
           <w:p>
@@ -1062,7 +1551,7 @@
                 <w:color w:val="111827"/>
                 <w:sz w:val="16"/>
               </w:rPr>
-              <w:t>4</w:t>
+              <w:t>not ranking</w:t>
             </w:r>
           </w:p>
         </w:tc>
@@ -1082,13 +1571,13 @@
                 <w:color w:val="111827"/>
                 <w:sz w:val="16"/>
               </w:rPr>
-              <w:t>728</w:t>
-            </w:r>
-          </w:p>
-        </w:tc>
-        <w:tc>
-          <w:tcPr>
-            <w:tcW w:type="dxa" w:w="1077"/>
+              <w:t>12.1</w:t>
+            </w:r>
+          </w:p>
+        </w:tc>
+        <w:tc>
+          <w:tcPr>
+            <w:tcW w:type="dxa" w:w="794"/>
             <w:shd w:val="clear" w:color="auto" w:fill="FFFFFF"/>
           </w:tcPr>
           <w:p>
@@ -1102,13 +1591,13 @@
                 <w:color w:val="111827"/>
                 <w:sz w:val="16"/>
               </w:rPr>
-              <w:t>179</w:t>
-            </w:r>
-          </w:p>
-        </w:tc>
-        <w:tc>
-          <w:tcPr>
-            <w:tcW w:type="dxa" w:w="680"/>
+              <w:t>0</w:t>
+            </w:r>
+          </w:p>
+        </w:tc>
+        <w:tc>
+          <w:tcPr>
+            <w:tcW w:type="dxa" w:w="1020"/>
             <w:shd w:val="clear" w:color="auto" w:fill="FFFFFF"/>
           </w:tcPr>
           <w:p>
@@ -1119,360 +1608,16 @@
             <w:r>
               <w:rPr>
                 <w:rFonts w:ascii="Calibri" w:hAnsi="Calibri"/>
-                <w:color w:val="059669"/>
+                <w:color w:val="111827"/>
                 <w:sz w:val="16"/>
               </w:rPr>
-              <w:t>0</w:t>
-            </w:r>
-          </w:p>
-        </w:tc>
-        <w:tc>
-          <w:tcPr>
-            <w:tcW w:type="dxa" w:w="850"/>
-            <w:shd w:val="clear" w:color="auto" w:fill="FFFFFF"/>
-          </w:tcPr>
-          <w:p>
-            <w:pPr>
-              <w:spacing w:before="40" w:after="40"/>
-              <w:jc w:val="center"/>
-            </w:pPr>
-            <w:r>
-              <w:rPr>
-                <w:rFonts w:ascii="Calibri" w:hAnsi="Calibri"/>
-                <w:color w:val="111827"/>
-                <w:sz w:val="16"/>
-              </w:rPr>
-              <w:t>189</w:t>
-            </w:r>
-          </w:p>
-        </w:tc>
-        <w:tc>
-          <w:tcPr>
-            <w:tcW w:type="dxa" w:w="850"/>
-            <w:shd w:val="clear" w:color="auto" w:fill="FFFFFF"/>
-          </w:tcPr>
-          <w:p>
-            <w:pPr>
-              <w:spacing w:before="40" w:after="40"/>
-              <w:jc w:val="center"/>
-            </w:pPr>
-            <w:r>
-              <w:rPr>
-                <w:rFonts w:ascii="Calibri" w:hAnsi="Calibri"/>
-                <w:color w:val="111827"/>
-                <w:sz w:val="16"/>
-              </w:rPr>
-              <w:t>0</w:t>
-            </w:r>
-          </w:p>
-        </w:tc>
-      </w:tr>
-      <w:tr>
-        <w:tc>
-          <w:tcPr>
-            <w:tcW w:type="dxa" w:w="340"/>
-            <w:shd w:val="clear" w:color="auto" w:fill="F3F4F6"/>
-          </w:tcPr>
-          <w:p>
-            <w:pPr>
-              <w:spacing w:before="40" w:after="40"/>
-              <w:jc w:val="center"/>
-            </w:pPr>
-            <w:r>
-              <w:rPr>
-                <w:rFonts w:ascii="Calibri" w:hAnsi="Calibri"/>
-                <w:color w:val="111827"/>
-                <w:sz w:val="16"/>
-              </w:rPr>
-              <w:t>5</w:t>
-            </w:r>
-          </w:p>
-        </w:tc>
-        <w:tc>
-          <w:tcPr>
-            <w:tcW w:type="dxa" w:w="2381"/>
-            <w:shd w:val="clear" w:color="auto" w:fill="F3F4F6"/>
-          </w:tcPr>
-          <w:p>
-            <w:pPr>
-              <w:spacing w:before="40" w:after="40"/>
-              <w:jc w:val="left"/>
-            </w:pPr>
-            <w:r>
-              <w:rPr>
-                <w:rFonts w:ascii="Calibri" w:hAnsi="Calibri"/>
-                <w:color w:val="111827"/>
-                <w:sz w:val="16"/>
-              </w:rPr>
-              <w:t>customer loyalty program software</w:t>
-            </w:r>
-          </w:p>
-        </w:tc>
-        <w:tc>
-          <w:tcPr>
-            <w:tcW w:type="dxa" w:w="2154"/>
-            <w:shd w:val="clear" w:color="auto" w:fill="F3F4F6"/>
-          </w:tcPr>
-          <w:p>
-            <w:pPr>
-              <w:spacing w:before="40" w:after="40"/>
-              <w:jc w:val="left"/>
-            </w:pPr>
-            <w:r>
-              <w:rPr>
-                <w:rFonts w:ascii="Calibri" w:hAnsi="Calibri"/>
-                <w:color w:val="111827"/>
-                <w:sz w:val="16"/>
-              </w:rPr>
-              <w:t>/ (homepage)</w:t>
-            </w:r>
-          </w:p>
-        </w:tc>
-        <w:tc>
-          <w:tcPr>
-            <w:tcW w:type="dxa" w:w="1247"/>
-            <w:shd w:val="clear" w:color="auto" w:fill="F3F4F6"/>
-          </w:tcPr>
-          <w:p>
-            <w:pPr>
-              <w:spacing w:before="40" w:after="40"/>
-              <w:jc w:val="center"/>
-            </w:pPr>
-            <w:r>
-              <w:rPr>
-                <w:rFonts w:ascii="Calibri" w:hAnsi="Calibri"/>
-                <w:color w:val="111827"/>
-                <w:sz w:val="16"/>
-              </w:rPr>
-              <w:t>4</w:t>
-            </w:r>
-          </w:p>
-        </w:tc>
-        <w:tc>
-          <w:tcPr>
-            <w:tcW w:type="dxa" w:w="850"/>
-            <w:shd w:val="clear" w:color="auto" w:fill="F3F4F6"/>
-          </w:tcPr>
-          <w:p>
-            <w:pPr>
-              <w:spacing w:before="40" w:after="40"/>
-              <w:jc w:val="center"/>
-            </w:pPr>
-            <w:r>
-              <w:rPr>
-                <w:rFonts w:ascii="Calibri" w:hAnsi="Calibri"/>
-                <w:color w:val="111827"/>
-                <w:sz w:val="16"/>
-              </w:rPr>
-              <w:t>728</w:t>
-            </w:r>
-          </w:p>
-        </w:tc>
-        <w:tc>
-          <w:tcPr>
-            <w:tcW w:type="dxa" w:w="1077"/>
-            <w:shd w:val="clear" w:color="auto" w:fill="F3F4F6"/>
-          </w:tcPr>
-          <w:p>
-            <w:pPr>
-              <w:spacing w:before="40" w:after="40"/>
-              <w:jc w:val="center"/>
-            </w:pPr>
-            <w:r>
-              <w:rPr>
-                <w:rFonts w:ascii="Calibri" w:hAnsi="Calibri"/>
-                <w:color w:val="111827"/>
-                <w:sz w:val="16"/>
-              </w:rPr>
-              <w:t>179</w:t>
-            </w:r>
-          </w:p>
-        </w:tc>
-        <w:tc>
-          <w:tcPr>
-            <w:tcW w:type="dxa" w:w="680"/>
-            <w:shd w:val="clear" w:color="auto" w:fill="F3F4F6"/>
-          </w:tcPr>
-          <w:p>
-            <w:pPr>
-              <w:spacing w:before="40" w:after="40"/>
-              <w:jc w:val="center"/>
-            </w:pPr>
-            <w:r>
-              <w:rPr>
-                <w:rFonts w:ascii="Calibri" w:hAnsi="Calibri"/>
-                <w:color w:val="059669"/>
-                <w:sz w:val="16"/>
-              </w:rPr>
-              <w:t>0</w:t>
-            </w:r>
-          </w:p>
-        </w:tc>
-        <w:tc>
-          <w:tcPr>
-            <w:tcW w:type="dxa" w:w="850"/>
-            <w:shd w:val="clear" w:color="auto" w:fill="F3F4F6"/>
-          </w:tcPr>
-          <w:p>
-            <w:pPr>
-              <w:spacing w:before="40" w:after="40"/>
-              <w:jc w:val="center"/>
-            </w:pPr>
-            <w:r>
-              <w:rPr>
-                <w:rFonts w:ascii="Calibri" w:hAnsi="Calibri"/>
-                <w:color w:val="111827"/>
-                <w:sz w:val="16"/>
-              </w:rPr>
-              <w:t>189</w:t>
-            </w:r>
-          </w:p>
-        </w:tc>
-        <w:tc>
-          <w:tcPr>
-            <w:tcW w:type="dxa" w:w="850"/>
-            <w:shd w:val="clear" w:color="auto" w:fill="F3F4F6"/>
-          </w:tcPr>
-          <w:p>
-            <w:pPr>
-              <w:spacing w:before="40" w:after="40"/>
-              <w:jc w:val="center"/>
-            </w:pPr>
-            <w:r>
-              <w:rPr>
-                <w:rFonts w:ascii="Calibri" w:hAnsi="Calibri"/>
-                <w:color w:val="111827"/>
-                <w:sz w:val="16"/>
-              </w:rPr>
-              <w:t>0</w:t>
-            </w:r>
-          </w:p>
-        </w:tc>
-      </w:tr>
-      <w:tr>
-        <w:tc>
-          <w:tcPr>
-            <w:tcW w:type="dxa" w:w="340"/>
-            <w:shd w:val="clear" w:color="auto" w:fill="FFFFFF"/>
-          </w:tcPr>
-          <w:p>
-            <w:pPr>
-              <w:spacing w:before="40" w:after="40"/>
-              <w:jc w:val="center"/>
-            </w:pPr>
-            <w:r>
-              <w:rPr>
-                <w:rFonts w:ascii="Calibri" w:hAnsi="Calibri"/>
-                <w:color w:val="111827"/>
-                <w:sz w:val="16"/>
-              </w:rPr>
-              <w:t>6</w:t>
-            </w:r>
-          </w:p>
-        </w:tc>
-        <w:tc>
-          <w:tcPr>
-            <w:tcW w:type="dxa" w:w="2381"/>
-            <w:shd w:val="clear" w:color="auto" w:fill="FFFFFF"/>
-          </w:tcPr>
-          <w:p>
-            <w:pPr>
-              <w:spacing w:before="40" w:after="40"/>
-              <w:jc w:val="left"/>
-            </w:pPr>
-            <w:r>
-              <w:rPr>
-                <w:rFonts w:ascii="Calibri" w:hAnsi="Calibri"/>
-                <w:color w:val="111827"/>
-                <w:sz w:val="16"/>
-              </w:rPr>
-              <w:t>customer loyalty platform</w:t>
-            </w:r>
-          </w:p>
-        </w:tc>
-        <w:tc>
-          <w:tcPr>
-            <w:tcW w:type="dxa" w:w="2154"/>
-            <w:shd w:val="clear" w:color="auto" w:fill="FFFFFF"/>
-          </w:tcPr>
-          <w:p>
-            <w:pPr>
-              <w:spacing w:before="40" w:after="40"/>
-              <w:jc w:val="left"/>
-            </w:pPr>
-            <w:r>
-              <w:rPr>
-                <w:rFonts w:ascii="Calibri" w:hAnsi="Calibri"/>
-                <w:color w:val="111827"/>
-                <w:sz w:val="16"/>
-              </w:rPr>
-              <w:t>/product/reward-management-system</w:t>
-            </w:r>
-          </w:p>
-        </w:tc>
-        <w:tc>
-          <w:tcPr>
-            <w:tcW w:type="dxa" w:w="1247"/>
-            <w:shd w:val="clear" w:color="auto" w:fill="FFFFFF"/>
-          </w:tcPr>
-          <w:p>
-            <w:pPr>
-              <w:spacing w:before="40" w:after="40"/>
-              <w:jc w:val="center"/>
-            </w:pPr>
-            <w:r>
-              <w:rPr>
-                <w:rFonts w:ascii="Calibri" w:hAnsi="Calibri"/>
-                <w:color w:val="111827"/>
-                <w:sz w:val="16"/>
-              </w:rPr>
-              <w:t>not ranking</w:t>
-            </w:r>
-          </w:p>
-        </w:tc>
-        <w:tc>
-          <w:tcPr>
-            <w:tcW w:type="dxa" w:w="850"/>
-            <w:shd w:val="clear" w:color="auto" w:fill="FFFFFF"/>
-          </w:tcPr>
-          <w:p>
-            <w:pPr>
-              <w:spacing w:before="40" w:after="40"/>
-              <w:jc w:val="center"/>
-            </w:pPr>
-            <w:r>
-              <w:rPr>
-                <w:rFonts w:ascii="Calibri" w:hAnsi="Calibri"/>
-                <w:color w:val="111827"/>
-                <w:sz w:val="16"/>
-              </w:rPr>
-              <w:t>0</w:t>
-            </w:r>
-          </w:p>
-        </w:tc>
-        <w:tc>
-          <w:tcPr>
-            <w:tcW w:type="dxa" w:w="1077"/>
-            <w:shd w:val="clear" w:color="auto" w:fill="FFFFFF"/>
-          </w:tcPr>
-          <w:p>
-            <w:pPr>
-              <w:spacing w:before="40" w:after="40"/>
-              <w:jc w:val="center"/>
-            </w:pPr>
-            <w:r>
-              <w:rPr>
-                <w:rFonts w:ascii="Calibri" w:hAnsi="Calibri"/>
-                <w:color w:val="111827"/>
-                <w:sz w:val="16"/>
-              </w:rPr>
               <w:t>22</w:t>
             </w:r>
           </w:p>
         </w:tc>
         <w:tc>
           <w:tcPr>
-            <w:tcW w:type="dxa" w:w="680"/>
+            <w:tcW w:type="dxa" w:w="624"/>
             <w:shd w:val="clear" w:color="auto" w:fill="FFFFFF"/>
           </w:tcPr>
           <w:p>
@@ -1493,7 +1638,7 @@
         </w:tc>
         <w:tc>
           <w:tcPr>
-            <w:tcW w:type="dxa" w:w="850"/>
+            <w:tcW w:type="dxa" w:w="794"/>
             <w:shd w:val="clear" w:color="auto" w:fill="FFFFFF"/>
           </w:tcPr>
           <w:p>
@@ -1513,7 +1658,7 @@
         </w:tc>
         <w:tc>
           <w:tcPr>
-            <w:tcW w:type="dxa" w:w="850"/>
+            <w:tcW w:type="dxa" w:w="794"/>
             <w:shd w:val="clear" w:color="auto" w:fill="FFFFFF"/>
           </w:tcPr>
           <w:p>
@@ -1555,7 +1700,7 @@
         </w:tc>
         <w:tc>
           <w:tcPr>
-            <w:tcW w:type="dxa" w:w="2381"/>
+            <w:tcW w:type="dxa" w:w="2041"/>
             <w:shd w:val="clear" w:color="auto" w:fill="F3F4F6"/>
           </w:tcPr>
           <w:p>
@@ -1575,7 +1720,7 @@
         </w:tc>
         <w:tc>
           <w:tcPr>
-            <w:tcW w:type="dxa" w:w="2154"/>
+            <w:tcW w:type="dxa" w:w="1928"/>
             <w:shd w:val="clear" w:color="auto" w:fill="F3F4F6"/>
           </w:tcPr>
           <w:p>
@@ -1595,26 +1740,6 @@
         </w:tc>
         <w:tc>
           <w:tcPr>
-            <w:tcW w:type="dxa" w:w="1247"/>
-            <w:shd w:val="clear" w:color="auto" w:fill="F3F4F6"/>
-          </w:tcPr>
-          <w:p>
-            <w:pPr>
-              <w:spacing w:before="40" w:after="40"/>
-              <w:jc w:val="center"/>
-            </w:pPr>
-            <w:r>
-              <w:rPr>
-                <w:rFonts w:ascii="Calibri" w:hAnsi="Calibri"/>
-                <w:color w:val="111827"/>
-                <w:sz w:val="16"/>
-              </w:rPr>
-              <w:t>4</w:t>
-            </w:r>
-          </w:p>
-        </w:tc>
-        <w:tc>
-          <w:tcPr>
             <w:tcW w:type="dxa" w:w="850"/>
             <w:shd w:val="clear" w:color="auto" w:fill="F3F4F6"/>
           </w:tcPr>
@@ -1629,13 +1754,53 @@
                 <w:color w:val="111827"/>
                 <w:sz w:val="16"/>
               </w:rPr>
+              <w:t>4</w:t>
+            </w:r>
+          </w:p>
+        </w:tc>
+        <w:tc>
+          <w:tcPr>
+            <w:tcW w:type="dxa" w:w="850"/>
+            <w:shd w:val="clear" w:color="auto" w:fill="F3F4F6"/>
+          </w:tcPr>
+          <w:p>
+            <w:pPr>
+              <w:spacing w:before="40" w:after="40"/>
+              <w:jc w:val="center"/>
+            </w:pPr>
+            <w:r>
+              <w:rPr>
+                <w:rFonts w:ascii="Calibri" w:hAnsi="Calibri"/>
+                <w:color w:val="111827"/>
+                <w:sz w:val="16"/>
+              </w:rPr>
+              <w:t>14.4</w:t>
+            </w:r>
+          </w:p>
+        </w:tc>
+        <w:tc>
+          <w:tcPr>
+            <w:tcW w:type="dxa" w:w="794"/>
+            <w:shd w:val="clear" w:color="auto" w:fill="F3F4F6"/>
+          </w:tcPr>
+          <w:p>
+            <w:pPr>
+              <w:spacing w:before="40" w:after="40"/>
+              <w:jc w:val="center"/>
+            </w:pPr>
+            <w:r>
+              <w:rPr>
+                <w:rFonts w:ascii="Calibri" w:hAnsi="Calibri"/>
+                <w:color w:val="111827"/>
+                <w:sz w:val="16"/>
+              </w:rPr>
               <w:t>728</w:t>
             </w:r>
           </w:p>
         </w:tc>
         <w:tc>
           <w:tcPr>
-            <w:tcW w:type="dxa" w:w="1077"/>
+            <w:tcW w:type="dxa" w:w="1020"/>
             <w:shd w:val="clear" w:color="auto" w:fill="F3F4F6"/>
           </w:tcPr>
           <w:p>
@@ -1655,7 +1820,7 @@
         </w:tc>
         <w:tc>
           <w:tcPr>
-            <w:tcW w:type="dxa" w:w="680"/>
+            <w:tcW w:type="dxa" w:w="624"/>
             <w:shd w:val="clear" w:color="auto" w:fill="F3F4F6"/>
           </w:tcPr>
           <w:p>
@@ -1675,7 +1840,7 @@
         </w:tc>
         <w:tc>
           <w:tcPr>
-            <w:tcW w:type="dxa" w:w="850"/>
+            <w:tcW w:type="dxa" w:w="794"/>
             <w:shd w:val="clear" w:color="auto" w:fill="F3F4F6"/>
           </w:tcPr>
           <w:p>
@@ -1695,7 +1860,7 @@
         </w:tc>
         <w:tc>
           <w:tcPr>
-            <w:tcW w:type="dxa" w:w="850"/>
+            <w:tcW w:type="dxa" w:w="794"/>
             <w:shd w:val="clear" w:color="auto" w:fill="F3F4F6"/>
           </w:tcPr>
           <w:p>
@@ -1737,7 +1902,7 @@
         </w:tc>
         <w:tc>
           <w:tcPr>
-            <w:tcW w:type="dxa" w:w="2381"/>
+            <w:tcW w:type="dxa" w:w="2041"/>
             <w:shd w:val="clear" w:color="auto" w:fill="FFFFFF"/>
           </w:tcPr>
           <w:p>
@@ -1757,7 +1922,7 @@
         </w:tc>
         <w:tc>
           <w:tcPr>
-            <w:tcW w:type="dxa" w:w="2154"/>
+            <w:tcW w:type="dxa" w:w="1928"/>
             <w:shd w:val="clear" w:color="auto" w:fill="FFFFFF"/>
           </w:tcPr>
           <w:p>
@@ -1777,7 +1942,7 @@
         </w:tc>
         <w:tc>
           <w:tcPr>
-            <w:tcW w:type="dxa" w:w="1247"/>
+            <w:tcW w:type="dxa" w:w="850"/>
             <w:shd w:val="clear" w:color="auto" w:fill="FFFFFF"/>
           </w:tcPr>
           <w:p>
@@ -1811,13 +1976,33 @@
                 <w:color w:val="111827"/>
                 <w:sz w:val="16"/>
               </w:rPr>
+              <w:t>17.1</w:t>
+            </w:r>
+          </w:p>
+        </w:tc>
+        <w:tc>
+          <w:tcPr>
+            <w:tcW w:type="dxa" w:w="794"/>
+            <w:shd w:val="clear" w:color="auto" w:fill="FFFFFF"/>
+          </w:tcPr>
+          <w:p>
+            <w:pPr>
+              <w:spacing w:before="40" w:after="40"/>
+              <w:jc w:val="center"/>
+            </w:pPr>
+            <w:r>
+              <w:rPr>
+                <w:rFonts w:ascii="Calibri" w:hAnsi="Calibri"/>
+                <w:color w:val="111827"/>
+                <w:sz w:val="16"/>
+              </w:rPr>
               <w:t>0</w:t>
             </w:r>
           </w:p>
         </w:tc>
         <w:tc>
           <w:tcPr>
-            <w:tcW w:type="dxa" w:w="1077"/>
+            <w:tcW w:type="dxa" w:w="1020"/>
             <w:shd w:val="clear" w:color="auto" w:fill="FFFFFF"/>
           </w:tcPr>
           <w:p>
@@ -1837,7 +2022,7 @@
         </w:tc>
         <w:tc>
           <w:tcPr>
-            <w:tcW w:type="dxa" w:w="680"/>
+            <w:tcW w:type="dxa" w:w="624"/>
             <w:shd w:val="clear" w:color="auto" w:fill="FFFFFF"/>
           </w:tcPr>
           <w:p>
@@ -1858,7 +2043,7 @@
         </w:tc>
         <w:tc>
           <w:tcPr>
-            <w:tcW w:type="dxa" w:w="850"/>
+            <w:tcW w:type="dxa" w:w="794"/>
             <w:shd w:val="clear" w:color="auto" w:fill="FFFFFF"/>
           </w:tcPr>
           <w:p>
@@ -1878,7 +2063,7 @@
         </w:tc>
         <w:tc>
           <w:tcPr>
-            <w:tcW w:type="dxa" w:w="850"/>
+            <w:tcW w:type="dxa" w:w="794"/>
             <w:shd w:val="clear" w:color="auto" w:fill="FFFFFF"/>
           </w:tcPr>
           <w:p>
@@ -1920,7 +2105,7 @@
         </w:tc>
         <w:tc>
           <w:tcPr>
-            <w:tcW w:type="dxa" w:w="2381"/>
+            <w:tcW w:type="dxa" w:w="2041"/>
             <w:shd w:val="clear" w:color="auto" w:fill="F3F4F6"/>
           </w:tcPr>
           <w:p>
@@ -1940,7 +2125,7 @@
         </w:tc>
         <w:tc>
           <w:tcPr>
-            <w:tcW w:type="dxa" w:w="2154"/>
+            <w:tcW w:type="dxa" w:w="1928"/>
             <w:shd w:val="clear" w:color="auto" w:fill="F3F4F6"/>
           </w:tcPr>
           <w:p>
@@ -1960,26 +2145,6 @@
         </w:tc>
         <w:tc>
           <w:tcPr>
-            <w:tcW w:type="dxa" w:w="1247"/>
-            <w:shd w:val="clear" w:color="auto" w:fill="F3F4F6"/>
-          </w:tcPr>
-          <w:p>
-            <w:pPr>
-              <w:spacing w:before="40" w:after="40"/>
-              <w:jc w:val="center"/>
-            </w:pPr>
-            <w:r>
-              <w:rPr>
-                <w:rFonts w:ascii="Calibri" w:hAnsi="Calibri"/>
-                <w:color w:val="111827"/>
-                <w:sz w:val="16"/>
-              </w:rPr>
-              <w:t>not ranking</w:t>
-            </w:r>
-          </w:p>
-        </w:tc>
-        <w:tc>
-          <w:tcPr>
             <w:tcW w:type="dxa" w:w="850"/>
             <w:shd w:val="clear" w:color="auto" w:fill="F3F4F6"/>
           </w:tcPr>
@@ -1994,13 +2159,53 @@
                 <w:color w:val="111827"/>
                 <w:sz w:val="16"/>
               </w:rPr>
+              <w:t>not ranking</w:t>
+            </w:r>
+          </w:p>
+        </w:tc>
+        <w:tc>
+          <w:tcPr>
+            <w:tcW w:type="dxa" w:w="850"/>
+            <w:shd w:val="clear" w:color="auto" w:fill="F3F4F6"/>
+          </w:tcPr>
+          <w:p>
+            <w:pPr>
+              <w:spacing w:before="40" w:after="40"/>
+              <w:jc w:val="center"/>
+            </w:pPr>
+            <w:r>
+              <w:rPr>
+                <w:rFonts w:ascii="Calibri" w:hAnsi="Calibri"/>
+                <w:color w:val="111827"/>
+                <w:sz w:val="16"/>
+              </w:rPr>
+              <w:t>14.4</w:t>
+            </w:r>
+          </w:p>
+        </w:tc>
+        <w:tc>
+          <w:tcPr>
+            <w:tcW w:type="dxa" w:w="794"/>
+            <w:shd w:val="clear" w:color="auto" w:fill="F3F4F6"/>
+          </w:tcPr>
+          <w:p>
+            <w:pPr>
+              <w:spacing w:before="40" w:after="40"/>
+              <w:jc w:val="center"/>
+            </w:pPr>
+            <w:r>
+              <w:rPr>
+                <w:rFonts w:ascii="Calibri" w:hAnsi="Calibri"/>
+                <w:color w:val="111827"/>
+                <w:sz w:val="16"/>
+              </w:rPr>
               <w:t>0</w:t>
             </w:r>
           </w:p>
         </w:tc>
         <w:tc>
           <w:tcPr>
-            <w:tcW w:type="dxa" w:w="1077"/>
+            <w:tcW w:type="dxa" w:w="1020"/>
             <w:shd w:val="clear" w:color="auto" w:fill="F3F4F6"/>
           </w:tcPr>
           <w:p>
@@ -2020,7 +2225,7 @@
         </w:tc>
         <w:tc>
           <w:tcPr>
-            <w:tcW w:type="dxa" w:w="680"/>
+            <w:tcW w:type="dxa" w:w="624"/>
             <w:shd w:val="clear" w:color="auto" w:fill="F3F4F6"/>
           </w:tcPr>
           <w:p>
@@ -2041,7 +2246,7 @@
         </w:tc>
         <w:tc>
           <w:tcPr>
-            <w:tcW w:type="dxa" w:w="850"/>
+            <w:tcW w:type="dxa" w:w="794"/>
             <w:shd w:val="clear" w:color="auto" w:fill="F3F4F6"/>
           </w:tcPr>
           <w:p>
@@ -2061,7 +2266,7 @@
         </w:tc>
         <w:tc>
           <w:tcPr>
-            <w:tcW w:type="dxa" w:w="850"/>
+            <w:tcW w:type="dxa" w:w="794"/>
             <w:shd w:val="clear" w:color="auto" w:fill="F3F4F6"/>
           </w:tcPr>
           <w:p>
@@ -2103,7 +2308,7 @@
         </w:tc>
         <w:tc>
           <w:tcPr>
-            <w:tcW w:type="dxa" w:w="2381"/>
+            <w:tcW w:type="dxa" w:w="2041"/>
             <w:shd w:val="clear" w:color="auto" w:fill="FFFFFF"/>
           </w:tcPr>
           <w:p>
@@ -2123,7 +2328,7 @@
         </w:tc>
         <w:tc>
           <w:tcPr>
-            <w:tcW w:type="dxa" w:w="2154"/>
+            <w:tcW w:type="dxa" w:w="1928"/>
             <w:shd w:val="clear" w:color="auto" w:fill="FFFFFF"/>
           </w:tcPr>
           <w:p>
@@ -2143,7 +2348,7 @@
         </w:tc>
         <w:tc>
           <w:tcPr>
-            <w:tcW w:type="dxa" w:w="1247"/>
+            <w:tcW w:type="dxa" w:w="850"/>
             <w:shd w:val="clear" w:color="auto" w:fill="FFFFFF"/>
           </w:tcPr>
           <w:p>
@@ -2177,13 +2382,33 @@
                 <w:color w:val="111827"/>
                 <w:sz w:val="16"/>
               </w:rPr>
+              <w:t>13.6</w:t>
+            </w:r>
+          </w:p>
+        </w:tc>
+        <w:tc>
+          <w:tcPr>
+            <w:tcW w:type="dxa" w:w="794"/>
+            <w:shd w:val="clear" w:color="auto" w:fill="FFFFFF"/>
+          </w:tcPr>
+          <w:p>
+            <w:pPr>
+              <w:spacing w:before="40" w:after="40"/>
+              <w:jc w:val="center"/>
+            </w:pPr>
+            <w:r>
+              <w:rPr>
+                <w:rFonts w:ascii="Calibri" w:hAnsi="Calibri"/>
+                <w:color w:val="111827"/>
+                <w:sz w:val="16"/>
+              </w:rPr>
               <w:t>0</w:t>
             </w:r>
           </w:p>
         </w:tc>
         <w:tc>
           <w:tcPr>
-            <w:tcW w:type="dxa" w:w="1077"/>
+            <w:tcW w:type="dxa" w:w="1020"/>
             <w:shd w:val="clear" w:color="auto" w:fill="FFFFFF"/>
           </w:tcPr>
           <w:p>
@@ -2203,7 +2428,7 @@
         </w:tc>
         <w:tc>
           <w:tcPr>
-            <w:tcW w:type="dxa" w:w="680"/>
+            <w:tcW w:type="dxa" w:w="624"/>
             <w:shd w:val="clear" w:color="auto" w:fill="FFFFFF"/>
           </w:tcPr>
           <w:p>
@@ -2224,7 +2449,7 @@
         </w:tc>
         <w:tc>
           <w:tcPr>
-            <w:tcW w:type="dxa" w:w="850"/>
+            <w:tcW w:type="dxa" w:w="794"/>
             <w:shd w:val="clear" w:color="auto" w:fill="FFFFFF"/>
           </w:tcPr>
           <w:p>
@@ -2244,7 +2469,7 @@
         </w:tc>
         <w:tc>
           <w:tcPr>
-            <w:tcW w:type="dxa" w:w="850"/>
+            <w:tcW w:type="dxa" w:w="794"/>
             <w:shd w:val="clear" w:color="auto" w:fill="FFFFFF"/>
           </w:tcPr>
           <w:p>
@@ -2367,7 +2592,7 @@
                 <w:color w:val="6B7280"/>
                 <w:sz w:val="16"/>
               </w:rPr>
-              <w:t>Our Position</w:t>
+              <w:t>Pos (Ahrefs)</w:t>
             </w:r>
           </w:p>
         </w:tc>
@@ -2388,7 +2613,7 @@
                 <w:color w:val="1A56DB"/>
                 <w:sz w:val="28"/>
               </w:rPr>
-              <w:t>728</w:t>
+              <w:t>6.8</w:t>
               <w:br/>
             </w:r>
             <w:r>
@@ -2397,7 +2622,7 @@
                 <w:color w:val="6B7280"/>
                 <w:sz w:val="16"/>
               </w:rPr>
-              <w:t>Our Page RDs</w:t>
+              <w:t>Pos (GSC May '26)</w:t>
             </w:r>
           </w:p>
         </w:tc>
@@ -3663,7 +3888,7 @@
                 <w:color w:val="6B7280"/>
                 <w:sz w:val="16"/>
               </w:rPr>
-              <w:t>Our Position</w:t>
+              <w:t>Pos (Ahrefs)</w:t>
             </w:r>
           </w:p>
         </w:tc>
@@ -3684,7 +3909,7 @@
                 <w:color w:val="1A56DB"/>
                 <w:sz w:val="28"/>
               </w:rPr>
-              <w:t>1</w:t>
+              <w:t>5.9</w:t>
               <w:br/>
             </w:r>
             <w:r>
@@ -3693,7 +3918,7 @@
                 <w:color w:val="6B7280"/>
                 <w:sz w:val="16"/>
               </w:rPr>
-              <w:t>Our Page RDs</w:t>
+              <w:t>Pos (GSC May '26)</w:t>
             </w:r>
           </w:p>
         </w:tc>
@@ -4959,7 +5184,7 @@
                 <w:color w:val="6B7280"/>
                 <w:sz w:val="16"/>
               </w:rPr>
-              <w:t>Our Position</w:t>
+              <w:t>Pos (Ahrefs)</w:t>
             </w:r>
           </w:p>
         </w:tc>
@@ -4980,7 +5205,7 @@
                 <w:color w:val="1A56DB"/>
                 <w:sz w:val="28"/>
               </w:rPr>
-              <w:t>2</w:t>
+              <w:t>5.5</w:t>
               <w:br/>
             </w:r>
             <w:r>
@@ -4989,7 +5214,7 @@
                 <w:color w:val="6B7280"/>
                 <w:sz w:val="16"/>
               </w:rPr>
-              <w:t>Our Page RDs</w:t>
+              <w:t>Pos (GSC May '26)</w:t>
             </w:r>
           </w:p>
         </w:tc>
@@ -6249,7 +6474,7 @@
                 <w:color w:val="6B7280"/>
                 <w:sz w:val="16"/>
               </w:rPr>
-              <w:t>Our Position</w:t>
+              <w:t>Pos (Ahrefs)</w:t>
             </w:r>
           </w:p>
         </w:tc>
@@ -6270,7 +6495,7 @@
                 <w:color w:val="1A56DB"/>
                 <w:sz w:val="28"/>
               </w:rPr>
-              <w:t>728</w:t>
+              <w:t>12.0</w:t>
               <w:br/>
             </w:r>
             <w:r>
@@ -6279,7 +6504,7 @@
                 <w:color w:val="6B7280"/>
                 <w:sz w:val="16"/>
               </w:rPr>
-              <w:t>Our Page RDs</w:t>
+              <w:t>Pos (GSC May '26)</w:t>
             </w:r>
           </w:p>
         </w:tc>
@@ -7545,7 +7770,7 @@
                 <w:color w:val="6B7280"/>
                 <w:sz w:val="16"/>
               </w:rPr>
-              <w:t>Our Position</w:t>
+              <w:t>Pos (Ahrefs)</w:t>
             </w:r>
           </w:p>
         </w:tc>
@@ -7566,7 +7791,7 @@
                 <w:color w:val="1A56DB"/>
                 <w:sz w:val="28"/>
               </w:rPr>
-              <w:t>728</w:t>
+              <w:t>13.7</w:t>
               <w:br/>
             </w:r>
             <w:r>
@@ -7575,7 +7800,7 @@
                 <w:color w:val="6B7280"/>
                 <w:sz w:val="16"/>
               </w:rPr>
-              <w:t>Our Page RDs</w:t>
+              <w:t>Pos (GSC May '26)</w:t>
             </w:r>
           </w:p>
         </w:tc>
@@ -8719,7 +8944,7 @@
                 <w:color w:val="6B7280"/>
                 <w:sz w:val="16"/>
               </w:rPr>
-              <w:t>Our Position</w:t>
+              <w:t>Pos (Ahrefs)</w:t>
             </w:r>
           </w:p>
         </w:tc>
@@ -8740,7 +8965,7 @@
                 <w:color w:val="1A56DB"/>
                 <w:sz w:val="28"/>
               </w:rPr>
-              <w:t>0</w:t>
+              <w:t>12.1</w:t>
               <w:br/>
             </w:r>
             <w:r>
@@ -8749,7 +8974,7 @@
                 <w:color w:val="6B7280"/>
                 <w:sz w:val="16"/>
               </w:rPr>
-              <w:t>Our Page RDs</w:t>
+              <w:t>Pos (GSC May '26)</w:t>
             </w:r>
           </w:p>
         </w:tc>
@@ -9887,7 +10112,7 @@
                 <w:color w:val="6B7280"/>
                 <w:sz w:val="16"/>
               </w:rPr>
-              <w:t>Our Position</w:t>
+              <w:t>Pos (Ahrefs)</w:t>
             </w:r>
           </w:p>
         </w:tc>
@@ -9908,7 +10133,7 @@
                 <w:color w:val="1A56DB"/>
                 <w:sz w:val="28"/>
               </w:rPr>
-              <w:t>728</w:t>
+              <w:t>14.4</w:t>
               <w:br/>
             </w:r>
             <w:r>
@@ -9917,7 +10142,7 @@
                 <w:color w:val="6B7280"/>
                 <w:sz w:val="16"/>
               </w:rPr>
-              <w:t>Our Page RDs</w:t>
+              <w:t>Pos (GSC May '26)</w:t>
             </w:r>
           </w:p>
         </w:tc>
@@ -10939,7 +11164,7 @@
                 <w:color w:val="6B7280"/>
                 <w:sz w:val="16"/>
               </w:rPr>
-              <w:t>Our Position</w:t>
+              <w:t>Pos (Ahrefs)</w:t>
             </w:r>
           </w:p>
         </w:tc>
@@ -10960,7 +11185,7 @@
                 <w:color w:val="1A56DB"/>
                 <w:sz w:val="28"/>
               </w:rPr>
-              <w:t>0</w:t>
+              <w:t>17.1</w:t>
               <w:br/>
             </w:r>
             <w:r>
@@ -10969,7 +11194,7 @@
                 <w:color w:val="6B7280"/>
                 <w:sz w:val="16"/>
               </w:rPr>
-              <w:t>Our Page RDs</w:t>
+              <w:t>Pos (GSC May '26)</w:t>
             </w:r>
           </w:p>
         </w:tc>
@@ -12113,7 +12338,7 @@
                 <w:color w:val="6B7280"/>
                 <w:sz w:val="16"/>
               </w:rPr>
-              <w:t>Our Position</w:t>
+              <w:t>Pos (Ahrefs)</w:t>
             </w:r>
           </w:p>
         </w:tc>
@@ -12134,7 +12359,7 @@
                 <w:color w:val="1A56DB"/>
                 <w:sz w:val="28"/>
               </w:rPr>
-              <w:t>0</w:t>
+              <w:t>14.4</w:t>
               <w:br/>
             </w:r>
             <w:r>
@@ -12143,7 +12368,7 @@
                 <w:color w:val="6B7280"/>
                 <w:sz w:val="16"/>
               </w:rPr>
-              <w:t>Our Page RDs</w:t>
+              <w:t>Pos (GSC May '26)</w:t>
             </w:r>
           </w:p>
         </w:tc>
@@ -13281,7 +13506,7 @@
                 <w:color w:val="6B7280"/>
                 <w:sz w:val="16"/>
               </w:rPr>
-              <w:t>Our Position</w:t>
+              <w:t>Pos (Ahrefs)</w:t>
             </w:r>
           </w:p>
         </w:tc>
@@ -13302,7 +13527,7 @@
                 <w:color w:val="1A56DB"/>
                 <w:sz w:val="28"/>
               </w:rPr>
-              <w:t>0</w:t>
+              <w:t>13.6</w:t>
               <w:br/>
             </w:r>
             <w:r>
@@ -13311,7 +13536,7 @@
                 <w:color w:val="6B7280"/>
                 <w:sz w:val="16"/>
               </w:rPr>
-              <w:t>Our Page RDs</w:t>
+              <w:t>Pos (GSC May '26)</w:t>
             </w:r>
           </w:p>
         </w:tc>

</xml_diff>

<commit_message>
Add DR50+ referring-domain columns to backlink gap analysis
Adds our_page_refdomains_dr50plus, median_competitor_refdomains_dr50plus,
and gap_dr50plus columns alongside the existing all-RD columns in both
the CSV and DOCX summary table. Data sourced from Ahrefs
site-explorer-referring-domains with DR>49 filter (June 2026, US).

Co-Authored-By: Claude Sonnet 4.6 <noreply@anthropic.com>
Claude-Session: https://claude.ai/code/session_01PUXopWm3tyc7SXkeM8DDZy
</commit_message>
<xml_diff>
--- a/backlink_gap_2026.docx
+++ b/backlink_gap_2026.docx
@@ -241,21 +241,24 @@
         <w:tblLook w:firstColumn="1" w:firstRow="1" w:lastColumn="0" w:lastRow="0" w:noHBand="0" w:noVBand="1" w:val="04A0"/>
       </w:tblPr>
       <w:tblGrid>
-        <w:gridCol w:w="941"/>
-        <w:gridCol w:w="941"/>
-        <w:gridCol w:w="941"/>
-        <w:gridCol w:w="941"/>
-        <w:gridCol w:w="941"/>
-        <w:gridCol w:w="941"/>
-        <w:gridCol w:w="941"/>
-        <w:gridCol w:w="941"/>
-        <w:gridCol w:w="941"/>
-        <w:gridCol w:w="941"/>
+        <w:gridCol w:w="724"/>
+        <w:gridCol w:w="724"/>
+        <w:gridCol w:w="724"/>
+        <w:gridCol w:w="724"/>
+        <w:gridCol w:w="724"/>
+        <w:gridCol w:w="724"/>
+        <w:gridCol w:w="724"/>
+        <w:gridCol w:w="724"/>
+        <w:gridCol w:w="724"/>
+        <w:gridCol w:w="724"/>
+        <w:gridCol w:w="724"/>
+        <w:gridCol w:w="724"/>
+        <w:gridCol w:w="724"/>
       </w:tblGrid>
       <w:tr>
         <w:tc>
           <w:tcPr>
-            <w:tcW w:type="dxa" w:w="340"/>
+            <w:tcW w:type="dxa" w:w="283"/>
             <w:shd w:val="clear" w:color="auto" w:fill="1A56DB"/>
           </w:tcPr>
           <w:p>
@@ -275,7 +278,7 @@
         </w:tc>
         <w:tc>
           <w:tcPr>
-            <w:tcW w:type="dxa" w:w="2041"/>
+            <w:tcW w:type="dxa" w:w="1701"/>
             <w:shd w:val="clear" w:color="auto" w:fill="1A56DB"/>
           </w:tcPr>
           <w:p>
@@ -295,7 +298,7 @@
         </w:tc>
         <w:tc>
           <w:tcPr>
-            <w:tcW w:type="dxa" w:w="1928"/>
+            <w:tcW w:type="dxa" w:w="1587"/>
             <w:shd w:val="clear" w:color="auto" w:fill="1A56DB"/>
           </w:tcPr>
           <w:p>
@@ -315,7 +318,7 @@
         </w:tc>
         <w:tc>
           <w:tcPr>
-            <w:tcW w:type="dxa" w:w="850"/>
+            <w:tcW w:type="dxa" w:w="737"/>
             <w:shd w:val="clear" w:color="auto" w:fill="1A56DB"/>
           </w:tcPr>
           <w:p>
@@ -337,7 +340,7 @@
         </w:tc>
         <w:tc>
           <w:tcPr>
-            <w:tcW w:type="dxa" w:w="850"/>
+            <w:tcW w:type="dxa" w:w="737"/>
             <w:shd w:val="clear" w:color="auto" w:fill="1A56DB"/>
           </w:tcPr>
           <w:p>
@@ -359,7 +362,7 @@
         </w:tc>
         <w:tc>
           <w:tcPr>
-            <w:tcW w:type="dxa" w:w="794"/>
+            <w:tcW w:type="dxa" w:w="680"/>
             <w:shd w:val="clear" w:color="auto" w:fill="1A56DB"/>
           </w:tcPr>
           <w:p>
@@ -373,13 +376,15 @@
                 <w:color w:val="FFFFFF"/>
                 <w:sz w:val="16"/>
               </w:rPr>
-              <w:t>Our Page RDs</w:t>
-            </w:r>
-          </w:p>
-        </w:tc>
-        <w:tc>
-          <w:tcPr>
-            <w:tcW w:type="dxa" w:w="1020"/>
+              <w:t>Our</w:t>
+              <w:br/>
+              <w:t>RDs</w:t>
+            </w:r>
+          </w:p>
+        </w:tc>
+        <w:tc>
+          <w:tcPr>
+            <w:tcW w:type="dxa" w:w="850"/>
             <w:shd w:val="clear" w:color="auto" w:fill="1A56DB"/>
           </w:tcPr>
           <w:p>
@@ -393,15 +398,17 @@
                 <w:color w:val="FFFFFF"/>
                 <w:sz w:val="16"/>
               </w:rPr>
-              <w:t>Median Comp. RDs</w:t>
+              <w:t>Median</w:t>
               <w:br/>
-              <w:t>(top 5)</w:t>
-            </w:r>
-          </w:p>
-        </w:tc>
-        <w:tc>
-          <w:tcPr>
-            <w:tcW w:type="dxa" w:w="624"/>
+              <w:t>RDs</w:t>
+              <w:br/>
+              <w:t>(top5)</w:t>
+            </w:r>
+          </w:p>
+        </w:tc>
+        <w:tc>
+          <w:tcPr>
+            <w:tcW w:type="dxa" w:w="567"/>
             <w:shd w:val="clear" w:color="auto" w:fill="1A56DB"/>
           </w:tcPr>
           <w:p>
@@ -421,7 +428,7 @@
         </w:tc>
         <w:tc>
           <w:tcPr>
-            <w:tcW w:type="dxa" w:w="794"/>
+            <w:tcW w:type="dxa" w:w="680"/>
             <w:shd w:val="clear" w:color="auto" w:fill="1A56DB"/>
           </w:tcPr>
           <w:p>
@@ -435,13 +442,17 @@
                 <w:color w:val="FFFFFF"/>
                 <w:sz w:val="16"/>
               </w:rPr>
-              <w:t>Target RDs</w:t>
-            </w:r>
-          </w:p>
-        </w:tc>
-        <w:tc>
-          <w:tcPr>
-            <w:tcW w:type="dxa" w:w="794"/>
+              <w:t>Our</w:t>
+              <w:br/>
+              <w:t>RDs</w:t>
+              <w:br/>
+              <w:t>DR50+</w:t>
+            </w:r>
+          </w:p>
+        </w:tc>
+        <w:tc>
+          <w:tcPr>
+            <w:tcW w:type="dxa" w:w="850"/>
             <w:shd w:val="clear" w:color="auto" w:fill="1A56DB"/>
           </w:tcPr>
           <w:p>
@@ -455,6 +466,74 @@
                 <w:color w:val="FFFFFF"/>
                 <w:sz w:val="16"/>
               </w:rPr>
+              <w:t>Median</w:t>
+              <w:br/>
+              <w:t>RDs</w:t>
+              <w:br/>
+              <w:t>DR50+</w:t>
+            </w:r>
+          </w:p>
+        </w:tc>
+        <w:tc>
+          <w:tcPr>
+            <w:tcW w:type="dxa" w:w="567"/>
+            <w:shd w:val="clear" w:color="auto" w:fill="1A56DB"/>
+          </w:tcPr>
+          <w:p>
+            <w:pPr>
+              <w:jc w:val="center"/>
+            </w:pPr>
+            <w:r>
+              <w:rPr>
+                <w:rFonts w:ascii="Calibri" w:hAnsi="Calibri"/>
+                <w:b/>
+                <w:color w:val="FFFFFF"/>
+                <w:sz w:val="16"/>
+              </w:rPr>
+              <w:t>Gap</w:t>
+              <w:br/>
+              <w:t>DR50+</w:t>
+            </w:r>
+          </w:p>
+        </w:tc>
+        <w:tc>
+          <w:tcPr>
+            <w:tcW w:type="dxa" w:w="680"/>
+            <w:shd w:val="clear" w:color="auto" w:fill="1A56DB"/>
+          </w:tcPr>
+          <w:p>
+            <w:pPr>
+              <w:jc w:val="center"/>
+            </w:pPr>
+            <w:r>
+              <w:rPr>
+                <w:rFonts w:ascii="Calibri" w:hAnsi="Calibri"/>
+                <w:b/>
+                <w:color w:val="FFFFFF"/>
+                <w:sz w:val="16"/>
+              </w:rPr>
+              <w:t>Target</w:t>
+              <w:br/>
+              <w:t>RDs</w:t>
+            </w:r>
+          </w:p>
+        </w:tc>
+        <w:tc>
+          <w:tcPr>
+            <w:tcW w:type="dxa" w:w="680"/>
+            <w:shd w:val="clear" w:color="auto" w:fill="1A56DB"/>
+          </w:tcPr>
+          <w:p>
+            <w:pPr>
+              <w:jc w:val="center"/>
+            </w:pPr>
+            <w:r>
+              <w:rPr>
+                <w:rFonts w:ascii="Calibri" w:hAnsi="Calibri"/>
+                <w:b/>
+                <w:color w:val="FFFFFF"/>
+                <w:sz w:val="16"/>
+              </w:rPr>
               <w:t>New BLs</w:t>
               <w:br/>
               <w:t>Needed</w:t>
@@ -465,7 +544,7 @@
       <w:tr>
         <w:tc>
           <w:tcPr>
-            <w:tcW w:type="dxa" w:w="340"/>
+            <w:tcW w:type="dxa" w:w="283"/>
             <w:shd w:val="clear" w:color="auto" w:fill="F3F4F6"/>
           </w:tcPr>
           <w:p>
@@ -485,7 +564,7 @@
         </w:tc>
         <w:tc>
           <w:tcPr>
-            <w:tcW w:type="dxa" w:w="2041"/>
+            <w:tcW w:type="dxa" w:w="1701"/>
             <w:shd w:val="clear" w:color="auto" w:fill="F3F4F6"/>
           </w:tcPr>
           <w:p>
@@ -505,7 +584,7 @@
         </w:tc>
         <w:tc>
           <w:tcPr>
-            <w:tcW w:type="dxa" w:w="1928"/>
+            <w:tcW w:type="dxa" w:w="1587"/>
             <w:shd w:val="clear" w:color="auto" w:fill="F3F4F6"/>
           </w:tcPr>
           <w:p>
@@ -525,6 +604,66 @@
         </w:tc>
         <w:tc>
           <w:tcPr>
+            <w:tcW w:type="dxa" w:w="737"/>
+            <w:shd w:val="clear" w:color="auto" w:fill="F3F4F6"/>
+          </w:tcPr>
+          <w:p>
+            <w:pPr>
+              <w:spacing w:before="40" w:after="40"/>
+              <w:jc w:val="center"/>
+            </w:pPr>
+            <w:r>
+              <w:rPr>
+                <w:rFonts w:ascii="Calibri" w:hAnsi="Calibri"/>
+                <w:color w:val="111827"/>
+                <w:sz w:val="16"/>
+              </w:rPr>
+              <w:t>2</w:t>
+            </w:r>
+          </w:p>
+        </w:tc>
+        <w:tc>
+          <w:tcPr>
+            <w:tcW w:type="dxa" w:w="737"/>
+            <w:shd w:val="clear" w:color="auto" w:fill="F3F4F6"/>
+          </w:tcPr>
+          <w:p>
+            <w:pPr>
+              <w:spacing w:before="40" w:after="40"/>
+              <w:jc w:val="center"/>
+            </w:pPr>
+            <w:r>
+              <w:rPr>
+                <w:rFonts w:ascii="Calibri" w:hAnsi="Calibri"/>
+                <w:color w:val="111827"/>
+                <w:sz w:val="16"/>
+              </w:rPr>
+              <w:t>6.8</w:t>
+            </w:r>
+          </w:p>
+        </w:tc>
+        <w:tc>
+          <w:tcPr>
+            <w:tcW w:type="dxa" w:w="680"/>
+            <w:shd w:val="clear" w:color="auto" w:fill="F3F4F6"/>
+          </w:tcPr>
+          <w:p>
+            <w:pPr>
+              <w:spacing w:before="40" w:after="40"/>
+              <w:jc w:val="center"/>
+            </w:pPr>
+            <w:r>
+              <w:rPr>
+                <w:rFonts w:ascii="Calibri" w:hAnsi="Calibri"/>
+                <w:color w:val="111827"/>
+                <w:sz w:val="16"/>
+              </w:rPr>
+              <w:t>728</w:t>
+            </w:r>
+          </w:p>
+        </w:tc>
+        <w:tc>
+          <w:tcPr>
             <w:tcW w:type="dxa" w:w="850"/>
             <w:shd w:val="clear" w:color="auto" w:fill="F3F4F6"/>
           </w:tcPr>
@@ -539,7 +678,47 @@
                 <w:color w:val="111827"/>
                 <w:sz w:val="16"/>
               </w:rPr>
-              <w:t>2</w:t>
+              <w:t>179</w:t>
+            </w:r>
+          </w:p>
+        </w:tc>
+        <w:tc>
+          <w:tcPr>
+            <w:tcW w:type="dxa" w:w="567"/>
+            <w:shd w:val="clear" w:color="auto" w:fill="F3F4F6"/>
+          </w:tcPr>
+          <w:p>
+            <w:pPr>
+              <w:spacing w:before="40" w:after="40"/>
+              <w:jc w:val="center"/>
+            </w:pPr>
+            <w:r>
+              <w:rPr>
+                <w:rFonts w:ascii="Calibri" w:hAnsi="Calibri"/>
+                <w:color w:val="059669"/>
+                <w:sz w:val="16"/>
+              </w:rPr>
+              <w:t>0</w:t>
+            </w:r>
+          </w:p>
+        </w:tc>
+        <w:tc>
+          <w:tcPr>
+            <w:tcW w:type="dxa" w:w="680"/>
+            <w:shd w:val="clear" w:color="auto" w:fill="F3F4F6"/>
+          </w:tcPr>
+          <w:p>
+            <w:pPr>
+              <w:spacing w:before="40" w:after="40"/>
+              <w:jc w:val="center"/>
+            </w:pPr>
+            <w:r>
+              <w:rPr>
+                <w:rFonts w:ascii="Calibri" w:hAnsi="Calibri"/>
+                <w:color w:val="111827"/>
+                <w:sz w:val="16"/>
+              </w:rPr>
+              <w:t>100</w:t>
             </w:r>
           </w:p>
         </w:tc>
@@ -559,53 +738,13 @@
                 <w:color w:val="111827"/>
                 <w:sz w:val="16"/>
               </w:rPr>
-              <w:t>6.8</w:t>
-            </w:r>
-          </w:p>
-        </w:tc>
-        <w:tc>
-          <w:tcPr>
-            <w:tcW w:type="dxa" w:w="794"/>
-            <w:shd w:val="clear" w:color="auto" w:fill="F3F4F6"/>
-          </w:tcPr>
-          <w:p>
-            <w:pPr>
-              <w:spacing w:before="40" w:after="40"/>
-              <w:jc w:val="center"/>
-            </w:pPr>
-            <w:r>
-              <w:rPr>
-                <w:rFonts w:ascii="Calibri" w:hAnsi="Calibri"/>
-                <w:color w:val="111827"/>
-                <w:sz w:val="16"/>
-              </w:rPr>
-              <w:t>728</w:t>
-            </w:r>
-          </w:p>
-        </w:tc>
-        <w:tc>
-          <w:tcPr>
-            <w:tcW w:type="dxa" w:w="1020"/>
-            <w:shd w:val="clear" w:color="auto" w:fill="F3F4F6"/>
-          </w:tcPr>
-          <w:p>
-            <w:pPr>
-              <w:spacing w:before="40" w:after="40"/>
-              <w:jc w:val="center"/>
-            </w:pPr>
-            <w:r>
-              <w:rPr>
-                <w:rFonts w:ascii="Calibri" w:hAnsi="Calibri"/>
-                <w:color w:val="111827"/>
-                <w:sz w:val="16"/>
-              </w:rPr>
-              <w:t>179</w:t>
-            </w:r>
-          </w:p>
-        </w:tc>
-        <w:tc>
-          <w:tcPr>
-            <w:tcW w:type="dxa" w:w="624"/>
+              <w:t>100</w:t>
+            </w:r>
+          </w:p>
+        </w:tc>
+        <w:tc>
+          <w:tcPr>
+            <w:tcW w:type="dxa" w:w="567"/>
             <w:shd w:val="clear" w:color="auto" w:fill="F3F4F6"/>
           </w:tcPr>
           <w:p>
@@ -625,7 +764,7 @@
         </w:tc>
         <w:tc>
           <w:tcPr>
-            <w:tcW w:type="dxa" w:w="794"/>
+            <w:tcW w:type="dxa" w:w="680"/>
             <w:shd w:val="clear" w:color="auto" w:fill="F3F4F6"/>
           </w:tcPr>
           <w:p>
@@ -645,7 +784,7 @@
         </w:tc>
         <w:tc>
           <w:tcPr>
-            <w:tcW w:type="dxa" w:w="794"/>
+            <w:tcW w:type="dxa" w:w="680"/>
             <w:shd w:val="clear" w:color="auto" w:fill="F3F4F6"/>
           </w:tcPr>
           <w:p>
@@ -667,7 +806,7 @@
       <w:tr>
         <w:tc>
           <w:tcPr>
-            <w:tcW w:type="dxa" w:w="340"/>
+            <w:tcW w:type="dxa" w:w="283"/>
             <w:shd w:val="clear" w:color="auto" w:fill="FFFFFF"/>
           </w:tcPr>
           <w:p>
@@ -687,7 +826,7 @@
         </w:tc>
         <w:tc>
           <w:tcPr>
-            <w:tcW w:type="dxa" w:w="2041"/>
+            <w:tcW w:type="dxa" w:w="1701"/>
             <w:shd w:val="clear" w:color="auto" w:fill="FFFFFF"/>
           </w:tcPr>
           <w:p>
@@ -707,7 +846,7 @@
         </w:tc>
         <w:tc>
           <w:tcPr>
-            <w:tcW w:type="dxa" w:w="1928"/>
+            <w:tcW w:type="dxa" w:w="1587"/>
             <w:shd w:val="clear" w:color="auto" w:fill="FFFFFF"/>
           </w:tcPr>
           <w:p>
@@ -727,6 +866,66 @@
         </w:tc>
         <w:tc>
           <w:tcPr>
+            <w:tcW w:type="dxa" w:w="737"/>
+            <w:shd w:val="clear" w:color="auto" w:fill="FFFFFF"/>
+          </w:tcPr>
+          <w:p>
+            <w:pPr>
+              <w:spacing w:before="40" w:after="40"/>
+              <w:jc w:val="center"/>
+            </w:pPr>
+            <w:r>
+              <w:rPr>
+                <w:rFonts w:ascii="Calibri" w:hAnsi="Calibri"/>
+                <w:color w:val="111827"/>
+                <w:sz w:val="16"/>
+              </w:rPr>
+              <w:t>2</w:t>
+            </w:r>
+          </w:p>
+        </w:tc>
+        <w:tc>
+          <w:tcPr>
+            <w:tcW w:type="dxa" w:w="737"/>
+            <w:shd w:val="clear" w:color="auto" w:fill="FFFFFF"/>
+          </w:tcPr>
+          <w:p>
+            <w:pPr>
+              <w:spacing w:before="40" w:after="40"/>
+              <w:jc w:val="center"/>
+            </w:pPr>
+            <w:r>
+              <w:rPr>
+                <w:rFonts w:ascii="Calibri" w:hAnsi="Calibri"/>
+                <w:color w:val="111827"/>
+                <w:sz w:val="16"/>
+              </w:rPr>
+              <w:t>5.9</w:t>
+            </w:r>
+          </w:p>
+        </w:tc>
+        <w:tc>
+          <w:tcPr>
+            <w:tcW w:type="dxa" w:w="680"/>
+            <w:shd w:val="clear" w:color="auto" w:fill="FFFFFF"/>
+          </w:tcPr>
+          <w:p>
+            <w:pPr>
+              <w:spacing w:before="40" w:after="40"/>
+              <w:jc w:val="center"/>
+            </w:pPr>
+            <w:r>
+              <w:rPr>
+                <w:rFonts w:ascii="Calibri" w:hAnsi="Calibri"/>
+                <w:color w:val="111827"/>
+                <w:sz w:val="16"/>
+              </w:rPr>
+              <w:t>1</w:t>
+            </w:r>
+          </w:p>
+        </w:tc>
+        <w:tc>
+          <w:tcPr>
             <w:tcW w:type="dxa" w:w="850"/>
             <w:shd w:val="clear" w:color="auto" w:fill="FFFFFF"/>
           </w:tcPr>
@@ -741,73 +940,13 @@
                 <w:color w:val="111827"/>
                 <w:sz w:val="16"/>
               </w:rPr>
-              <w:t>2</w:t>
-            </w:r>
-          </w:p>
-        </w:tc>
-        <w:tc>
-          <w:tcPr>
-            <w:tcW w:type="dxa" w:w="850"/>
-            <w:shd w:val="clear" w:color="auto" w:fill="FFFFFF"/>
-          </w:tcPr>
-          <w:p>
-            <w:pPr>
-              <w:spacing w:before="40" w:after="40"/>
-              <w:jc w:val="center"/>
-            </w:pPr>
-            <w:r>
-              <w:rPr>
-                <w:rFonts w:ascii="Calibri" w:hAnsi="Calibri"/>
-                <w:color w:val="111827"/>
-                <w:sz w:val="16"/>
-              </w:rPr>
-              <w:t>5.9</w:t>
-            </w:r>
-          </w:p>
-        </w:tc>
-        <w:tc>
-          <w:tcPr>
-            <w:tcW w:type="dxa" w:w="794"/>
-            <w:shd w:val="clear" w:color="auto" w:fill="FFFFFF"/>
-          </w:tcPr>
-          <w:p>
-            <w:pPr>
-              <w:spacing w:before="40" w:after="40"/>
-              <w:jc w:val="center"/>
-            </w:pPr>
-            <w:r>
-              <w:rPr>
-                <w:rFonts w:ascii="Calibri" w:hAnsi="Calibri"/>
-                <w:color w:val="111827"/>
-                <w:sz w:val="16"/>
-              </w:rPr>
-              <w:t>1</w:t>
-            </w:r>
-          </w:p>
-        </w:tc>
-        <w:tc>
-          <w:tcPr>
-            <w:tcW w:type="dxa" w:w="1020"/>
-            <w:shd w:val="clear" w:color="auto" w:fill="FFFFFF"/>
-          </w:tcPr>
-          <w:p>
-            <w:pPr>
-              <w:spacing w:before="40" w:after="40"/>
-              <w:jc w:val="center"/>
-            </w:pPr>
-            <w:r>
-              <w:rPr>
-                <w:rFonts w:ascii="Calibri" w:hAnsi="Calibri"/>
-                <w:color w:val="111827"/>
-                <w:sz w:val="16"/>
-              </w:rPr>
               <w:t>3</w:t>
             </w:r>
           </w:p>
         </w:tc>
         <w:tc>
           <w:tcPr>
-            <w:tcW w:type="dxa" w:w="624"/>
+            <w:tcW w:type="dxa" w:w="567"/>
             <w:shd w:val="clear" w:color="auto" w:fill="FFFFFF"/>
           </w:tcPr>
           <w:p>
@@ -828,7 +967,7 @@
         </w:tc>
         <w:tc>
           <w:tcPr>
-            <w:tcW w:type="dxa" w:w="794"/>
+            <w:tcW w:type="dxa" w:w="680"/>
             <w:shd w:val="clear" w:color="auto" w:fill="FFFFFF"/>
           </w:tcPr>
           <w:p>
@@ -842,13 +981,73 @@
                 <w:color w:val="111827"/>
                 <w:sz w:val="16"/>
               </w:rPr>
+              <w:t>0</w:t>
+            </w:r>
+          </w:p>
+        </w:tc>
+        <w:tc>
+          <w:tcPr>
+            <w:tcW w:type="dxa" w:w="850"/>
+            <w:shd w:val="clear" w:color="auto" w:fill="FFFFFF"/>
+          </w:tcPr>
+          <w:p>
+            <w:pPr>
+              <w:spacing w:before="40" w:after="40"/>
+              <w:jc w:val="center"/>
+            </w:pPr>
+            <w:r>
+              <w:rPr>
+                <w:rFonts w:ascii="Calibri" w:hAnsi="Calibri"/>
+                <w:color w:val="111827"/>
+                <w:sz w:val="16"/>
+              </w:rPr>
+              <w:t>0</w:t>
+            </w:r>
+          </w:p>
+        </w:tc>
+        <w:tc>
+          <w:tcPr>
+            <w:tcW w:type="dxa" w:w="567"/>
+            <w:shd w:val="clear" w:color="auto" w:fill="FFFFFF"/>
+          </w:tcPr>
+          <w:p>
+            <w:pPr>
+              <w:spacing w:before="40" w:after="40"/>
+              <w:jc w:val="center"/>
+            </w:pPr>
+            <w:r>
+              <w:rPr>
+                <w:rFonts w:ascii="Calibri" w:hAnsi="Calibri"/>
+                <w:color w:val="059669"/>
+                <w:sz w:val="16"/>
+              </w:rPr>
+              <w:t>0</w:t>
+            </w:r>
+          </w:p>
+        </w:tc>
+        <w:tc>
+          <w:tcPr>
+            <w:tcW w:type="dxa" w:w="680"/>
+            <w:shd w:val="clear" w:color="auto" w:fill="FFFFFF"/>
+          </w:tcPr>
+          <w:p>
+            <w:pPr>
+              <w:spacing w:before="40" w:after="40"/>
+              <w:jc w:val="center"/>
+            </w:pPr>
+            <w:r>
+              <w:rPr>
+                <w:rFonts w:ascii="Calibri" w:hAnsi="Calibri"/>
+                <w:color w:val="111827"/>
+                <w:sz w:val="16"/>
+              </w:rPr>
               <w:t>13</w:t>
             </w:r>
           </w:p>
         </w:tc>
         <w:tc>
           <w:tcPr>
-            <w:tcW w:type="dxa" w:w="794"/>
+            <w:tcW w:type="dxa" w:w="680"/>
             <w:shd w:val="clear" w:color="auto" w:fill="FFFFFF"/>
           </w:tcPr>
           <w:p>
@@ -870,7 +1069,7 @@
       <w:tr>
         <w:tc>
           <w:tcPr>
-            <w:tcW w:type="dxa" w:w="340"/>
+            <w:tcW w:type="dxa" w:w="283"/>
             <w:shd w:val="clear" w:color="auto" w:fill="F3F4F6"/>
           </w:tcPr>
           <w:p>
@@ -890,7 +1089,7 @@
         </w:tc>
         <w:tc>
           <w:tcPr>
-            <w:tcW w:type="dxa" w:w="2041"/>
+            <w:tcW w:type="dxa" w:w="1701"/>
             <w:shd w:val="clear" w:color="auto" w:fill="F3F4F6"/>
           </w:tcPr>
           <w:p>
@@ -910,7 +1109,7 @@
         </w:tc>
         <w:tc>
           <w:tcPr>
-            <w:tcW w:type="dxa" w:w="1928"/>
+            <w:tcW w:type="dxa" w:w="1587"/>
             <w:shd w:val="clear" w:color="auto" w:fill="F3F4F6"/>
           </w:tcPr>
           <w:p>
@@ -930,6 +1129,66 @@
         </w:tc>
         <w:tc>
           <w:tcPr>
+            <w:tcW w:type="dxa" w:w="737"/>
+            <w:shd w:val="clear" w:color="auto" w:fill="F3F4F6"/>
+          </w:tcPr>
+          <w:p>
+            <w:pPr>
+              <w:spacing w:before="40" w:after="40"/>
+              <w:jc w:val="center"/>
+            </w:pPr>
+            <w:r>
+              <w:rPr>
+                <w:rFonts w:ascii="Calibri" w:hAnsi="Calibri"/>
+                <w:color w:val="111827"/>
+                <w:sz w:val="16"/>
+              </w:rPr>
+              <w:t>not ranking</w:t>
+            </w:r>
+          </w:p>
+        </w:tc>
+        <w:tc>
+          <w:tcPr>
+            <w:tcW w:type="dxa" w:w="737"/>
+            <w:shd w:val="clear" w:color="auto" w:fill="F3F4F6"/>
+          </w:tcPr>
+          <w:p>
+            <w:pPr>
+              <w:spacing w:before="40" w:after="40"/>
+              <w:jc w:val="center"/>
+            </w:pPr>
+            <w:r>
+              <w:rPr>
+                <w:rFonts w:ascii="Calibri" w:hAnsi="Calibri"/>
+                <w:color w:val="111827"/>
+                <w:sz w:val="16"/>
+              </w:rPr>
+              <w:t>5.5</w:t>
+            </w:r>
+          </w:p>
+        </w:tc>
+        <w:tc>
+          <w:tcPr>
+            <w:tcW w:type="dxa" w:w="680"/>
+            <w:shd w:val="clear" w:color="auto" w:fill="F3F4F6"/>
+          </w:tcPr>
+          <w:p>
+            <w:pPr>
+              <w:spacing w:before="40" w:after="40"/>
+              <w:jc w:val="center"/>
+            </w:pPr>
+            <w:r>
+              <w:rPr>
+                <w:rFonts w:ascii="Calibri" w:hAnsi="Calibri"/>
+                <w:color w:val="111827"/>
+                <w:sz w:val="16"/>
+              </w:rPr>
+              <w:t>2</w:t>
+            </w:r>
+          </w:p>
+        </w:tc>
+        <w:tc>
+          <w:tcPr>
             <w:tcW w:type="dxa" w:w="850"/>
             <w:shd w:val="clear" w:color="auto" w:fill="F3F4F6"/>
           </w:tcPr>
@@ -944,73 +1203,13 @@
                 <w:color w:val="111827"/>
                 <w:sz w:val="16"/>
               </w:rPr>
-              <w:t>not ranking</w:t>
-            </w:r>
-          </w:p>
-        </w:tc>
-        <w:tc>
-          <w:tcPr>
-            <w:tcW w:type="dxa" w:w="850"/>
-            <w:shd w:val="clear" w:color="auto" w:fill="F3F4F6"/>
-          </w:tcPr>
-          <w:p>
-            <w:pPr>
-              <w:spacing w:before="40" w:after="40"/>
-              <w:jc w:val="center"/>
-            </w:pPr>
-            <w:r>
-              <w:rPr>
-                <w:rFonts w:ascii="Calibri" w:hAnsi="Calibri"/>
-                <w:color w:val="111827"/>
-                <w:sz w:val="16"/>
-              </w:rPr>
-              <w:t>5.5</w:t>
-            </w:r>
-          </w:p>
-        </w:tc>
-        <w:tc>
-          <w:tcPr>
-            <w:tcW w:type="dxa" w:w="794"/>
-            <w:shd w:val="clear" w:color="auto" w:fill="F3F4F6"/>
-          </w:tcPr>
-          <w:p>
-            <w:pPr>
-              <w:spacing w:before="40" w:after="40"/>
-              <w:jc w:val="center"/>
-            </w:pPr>
-            <w:r>
-              <w:rPr>
-                <w:rFonts w:ascii="Calibri" w:hAnsi="Calibri"/>
-                <w:color w:val="111827"/>
-                <w:sz w:val="16"/>
-              </w:rPr>
-              <w:t>2</w:t>
-            </w:r>
-          </w:p>
-        </w:tc>
-        <w:tc>
-          <w:tcPr>
-            <w:tcW w:type="dxa" w:w="1020"/>
-            <w:shd w:val="clear" w:color="auto" w:fill="F3F4F6"/>
-          </w:tcPr>
-          <w:p>
-            <w:pPr>
-              <w:spacing w:before="40" w:after="40"/>
-              <w:jc w:val="center"/>
-            </w:pPr>
-            <w:r>
-              <w:rPr>
-                <w:rFonts w:ascii="Calibri" w:hAnsi="Calibri"/>
-                <w:color w:val="111827"/>
-                <w:sz w:val="16"/>
-              </w:rPr>
               <w:t>22</w:t>
             </w:r>
           </w:p>
         </w:tc>
         <w:tc>
           <w:tcPr>
-            <w:tcW w:type="dxa" w:w="624"/>
+            <w:tcW w:type="dxa" w:w="567"/>
             <w:shd w:val="clear" w:color="auto" w:fill="F3F4F6"/>
           </w:tcPr>
           <w:p>
@@ -1031,7 +1230,7 @@
         </w:tc>
         <w:tc>
           <w:tcPr>
-            <w:tcW w:type="dxa" w:w="794"/>
+            <w:tcW w:type="dxa" w:w="680"/>
             <w:shd w:val="clear" w:color="auto" w:fill="F3F4F6"/>
           </w:tcPr>
           <w:p>
@@ -1045,13 +1244,73 @@
                 <w:color w:val="111827"/>
                 <w:sz w:val="16"/>
               </w:rPr>
+              <w:t>0</w:t>
+            </w:r>
+          </w:p>
+        </w:tc>
+        <w:tc>
+          <w:tcPr>
+            <w:tcW w:type="dxa" w:w="850"/>
+            <w:shd w:val="clear" w:color="auto" w:fill="F3F4F6"/>
+          </w:tcPr>
+          <w:p>
+            <w:pPr>
+              <w:spacing w:before="40" w:after="40"/>
+              <w:jc w:val="center"/>
+            </w:pPr>
+            <w:r>
+              <w:rPr>
+                <w:rFonts w:ascii="Calibri" w:hAnsi="Calibri"/>
+                <w:color w:val="111827"/>
+                <w:sz w:val="16"/>
+              </w:rPr>
+              <w:t>0</w:t>
+            </w:r>
+          </w:p>
+        </w:tc>
+        <w:tc>
+          <w:tcPr>
+            <w:tcW w:type="dxa" w:w="567"/>
+            <w:shd w:val="clear" w:color="auto" w:fill="F3F4F6"/>
+          </w:tcPr>
+          <w:p>
+            <w:pPr>
+              <w:spacing w:before="40" w:after="40"/>
+              <w:jc w:val="center"/>
+            </w:pPr>
+            <w:r>
+              <w:rPr>
+                <w:rFonts w:ascii="Calibri" w:hAnsi="Calibri"/>
+                <w:color w:val="059669"/>
+                <w:sz w:val="16"/>
+              </w:rPr>
+              <w:t>0</w:t>
+            </w:r>
+          </w:p>
+        </w:tc>
+        <w:tc>
+          <w:tcPr>
+            <w:tcW w:type="dxa" w:w="680"/>
+            <w:shd w:val="clear" w:color="auto" w:fill="F3F4F6"/>
+          </w:tcPr>
+          <w:p>
+            <w:pPr>
+              <w:spacing w:before="40" w:after="40"/>
+              <w:jc w:val="center"/>
+            </w:pPr>
+            <w:r>
+              <w:rPr>
+                <w:rFonts w:ascii="Calibri" w:hAnsi="Calibri"/>
+                <w:color w:val="111827"/>
+                <w:sz w:val="16"/>
+              </w:rPr>
               <w:t>32</w:t>
             </w:r>
           </w:p>
         </w:tc>
         <w:tc>
           <w:tcPr>
-            <w:tcW w:type="dxa" w:w="794"/>
+            <w:tcW w:type="dxa" w:w="680"/>
             <w:shd w:val="clear" w:color="auto" w:fill="F3F4F6"/>
           </w:tcPr>
           <w:p>
@@ -1073,7 +1332,7 @@
       <w:tr>
         <w:tc>
           <w:tcPr>
-            <w:tcW w:type="dxa" w:w="340"/>
+            <w:tcW w:type="dxa" w:w="283"/>
             <w:shd w:val="clear" w:color="auto" w:fill="FFFFFF"/>
           </w:tcPr>
           <w:p>
@@ -1093,7 +1352,7 @@
         </w:tc>
         <w:tc>
           <w:tcPr>
-            <w:tcW w:type="dxa" w:w="2041"/>
+            <w:tcW w:type="dxa" w:w="1701"/>
             <w:shd w:val="clear" w:color="auto" w:fill="FFFFFF"/>
           </w:tcPr>
           <w:p>
@@ -1113,7 +1372,7 @@
         </w:tc>
         <w:tc>
           <w:tcPr>
-            <w:tcW w:type="dxa" w:w="1928"/>
+            <w:tcW w:type="dxa" w:w="1587"/>
             <w:shd w:val="clear" w:color="auto" w:fill="FFFFFF"/>
           </w:tcPr>
           <w:p>
@@ -1133,6 +1392,66 @@
         </w:tc>
         <w:tc>
           <w:tcPr>
+            <w:tcW w:type="dxa" w:w="737"/>
+            <w:shd w:val="clear" w:color="auto" w:fill="FFFFFF"/>
+          </w:tcPr>
+          <w:p>
+            <w:pPr>
+              <w:spacing w:before="40" w:after="40"/>
+              <w:jc w:val="center"/>
+            </w:pPr>
+            <w:r>
+              <w:rPr>
+                <w:rFonts w:ascii="Calibri" w:hAnsi="Calibri"/>
+                <w:color w:val="111827"/>
+                <w:sz w:val="16"/>
+              </w:rPr>
+              <w:t>4</w:t>
+            </w:r>
+          </w:p>
+        </w:tc>
+        <w:tc>
+          <w:tcPr>
+            <w:tcW w:type="dxa" w:w="737"/>
+            <w:shd w:val="clear" w:color="auto" w:fill="FFFFFF"/>
+          </w:tcPr>
+          <w:p>
+            <w:pPr>
+              <w:spacing w:before="40" w:after="40"/>
+              <w:jc w:val="center"/>
+            </w:pPr>
+            <w:r>
+              <w:rPr>
+                <w:rFonts w:ascii="Calibri" w:hAnsi="Calibri"/>
+                <w:color w:val="111827"/>
+                <w:sz w:val="16"/>
+              </w:rPr>
+              <w:t>12.0</w:t>
+            </w:r>
+          </w:p>
+        </w:tc>
+        <w:tc>
+          <w:tcPr>
+            <w:tcW w:type="dxa" w:w="680"/>
+            <w:shd w:val="clear" w:color="auto" w:fill="FFFFFF"/>
+          </w:tcPr>
+          <w:p>
+            <w:pPr>
+              <w:spacing w:before="40" w:after="40"/>
+              <w:jc w:val="center"/>
+            </w:pPr>
+            <w:r>
+              <w:rPr>
+                <w:rFonts w:ascii="Calibri" w:hAnsi="Calibri"/>
+                <w:color w:val="111827"/>
+                <w:sz w:val="16"/>
+              </w:rPr>
+              <w:t>728</w:t>
+            </w:r>
+          </w:p>
+        </w:tc>
+        <w:tc>
+          <w:tcPr>
             <w:tcW w:type="dxa" w:w="850"/>
             <w:shd w:val="clear" w:color="auto" w:fill="FFFFFF"/>
           </w:tcPr>
@@ -1147,73 +1466,13 @@
                 <w:color w:val="111827"/>
                 <w:sz w:val="16"/>
               </w:rPr>
-              <w:t>4</w:t>
-            </w:r>
-          </w:p>
-        </w:tc>
-        <w:tc>
-          <w:tcPr>
-            <w:tcW w:type="dxa" w:w="850"/>
-            <w:shd w:val="clear" w:color="auto" w:fill="FFFFFF"/>
-          </w:tcPr>
-          <w:p>
-            <w:pPr>
-              <w:spacing w:before="40" w:after="40"/>
-              <w:jc w:val="center"/>
-            </w:pPr>
-            <w:r>
-              <w:rPr>
-                <w:rFonts w:ascii="Calibri" w:hAnsi="Calibri"/>
-                <w:color w:val="111827"/>
-                <w:sz w:val="16"/>
-              </w:rPr>
-              <w:t>12.0</w:t>
-            </w:r>
-          </w:p>
-        </w:tc>
-        <w:tc>
-          <w:tcPr>
-            <w:tcW w:type="dxa" w:w="794"/>
-            <w:shd w:val="clear" w:color="auto" w:fill="FFFFFF"/>
-          </w:tcPr>
-          <w:p>
-            <w:pPr>
-              <w:spacing w:before="40" w:after="40"/>
-              <w:jc w:val="center"/>
-            </w:pPr>
-            <w:r>
-              <w:rPr>
-                <w:rFonts w:ascii="Calibri" w:hAnsi="Calibri"/>
-                <w:color w:val="111827"/>
-                <w:sz w:val="16"/>
-              </w:rPr>
-              <w:t>728</w:t>
-            </w:r>
-          </w:p>
-        </w:tc>
-        <w:tc>
-          <w:tcPr>
-            <w:tcW w:type="dxa" w:w="1020"/>
-            <w:shd w:val="clear" w:color="auto" w:fill="FFFFFF"/>
-          </w:tcPr>
-          <w:p>
-            <w:pPr>
-              <w:spacing w:before="40" w:after="40"/>
-              <w:jc w:val="center"/>
-            </w:pPr>
-            <w:r>
-              <w:rPr>
-                <w:rFonts w:ascii="Calibri" w:hAnsi="Calibri"/>
-                <w:color w:val="111827"/>
-                <w:sz w:val="16"/>
-              </w:rPr>
               <w:t>179</w:t>
             </w:r>
           </w:p>
         </w:tc>
         <w:tc>
           <w:tcPr>
-            <w:tcW w:type="dxa" w:w="624"/>
+            <w:tcW w:type="dxa" w:w="567"/>
             <w:shd w:val="clear" w:color="auto" w:fill="FFFFFF"/>
           </w:tcPr>
           <w:p>
@@ -1233,7 +1492,7 @@
         </w:tc>
         <w:tc>
           <w:tcPr>
-            <w:tcW w:type="dxa" w:w="794"/>
+            <w:tcW w:type="dxa" w:w="680"/>
             <w:shd w:val="clear" w:color="auto" w:fill="FFFFFF"/>
           </w:tcPr>
           <w:p>
@@ -1247,13 +1506,73 @@
                 <w:color w:val="111827"/>
                 <w:sz w:val="16"/>
               </w:rPr>
+              <w:t>100</w:t>
+            </w:r>
+          </w:p>
+        </w:tc>
+        <w:tc>
+          <w:tcPr>
+            <w:tcW w:type="dxa" w:w="850"/>
+            <w:shd w:val="clear" w:color="auto" w:fill="FFFFFF"/>
+          </w:tcPr>
+          <w:p>
+            <w:pPr>
+              <w:spacing w:before="40" w:after="40"/>
+              <w:jc w:val="center"/>
+            </w:pPr>
+            <w:r>
+              <w:rPr>
+                <w:rFonts w:ascii="Calibri" w:hAnsi="Calibri"/>
+                <w:color w:val="111827"/>
+                <w:sz w:val="16"/>
+              </w:rPr>
+              <w:t>1</w:t>
+            </w:r>
+          </w:p>
+        </w:tc>
+        <w:tc>
+          <w:tcPr>
+            <w:tcW w:type="dxa" w:w="567"/>
+            <w:shd w:val="clear" w:color="auto" w:fill="FFFFFF"/>
+          </w:tcPr>
+          <w:p>
+            <w:pPr>
+              <w:spacing w:before="40" w:after="40"/>
+              <w:jc w:val="center"/>
+            </w:pPr>
+            <w:r>
+              <w:rPr>
+                <w:rFonts w:ascii="Calibri" w:hAnsi="Calibri"/>
+                <w:color w:val="059669"/>
+                <w:sz w:val="16"/>
+              </w:rPr>
+              <w:t>0</w:t>
+            </w:r>
+          </w:p>
+        </w:tc>
+        <w:tc>
+          <w:tcPr>
+            <w:tcW w:type="dxa" w:w="680"/>
+            <w:shd w:val="clear" w:color="auto" w:fill="FFFFFF"/>
+          </w:tcPr>
+          <w:p>
+            <w:pPr>
+              <w:spacing w:before="40" w:after="40"/>
+              <w:jc w:val="center"/>
+            </w:pPr>
+            <w:r>
+              <w:rPr>
+                <w:rFonts w:ascii="Calibri" w:hAnsi="Calibri"/>
+                <w:color w:val="111827"/>
+                <w:sz w:val="16"/>
+              </w:rPr>
               <w:t>189</w:t>
             </w:r>
           </w:p>
         </w:tc>
         <w:tc>
           <w:tcPr>
-            <w:tcW w:type="dxa" w:w="794"/>
+            <w:tcW w:type="dxa" w:w="680"/>
             <w:shd w:val="clear" w:color="auto" w:fill="FFFFFF"/>
           </w:tcPr>
           <w:p>
@@ -1275,7 +1594,7 @@
       <w:tr>
         <w:tc>
           <w:tcPr>
-            <w:tcW w:type="dxa" w:w="340"/>
+            <w:tcW w:type="dxa" w:w="283"/>
             <w:shd w:val="clear" w:color="auto" w:fill="F3F4F6"/>
           </w:tcPr>
           <w:p>
@@ -1295,7 +1614,7 @@
         </w:tc>
         <w:tc>
           <w:tcPr>
-            <w:tcW w:type="dxa" w:w="2041"/>
+            <w:tcW w:type="dxa" w:w="1701"/>
             <w:shd w:val="clear" w:color="auto" w:fill="F3F4F6"/>
           </w:tcPr>
           <w:p>
@@ -1315,7 +1634,7 @@
         </w:tc>
         <w:tc>
           <w:tcPr>
-            <w:tcW w:type="dxa" w:w="1928"/>
+            <w:tcW w:type="dxa" w:w="1587"/>
             <w:shd w:val="clear" w:color="auto" w:fill="F3F4F6"/>
           </w:tcPr>
           <w:p>
@@ -1335,6 +1654,66 @@
         </w:tc>
         <w:tc>
           <w:tcPr>
+            <w:tcW w:type="dxa" w:w="737"/>
+            <w:shd w:val="clear" w:color="auto" w:fill="F3F4F6"/>
+          </w:tcPr>
+          <w:p>
+            <w:pPr>
+              <w:spacing w:before="40" w:after="40"/>
+              <w:jc w:val="center"/>
+            </w:pPr>
+            <w:r>
+              <w:rPr>
+                <w:rFonts w:ascii="Calibri" w:hAnsi="Calibri"/>
+                <w:color w:val="111827"/>
+                <w:sz w:val="16"/>
+              </w:rPr>
+              <w:t>4</w:t>
+            </w:r>
+          </w:p>
+        </w:tc>
+        <w:tc>
+          <w:tcPr>
+            <w:tcW w:type="dxa" w:w="737"/>
+            <w:shd w:val="clear" w:color="auto" w:fill="F3F4F6"/>
+          </w:tcPr>
+          <w:p>
+            <w:pPr>
+              <w:spacing w:before="40" w:after="40"/>
+              <w:jc w:val="center"/>
+            </w:pPr>
+            <w:r>
+              <w:rPr>
+                <w:rFonts w:ascii="Calibri" w:hAnsi="Calibri"/>
+                <w:color w:val="111827"/>
+                <w:sz w:val="16"/>
+              </w:rPr>
+              <w:t>13.7</w:t>
+            </w:r>
+          </w:p>
+        </w:tc>
+        <w:tc>
+          <w:tcPr>
+            <w:tcW w:type="dxa" w:w="680"/>
+            <w:shd w:val="clear" w:color="auto" w:fill="F3F4F6"/>
+          </w:tcPr>
+          <w:p>
+            <w:pPr>
+              <w:spacing w:before="40" w:after="40"/>
+              <w:jc w:val="center"/>
+            </w:pPr>
+            <w:r>
+              <w:rPr>
+                <w:rFonts w:ascii="Calibri" w:hAnsi="Calibri"/>
+                <w:color w:val="111827"/>
+                <w:sz w:val="16"/>
+              </w:rPr>
+              <w:t>728</w:t>
+            </w:r>
+          </w:p>
+        </w:tc>
+        <w:tc>
+          <w:tcPr>
             <w:tcW w:type="dxa" w:w="850"/>
             <w:shd w:val="clear" w:color="auto" w:fill="F3F4F6"/>
           </w:tcPr>
@@ -1349,7 +1728,47 @@
                 <w:color w:val="111827"/>
                 <w:sz w:val="16"/>
               </w:rPr>
-              <w:t>4</w:t>
+              <w:t>179</w:t>
+            </w:r>
+          </w:p>
+        </w:tc>
+        <w:tc>
+          <w:tcPr>
+            <w:tcW w:type="dxa" w:w="567"/>
+            <w:shd w:val="clear" w:color="auto" w:fill="F3F4F6"/>
+          </w:tcPr>
+          <w:p>
+            <w:pPr>
+              <w:spacing w:before="40" w:after="40"/>
+              <w:jc w:val="center"/>
+            </w:pPr>
+            <w:r>
+              <w:rPr>
+                <w:rFonts w:ascii="Calibri" w:hAnsi="Calibri"/>
+                <w:color w:val="059669"/>
+                <w:sz w:val="16"/>
+              </w:rPr>
+              <w:t>0</w:t>
+            </w:r>
+          </w:p>
+        </w:tc>
+        <w:tc>
+          <w:tcPr>
+            <w:tcW w:type="dxa" w:w="680"/>
+            <w:shd w:val="clear" w:color="auto" w:fill="F3F4F6"/>
+          </w:tcPr>
+          <w:p>
+            <w:pPr>
+              <w:spacing w:before="40" w:after="40"/>
+              <w:jc w:val="center"/>
+            </w:pPr>
+            <w:r>
+              <w:rPr>
+                <w:rFonts w:ascii="Calibri" w:hAnsi="Calibri"/>
+                <w:color w:val="111827"/>
+                <w:sz w:val="16"/>
+              </w:rPr>
+              <w:t>100</w:t>
             </w:r>
           </w:p>
         </w:tc>
@@ -1369,53 +1788,13 @@
                 <w:color w:val="111827"/>
                 <w:sz w:val="16"/>
               </w:rPr>
-              <w:t>13.7</w:t>
-            </w:r>
-          </w:p>
-        </w:tc>
-        <w:tc>
-          <w:tcPr>
-            <w:tcW w:type="dxa" w:w="794"/>
-            <w:shd w:val="clear" w:color="auto" w:fill="F3F4F6"/>
-          </w:tcPr>
-          <w:p>
-            <w:pPr>
-              <w:spacing w:before="40" w:after="40"/>
-              <w:jc w:val="center"/>
-            </w:pPr>
-            <w:r>
-              <w:rPr>
-                <w:rFonts w:ascii="Calibri" w:hAnsi="Calibri"/>
-                <w:color w:val="111827"/>
-                <w:sz w:val="16"/>
-              </w:rPr>
-              <w:t>728</w:t>
-            </w:r>
-          </w:p>
-        </w:tc>
-        <w:tc>
-          <w:tcPr>
-            <w:tcW w:type="dxa" w:w="1020"/>
-            <w:shd w:val="clear" w:color="auto" w:fill="F3F4F6"/>
-          </w:tcPr>
-          <w:p>
-            <w:pPr>
-              <w:spacing w:before="40" w:after="40"/>
-              <w:jc w:val="center"/>
-            </w:pPr>
-            <w:r>
-              <w:rPr>
-                <w:rFonts w:ascii="Calibri" w:hAnsi="Calibri"/>
-                <w:color w:val="111827"/>
-                <w:sz w:val="16"/>
-              </w:rPr>
-              <w:t>179</w:t>
-            </w:r>
-          </w:p>
-        </w:tc>
-        <w:tc>
-          <w:tcPr>
-            <w:tcW w:type="dxa" w:w="624"/>
+              <w:t>100</w:t>
+            </w:r>
+          </w:p>
+        </w:tc>
+        <w:tc>
+          <w:tcPr>
+            <w:tcW w:type="dxa" w:w="567"/>
             <w:shd w:val="clear" w:color="auto" w:fill="F3F4F6"/>
           </w:tcPr>
           <w:p>
@@ -1435,7 +1814,7 @@
         </w:tc>
         <w:tc>
           <w:tcPr>
-            <w:tcW w:type="dxa" w:w="794"/>
+            <w:tcW w:type="dxa" w:w="680"/>
             <w:shd w:val="clear" w:color="auto" w:fill="F3F4F6"/>
           </w:tcPr>
           <w:p>
@@ -1455,7 +1834,7 @@
         </w:tc>
         <w:tc>
           <w:tcPr>
-            <w:tcW w:type="dxa" w:w="794"/>
+            <w:tcW w:type="dxa" w:w="680"/>
             <w:shd w:val="clear" w:color="auto" w:fill="F3F4F6"/>
           </w:tcPr>
           <w:p>
@@ -1477,7 +1856,7 @@
       <w:tr>
         <w:tc>
           <w:tcPr>
-            <w:tcW w:type="dxa" w:w="340"/>
+            <w:tcW w:type="dxa" w:w="283"/>
             <w:shd w:val="clear" w:color="auto" w:fill="FFFFFF"/>
           </w:tcPr>
           <w:p>
@@ -1497,7 +1876,7 @@
         </w:tc>
         <w:tc>
           <w:tcPr>
-            <w:tcW w:type="dxa" w:w="2041"/>
+            <w:tcW w:type="dxa" w:w="1701"/>
             <w:shd w:val="clear" w:color="auto" w:fill="FFFFFF"/>
           </w:tcPr>
           <w:p>
@@ -1517,7 +1896,7 @@
         </w:tc>
         <w:tc>
           <w:tcPr>
-            <w:tcW w:type="dxa" w:w="1928"/>
+            <w:tcW w:type="dxa" w:w="1587"/>
             <w:shd w:val="clear" w:color="auto" w:fill="FFFFFF"/>
           </w:tcPr>
           <w:p>
@@ -1537,6 +1916,66 @@
         </w:tc>
         <w:tc>
           <w:tcPr>
+            <w:tcW w:type="dxa" w:w="737"/>
+            <w:shd w:val="clear" w:color="auto" w:fill="FFFFFF"/>
+          </w:tcPr>
+          <w:p>
+            <w:pPr>
+              <w:spacing w:before="40" w:after="40"/>
+              <w:jc w:val="center"/>
+            </w:pPr>
+            <w:r>
+              <w:rPr>
+                <w:rFonts w:ascii="Calibri" w:hAnsi="Calibri"/>
+                <w:color w:val="111827"/>
+                <w:sz w:val="16"/>
+              </w:rPr>
+              <w:t>not ranking</w:t>
+            </w:r>
+          </w:p>
+        </w:tc>
+        <w:tc>
+          <w:tcPr>
+            <w:tcW w:type="dxa" w:w="737"/>
+            <w:shd w:val="clear" w:color="auto" w:fill="FFFFFF"/>
+          </w:tcPr>
+          <w:p>
+            <w:pPr>
+              <w:spacing w:before="40" w:after="40"/>
+              <w:jc w:val="center"/>
+            </w:pPr>
+            <w:r>
+              <w:rPr>
+                <w:rFonts w:ascii="Calibri" w:hAnsi="Calibri"/>
+                <w:color w:val="111827"/>
+                <w:sz w:val="16"/>
+              </w:rPr>
+              <w:t>12.1</w:t>
+            </w:r>
+          </w:p>
+        </w:tc>
+        <w:tc>
+          <w:tcPr>
+            <w:tcW w:type="dxa" w:w="680"/>
+            <w:shd w:val="clear" w:color="auto" w:fill="FFFFFF"/>
+          </w:tcPr>
+          <w:p>
+            <w:pPr>
+              <w:spacing w:before="40" w:after="40"/>
+              <w:jc w:val="center"/>
+            </w:pPr>
+            <w:r>
+              <w:rPr>
+                <w:rFonts w:ascii="Calibri" w:hAnsi="Calibri"/>
+                <w:color w:val="111827"/>
+                <w:sz w:val="16"/>
+              </w:rPr>
+              <w:t>0</w:t>
+            </w:r>
+          </w:p>
+        </w:tc>
+        <w:tc>
+          <w:tcPr>
             <w:tcW w:type="dxa" w:w="850"/>
             <w:shd w:val="clear" w:color="auto" w:fill="FFFFFF"/>
           </w:tcPr>
@@ -1551,73 +1990,13 @@
                 <w:color w:val="111827"/>
                 <w:sz w:val="16"/>
               </w:rPr>
-              <w:t>not ranking</w:t>
-            </w:r>
-          </w:p>
-        </w:tc>
-        <w:tc>
-          <w:tcPr>
-            <w:tcW w:type="dxa" w:w="850"/>
-            <w:shd w:val="clear" w:color="auto" w:fill="FFFFFF"/>
-          </w:tcPr>
-          <w:p>
-            <w:pPr>
-              <w:spacing w:before="40" w:after="40"/>
-              <w:jc w:val="center"/>
-            </w:pPr>
-            <w:r>
-              <w:rPr>
-                <w:rFonts w:ascii="Calibri" w:hAnsi="Calibri"/>
-                <w:color w:val="111827"/>
-                <w:sz w:val="16"/>
-              </w:rPr>
-              <w:t>12.1</w:t>
-            </w:r>
-          </w:p>
-        </w:tc>
-        <w:tc>
-          <w:tcPr>
-            <w:tcW w:type="dxa" w:w="794"/>
-            <w:shd w:val="clear" w:color="auto" w:fill="FFFFFF"/>
-          </w:tcPr>
-          <w:p>
-            <w:pPr>
-              <w:spacing w:before="40" w:after="40"/>
-              <w:jc w:val="center"/>
-            </w:pPr>
-            <w:r>
-              <w:rPr>
-                <w:rFonts w:ascii="Calibri" w:hAnsi="Calibri"/>
-                <w:color w:val="111827"/>
-                <w:sz w:val="16"/>
-              </w:rPr>
-              <w:t>0</w:t>
-            </w:r>
-          </w:p>
-        </w:tc>
-        <w:tc>
-          <w:tcPr>
-            <w:tcW w:type="dxa" w:w="1020"/>
-            <w:shd w:val="clear" w:color="auto" w:fill="FFFFFF"/>
-          </w:tcPr>
-          <w:p>
-            <w:pPr>
-              <w:spacing w:before="40" w:after="40"/>
-              <w:jc w:val="center"/>
-            </w:pPr>
-            <w:r>
-              <w:rPr>
-                <w:rFonts w:ascii="Calibri" w:hAnsi="Calibri"/>
-                <w:color w:val="111827"/>
-                <w:sz w:val="16"/>
-              </w:rPr>
               <w:t>22</w:t>
             </w:r>
           </w:p>
         </w:tc>
         <w:tc>
           <w:tcPr>
-            <w:tcW w:type="dxa" w:w="624"/>
+            <w:tcW w:type="dxa" w:w="567"/>
             <w:shd w:val="clear" w:color="auto" w:fill="FFFFFF"/>
           </w:tcPr>
           <w:p>
@@ -1638,7 +2017,7 @@
         </w:tc>
         <w:tc>
           <w:tcPr>
-            <w:tcW w:type="dxa" w:w="794"/>
+            <w:tcW w:type="dxa" w:w="680"/>
             <w:shd w:val="clear" w:color="auto" w:fill="FFFFFF"/>
           </w:tcPr>
           <w:p>
@@ -1652,13 +2031,73 @@
                 <w:color w:val="111827"/>
                 <w:sz w:val="16"/>
               </w:rPr>
+              <w:t>0</w:t>
+            </w:r>
+          </w:p>
+        </w:tc>
+        <w:tc>
+          <w:tcPr>
+            <w:tcW w:type="dxa" w:w="850"/>
+            <w:shd w:val="clear" w:color="auto" w:fill="FFFFFF"/>
+          </w:tcPr>
+          <w:p>
+            <w:pPr>
+              <w:spacing w:before="40" w:after="40"/>
+              <w:jc w:val="center"/>
+            </w:pPr>
+            <w:r>
+              <w:rPr>
+                <w:rFonts w:ascii="Calibri" w:hAnsi="Calibri"/>
+                <w:color w:val="111827"/>
+                <w:sz w:val="16"/>
+              </w:rPr>
+              <w:t>0</w:t>
+            </w:r>
+          </w:p>
+        </w:tc>
+        <w:tc>
+          <w:tcPr>
+            <w:tcW w:type="dxa" w:w="567"/>
+            <w:shd w:val="clear" w:color="auto" w:fill="FFFFFF"/>
+          </w:tcPr>
+          <w:p>
+            <w:pPr>
+              <w:spacing w:before="40" w:after="40"/>
+              <w:jc w:val="center"/>
+            </w:pPr>
+            <w:r>
+              <w:rPr>
+                <w:rFonts w:ascii="Calibri" w:hAnsi="Calibri"/>
+                <w:color w:val="059669"/>
+                <w:sz w:val="16"/>
+              </w:rPr>
+              <w:t>0</w:t>
+            </w:r>
+          </w:p>
+        </w:tc>
+        <w:tc>
+          <w:tcPr>
+            <w:tcW w:type="dxa" w:w="680"/>
+            <w:shd w:val="clear" w:color="auto" w:fill="FFFFFF"/>
+          </w:tcPr>
+          <w:p>
+            <w:pPr>
+              <w:spacing w:before="40" w:after="40"/>
+              <w:jc w:val="center"/>
+            </w:pPr>
+            <w:r>
+              <w:rPr>
+                <w:rFonts w:ascii="Calibri" w:hAnsi="Calibri"/>
+                <w:color w:val="111827"/>
+                <w:sz w:val="16"/>
+              </w:rPr>
               <w:t>32</w:t>
             </w:r>
           </w:p>
         </w:tc>
         <w:tc>
           <w:tcPr>
-            <w:tcW w:type="dxa" w:w="794"/>
+            <w:tcW w:type="dxa" w:w="680"/>
             <w:shd w:val="clear" w:color="auto" w:fill="FFFFFF"/>
           </w:tcPr>
           <w:p>
@@ -1680,7 +2119,7 @@
       <w:tr>
         <w:tc>
           <w:tcPr>
-            <w:tcW w:type="dxa" w:w="340"/>
+            <w:tcW w:type="dxa" w:w="283"/>
             <w:shd w:val="clear" w:color="auto" w:fill="F3F4F6"/>
           </w:tcPr>
           <w:p>
@@ -1700,7 +2139,7 @@
         </w:tc>
         <w:tc>
           <w:tcPr>
-            <w:tcW w:type="dxa" w:w="2041"/>
+            <w:tcW w:type="dxa" w:w="1701"/>
             <w:shd w:val="clear" w:color="auto" w:fill="F3F4F6"/>
           </w:tcPr>
           <w:p>
@@ -1720,7 +2159,7 @@
         </w:tc>
         <w:tc>
           <w:tcPr>
-            <w:tcW w:type="dxa" w:w="1928"/>
+            <w:tcW w:type="dxa" w:w="1587"/>
             <w:shd w:val="clear" w:color="auto" w:fill="F3F4F6"/>
           </w:tcPr>
           <w:p>
@@ -1740,6 +2179,66 @@
         </w:tc>
         <w:tc>
           <w:tcPr>
+            <w:tcW w:type="dxa" w:w="737"/>
+            <w:shd w:val="clear" w:color="auto" w:fill="F3F4F6"/>
+          </w:tcPr>
+          <w:p>
+            <w:pPr>
+              <w:spacing w:before="40" w:after="40"/>
+              <w:jc w:val="center"/>
+            </w:pPr>
+            <w:r>
+              <w:rPr>
+                <w:rFonts w:ascii="Calibri" w:hAnsi="Calibri"/>
+                <w:color w:val="111827"/>
+                <w:sz w:val="16"/>
+              </w:rPr>
+              <w:t>4</w:t>
+            </w:r>
+          </w:p>
+        </w:tc>
+        <w:tc>
+          <w:tcPr>
+            <w:tcW w:type="dxa" w:w="737"/>
+            <w:shd w:val="clear" w:color="auto" w:fill="F3F4F6"/>
+          </w:tcPr>
+          <w:p>
+            <w:pPr>
+              <w:spacing w:before="40" w:after="40"/>
+              <w:jc w:val="center"/>
+            </w:pPr>
+            <w:r>
+              <w:rPr>
+                <w:rFonts w:ascii="Calibri" w:hAnsi="Calibri"/>
+                <w:color w:val="111827"/>
+                <w:sz w:val="16"/>
+              </w:rPr>
+              <w:t>14.4</w:t>
+            </w:r>
+          </w:p>
+        </w:tc>
+        <w:tc>
+          <w:tcPr>
+            <w:tcW w:type="dxa" w:w="680"/>
+            <w:shd w:val="clear" w:color="auto" w:fill="F3F4F6"/>
+          </w:tcPr>
+          <w:p>
+            <w:pPr>
+              <w:spacing w:before="40" w:after="40"/>
+              <w:jc w:val="center"/>
+            </w:pPr>
+            <w:r>
+              <w:rPr>
+                <w:rFonts w:ascii="Calibri" w:hAnsi="Calibri"/>
+                <w:color w:val="111827"/>
+                <w:sz w:val="16"/>
+              </w:rPr>
+              <w:t>728</w:t>
+            </w:r>
+          </w:p>
+        </w:tc>
+        <w:tc>
+          <w:tcPr>
             <w:tcW w:type="dxa" w:w="850"/>
             <w:shd w:val="clear" w:color="auto" w:fill="F3F4F6"/>
           </w:tcPr>
@@ -1754,7 +2253,47 @@
                 <w:color w:val="111827"/>
                 <w:sz w:val="16"/>
               </w:rPr>
-              <w:t>4</w:t>
+              <w:t>491</w:t>
+            </w:r>
+          </w:p>
+        </w:tc>
+        <w:tc>
+          <w:tcPr>
+            <w:tcW w:type="dxa" w:w="567"/>
+            <w:shd w:val="clear" w:color="auto" w:fill="F3F4F6"/>
+          </w:tcPr>
+          <w:p>
+            <w:pPr>
+              <w:spacing w:before="40" w:after="40"/>
+              <w:jc w:val="center"/>
+            </w:pPr>
+            <w:r>
+              <w:rPr>
+                <w:rFonts w:ascii="Calibri" w:hAnsi="Calibri"/>
+                <w:color w:val="059669"/>
+                <w:sz w:val="16"/>
+              </w:rPr>
+              <w:t>0</w:t>
+            </w:r>
+          </w:p>
+        </w:tc>
+        <w:tc>
+          <w:tcPr>
+            <w:tcW w:type="dxa" w:w="680"/>
+            <w:shd w:val="clear" w:color="auto" w:fill="F3F4F6"/>
+          </w:tcPr>
+          <w:p>
+            <w:pPr>
+              <w:spacing w:before="40" w:after="40"/>
+              <w:jc w:val="center"/>
+            </w:pPr>
+            <w:r>
+              <w:rPr>
+                <w:rFonts w:ascii="Calibri" w:hAnsi="Calibri"/>
+                <w:color w:val="111827"/>
+                <w:sz w:val="16"/>
+              </w:rPr>
+              <w:t>100</w:t>
             </w:r>
           </w:p>
         </w:tc>
@@ -1774,53 +2313,13 @@
                 <w:color w:val="111827"/>
                 <w:sz w:val="16"/>
               </w:rPr>
-              <w:t>14.4</w:t>
-            </w:r>
-          </w:p>
-        </w:tc>
-        <w:tc>
-          <w:tcPr>
-            <w:tcW w:type="dxa" w:w="794"/>
-            <w:shd w:val="clear" w:color="auto" w:fill="F3F4F6"/>
-          </w:tcPr>
-          <w:p>
-            <w:pPr>
-              <w:spacing w:before="40" w:after="40"/>
-              <w:jc w:val="center"/>
-            </w:pPr>
-            <w:r>
-              <w:rPr>
-                <w:rFonts w:ascii="Calibri" w:hAnsi="Calibri"/>
-                <w:color w:val="111827"/>
-                <w:sz w:val="16"/>
-              </w:rPr>
-              <w:t>728</w:t>
-            </w:r>
-          </w:p>
-        </w:tc>
-        <w:tc>
-          <w:tcPr>
-            <w:tcW w:type="dxa" w:w="1020"/>
-            <w:shd w:val="clear" w:color="auto" w:fill="F3F4F6"/>
-          </w:tcPr>
-          <w:p>
-            <w:pPr>
-              <w:spacing w:before="40" w:after="40"/>
-              <w:jc w:val="center"/>
-            </w:pPr>
-            <w:r>
-              <w:rPr>
-                <w:rFonts w:ascii="Calibri" w:hAnsi="Calibri"/>
-                <w:color w:val="111827"/>
-                <w:sz w:val="16"/>
-              </w:rPr>
-              <w:t>491</w:t>
-            </w:r>
-          </w:p>
-        </w:tc>
-        <w:tc>
-          <w:tcPr>
-            <w:tcW w:type="dxa" w:w="624"/>
+              <w:t>100</w:t>
+            </w:r>
+          </w:p>
+        </w:tc>
+        <w:tc>
+          <w:tcPr>
+            <w:tcW w:type="dxa" w:w="567"/>
             <w:shd w:val="clear" w:color="auto" w:fill="F3F4F6"/>
           </w:tcPr>
           <w:p>
@@ -1840,7 +2339,7 @@
         </w:tc>
         <w:tc>
           <w:tcPr>
-            <w:tcW w:type="dxa" w:w="794"/>
+            <w:tcW w:type="dxa" w:w="680"/>
             <w:shd w:val="clear" w:color="auto" w:fill="F3F4F6"/>
           </w:tcPr>
           <w:p>
@@ -1860,7 +2359,7 @@
         </w:tc>
         <w:tc>
           <w:tcPr>
-            <w:tcW w:type="dxa" w:w="794"/>
+            <w:tcW w:type="dxa" w:w="680"/>
             <w:shd w:val="clear" w:color="auto" w:fill="F3F4F6"/>
           </w:tcPr>
           <w:p>
@@ -1882,7 +2381,7 @@
       <w:tr>
         <w:tc>
           <w:tcPr>
-            <w:tcW w:type="dxa" w:w="340"/>
+            <w:tcW w:type="dxa" w:w="283"/>
             <w:shd w:val="clear" w:color="auto" w:fill="FFFFFF"/>
           </w:tcPr>
           <w:p>
@@ -1902,7 +2401,7 @@
         </w:tc>
         <w:tc>
           <w:tcPr>
-            <w:tcW w:type="dxa" w:w="2041"/>
+            <w:tcW w:type="dxa" w:w="1701"/>
             <w:shd w:val="clear" w:color="auto" w:fill="FFFFFF"/>
           </w:tcPr>
           <w:p>
@@ -1922,7 +2421,7 @@
         </w:tc>
         <w:tc>
           <w:tcPr>
-            <w:tcW w:type="dxa" w:w="1928"/>
+            <w:tcW w:type="dxa" w:w="1587"/>
             <w:shd w:val="clear" w:color="auto" w:fill="FFFFFF"/>
           </w:tcPr>
           <w:p>
@@ -1942,6 +2441,66 @@
         </w:tc>
         <w:tc>
           <w:tcPr>
+            <w:tcW w:type="dxa" w:w="737"/>
+            <w:shd w:val="clear" w:color="auto" w:fill="FFFFFF"/>
+          </w:tcPr>
+          <w:p>
+            <w:pPr>
+              <w:spacing w:before="40" w:after="40"/>
+              <w:jc w:val="center"/>
+            </w:pPr>
+            <w:r>
+              <w:rPr>
+                <w:rFonts w:ascii="Calibri" w:hAnsi="Calibri"/>
+                <w:color w:val="111827"/>
+                <w:sz w:val="16"/>
+              </w:rPr>
+              <w:t>2</w:t>
+            </w:r>
+          </w:p>
+        </w:tc>
+        <w:tc>
+          <w:tcPr>
+            <w:tcW w:type="dxa" w:w="737"/>
+            <w:shd w:val="clear" w:color="auto" w:fill="FFFFFF"/>
+          </w:tcPr>
+          <w:p>
+            <w:pPr>
+              <w:spacing w:before="40" w:after="40"/>
+              <w:jc w:val="center"/>
+            </w:pPr>
+            <w:r>
+              <w:rPr>
+                <w:rFonts w:ascii="Calibri" w:hAnsi="Calibri"/>
+                <w:color w:val="111827"/>
+                <w:sz w:val="16"/>
+              </w:rPr>
+              <w:t>17.1</w:t>
+            </w:r>
+          </w:p>
+        </w:tc>
+        <w:tc>
+          <w:tcPr>
+            <w:tcW w:type="dxa" w:w="680"/>
+            <w:shd w:val="clear" w:color="auto" w:fill="FFFFFF"/>
+          </w:tcPr>
+          <w:p>
+            <w:pPr>
+              <w:spacing w:before="40" w:after="40"/>
+              <w:jc w:val="center"/>
+            </w:pPr>
+            <w:r>
+              <w:rPr>
+                <w:rFonts w:ascii="Calibri" w:hAnsi="Calibri"/>
+                <w:color w:val="111827"/>
+                <w:sz w:val="16"/>
+              </w:rPr>
+              <w:t>0</w:t>
+            </w:r>
+          </w:p>
+        </w:tc>
+        <w:tc>
+          <w:tcPr>
             <w:tcW w:type="dxa" w:w="850"/>
             <w:shd w:val="clear" w:color="auto" w:fill="FFFFFF"/>
           </w:tcPr>
@@ -1956,73 +2515,13 @@
                 <w:color w:val="111827"/>
                 <w:sz w:val="16"/>
               </w:rPr>
-              <w:t>2</w:t>
-            </w:r>
-          </w:p>
-        </w:tc>
-        <w:tc>
-          <w:tcPr>
-            <w:tcW w:type="dxa" w:w="850"/>
-            <w:shd w:val="clear" w:color="auto" w:fill="FFFFFF"/>
-          </w:tcPr>
-          <w:p>
-            <w:pPr>
-              <w:spacing w:before="40" w:after="40"/>
-              <w:jc w:val="center"/>
-            </w:pPr>
-            <w:r>
-              <w:rPr>
-                <w:rFonts w:ascii="Calibri" w:hAnsi="Calibri"/>
-                <w:color w:val="111827"/>
-                <w:sz w:val="16"/>
-              </w:rPr>
-              <w:t>17.1</w:t>
-            </w:r>
-          </w:p>
-        </w:tc>
-        <w:tc>
-          <w:tcPr>
-            <w:tcW w:type="dxa" w:w="794"/>
-            <w:shd w:val="clear" w:color="auto" w:fill="FFFFFF"/>
-          </w:tcPr>
-          <w:p>
-            <w:pPr>
-              <w:spacing w:before="40" w:after="40"/>
-              <w:jc w:val="center"/>
-            </w:pPr>
-            <w:r>
-              <w:rPr>
-                <w:rFonts w:ascii="Calibri" w:hAnsi="Calibri"/>
-                <w:color w:val="111827"/>
-                <w:sz w:val="16"/>
-              </w:rPr>
-              <w:t>0</w:t>
-            </w:r>
-          </w:p>
-        </w:tc>
-        <w:tc>
-          <w:tcPr>
-            <w:tcW w:type="dxa" w:w="1020"/>
-            <w:shd w:val="clear" w:color="auto" w:fill="FFFFFF"/>
-          </w:tcPr>
-          <w:p>
-            <w:pPr>
-              <w:spacing w:before="40" w:after="40"/>
-              <w:jc w:val="center"/>
-            </w:pPr>
-            <w:r>
-              <w:rPr>
-                <w:rFonts w:ascii="Calibri" w:hAnsi="Calibri"/>
-                <w:color w:val="111827"/>
-                <w:sz w:val="16"/>
-              </w:rPr>
               <w:t>12</w:t>
             </w:r>
           </w:p>
         </w:tc>
         <w:tc>
           <w:tcPr>
-            <w:tcW w:type="dxa" w:w="624"/>
+            <w:tcW w:type="dxa" w:w="567"/>
             <w:shd w:val="clear" w:color="auto" w:fill="FFFFFF"/>
           </w:tcPr>
           <w:p>
@@ -2043,7 +2542,7 @@
         </w:tc>
         <w:tc>
           <w:tcPr>
-            <w:tcW w:type="dxa" w:w="794"/>
+            <w:tcW w:type="dxa" w:w="680"/>
             <w:shd w:val="clear" w:color="auto" w:fill="FFFFFF"/>
           </w:tcPr>
           <w:p>
@@ -2057,13 +2556,73 @@
                 <w:color w:val="111827"/>
                 <w:sz w:val="16"/>
               </w:rPr>
+              <w:t>0</w:t>
+            </w:r>
+          </w:p>
+        </w:tc>
+        <w:tc>
+          <w:tcPr>
+            <w:tcW w:type="dxa" w:w="850"/>
+            <w:shd w:val="clear" w:color="auto" w:fill="FFFFFF"/>
+          </w:tcPr>
+          <w:p>
+            <w:pPr>
+              <w:spacing w:before="40" w:after="40"/>
+              <w:jc w:val="center"/>
+            </w:pPr>
+            <w:r>
+              <w:rPr>
+                <w:rFonts w:ascii="Calibri" w:hAnsi="Calibri"/>
+                <w:color w:val="111827"/>
+                <w:sz w:val="16"/>
+              </w:rPr>
+              <w:t>0</w:t>
+            </w:r>
+          </w:p>
+        </w:tc>
+        <w:tc>
+          <w:tcPr>
+            <w:tcW w:type="dxa" w:w="567"/>
+            <w:shd w:val="clear" w:color="auto" w:fill="FFFFFF"/>
+          </w:tcPr>
+          <w:p>
+            <w:pPr>
+              <w:spacing w:before="40" w:after="40"/>
+              <w:jc w:val="center"/>
+            </w:pPr>
+            <w:r>
+              <w:rPr>
+                <w:rFonts w:ascii="Calibri" w:hAnsi="Calibri"/>
+                <w:color w:val="059669"/>
+                <w:sz w:val="16"/>
+              </w:rPr>
+              <w:t>0</w:t>
+            </w:r>
+          </w:p>
+        </w:tc>
+        <w:tc>
+          <w:tcPr>
+            <w:tcW w:type="dxa" w:w="680"/>
+            <w:shd w:val="clear" w:color="auto" w:fill="FFFFFF"/>
+          </w:tcPr>
+          <w:p>
+            <w:pPr>
+              <w:spacing w:before="40" w:after="40"/>
+              <w:jc w:val="center"/>
+            </w:pPr>
+            <w:r>
+              <w:rPr>
+                <w:rFonts w:ascii="Calibri" w:hAnsi="Calibri"/>
+                <w:color w:val="111827"/>
+                <w:sz w:val="16"/>
+              </w:rPr>
               <w:t>22</w:t>
             </w:r>
           </w:p>
         </w:tc>
         <w:tc>
           <w:tcPr>
-            <w:tcW w:type="dxa" w:w="794"/>
+            <w:tcW w:type="dxa" w:w="680"/>
             <w:shd w:val="clear" w:color="auto" w:fill="FFFFFF"/>
           </w:tcPr>
           <w:p>
@@ -2085,7 +2644,7 @@
       <w:tr>
         <w:tc>
           <w:tcPr>
-            <w:tcW w:type="dxa" w:w="340"/>
+            <w:tcW w:type="dxa" w:w="283"/>
             <w:shd w:val="clear" w:color="auto" w:fill="F3F4F6"/>
           </w:tcPr>
           <w:p>
@@ -2105,7 +2664,7 @@
         </w:tc>
         <w:tc>
           <w:tcPr>
-            <w:tcW w:type="dxa" w:w="2041"/>
+            <w:tcW w:type="dxa" w:w="1701"/>
             <w:shd w:val="clear" w:color="auto" w:fill="F3F4F6"/>
           </w:tcPr>
           <w:p>
@@ -2125,7 +2684,7 @@
         </w:tc>
         <w:tc>
           <w:tcPr>
-            <w:tcW w:type="dxa" w:w="1928"/>
+            <w:tcW w:type="dxa" w:w="1587"/>
             <w:shd w:val="clear" w:color="auto" w:fill="F3F4F6"/>
           </w:tcPr>
           <w:p>
@@ -2145,6 +2704,66 @@
         </w:tc>
         <w:tc>
           <w:tcPr>
+            <w:tcW w:type="dxa" w:w="737"/>
+            <w:shd w:val="clear" w:color="auto" w:fill="F3F4F6"/>
+          </w:tcPr>
+          <w:p>
+            <w:pPr>
+              <w:spacing w:before="40" w:after="40"/>
+              <w:jc w:val="center"/>
+            </w:pPr>
+            <w:r>
+              <w:rPr>
+                <w:rFonts w:ascii="Calibri" w:hAnsi="Calibri"/>
+                <w:color w:val="111827"/>
+                <w:sz w:val="16"/>
+              </w:rPr>
+              <w:t>not ranking</w:t>
+            </w:r>
+          </w:p>
+        </w:tc>
+        <w:tc>
+          <w:tcPr>
+            <w:tcW w:type="dxa" w:w="737"/>
+            <w:shd w:val="clear" w:color="auto" w:fill="F3F4F6"/>
+          </w:tcPr>
+          <w:p>
+            <w:pPr>
+              <w:spacing w:before="40" w:after="40"/>
+              <w:jc w:val="center"/>
+            </w:pPr>
+            <w:r>
+              <w:rPr>
+                <w:rFonts w:ascii="Calibri" w:hAnsi="Calibri"/>
+                <w:color w:val="111827"/>
+                <w:sz w:val="16"/>
+              </w:rPr>
+              <w:t>14.4</w:t>
+            </w:r>
+          </w:p>
+        </w:tc>
+        <w:tc>
+          <w:tcPr>
+            <w:tcW w:type="dxa" w:w="680"/>
+            <w:shd w:val="clear" w:color="auto" w:fill="F3F4F6"/>
+          </w:tcPr>
+          <w:p>
+            <w:pPr>
+              <w:spacing w:before="40" w:after="40"/>
+              <w:jc w:val="center"/>
+            </w:pPr>
+            <w:r>
+              <w:rPr>
+                <w:rFonts w:ascii="Calibri" w:hAnsi="Calibri"/>
+                <w:color w:val="111827"/>
+                <w:sz w:val="16"/>
+              </w:rPr>
+              <w:t>0</w:t>
+            </w:r>
+          </w:p>
+        </w:tc>
+        <w:tc>
+          <w:tcPr>
             <w:tcW w:type="dxa" w:w="850"/>
             <w:shd w:val="clear" w:color="auto" w:fill="F3F4F6"/>
           </w:tcPr>
@@ -2159,73 +2778,13 @@
                 <w:color w:val="111827"/>
                 <w:sz w:val="16"/>
               </w:rPr>
-              <w:t>not ranking</w:t>
-            </w:r>
-          </w:p>
-        </w:tc>
-        <w:tc>
-          <w:tcPr>
-            <w:tcW w:type="dxa" w:w="850"/>
-            <w:shd w:val="clear" w:color="auto" w:fill="F3F4F6"/>
-          </w:tcPr>
-          <w:p>
-            <w:pPr>
-              <w:spacing w:before="40" w:after="40"/>
-              <w:jc w:val="center"/>
-            </w:pPr>
-            <w:r>
-              <w:rPr>
-                <w:rFonts w:ascii="Calibri" w:hAnsi="Calibri"/>
-                <w:color w:val="111827"/>
-                <w:sz w:val="16"/>
-              </w:rPr>
-              <w:t>14.4</w:t>
-            </w:r>
-          </w:p>
-        </w:tc>
-        <w:tc>
-          <w:tcPr>
-            <w:tcW w:type="dxa" w:w="794"/>
-            <w:shd w:val="clear" w:color="auto" w:fill="F3F4F6"/>
-          </w:tcPr>
-          <w:p>
-            <w:pPr>
-              <w:spacing w:before="40" w:after="40"/>
-              <w:jc w:val="center"/>
-            </w:pPr>
-            <w:r>
-              <w:rPr>
-                <w:rFonts w:ascii="Calibri" w:hAnsi="Calibri"/>
-                <w:color w:val="111827"/>
-                <w:sz w:val="16"/>
-              </w:rPr>
-              <w:t>0</w:t>
-            </w:r>
-          </w:p>
-        </w:tc>
-        <w:tc>
-          <w:tcPr>
-            <w:tcW w:type="dxa" w:w="1020"/>
-            <w:shd w:val="clear" w:color="auto" w:fill="F3F4F6"/>
-          </w:tcPr>
-          <w:p>
-            <w:pPr>
-              <w:spacing w:before="40" w:after="40"/>
-              <w:jc w:val="center"/>
-            </w:pPr>
-            <w:r>
-              <w:rPr>
-                <w:rFonts w:ascii="Calibri" w:hAnsi="Calibri"/>
-                <w:color w:val="111827"/>
-                <w:sz w:val="16"/>
-              </w:rPr>
               <w:t>9</w:t>
             </w:r>
           </w:p>
         </w:tc>
         <w:tc>
           <w:tcPr>
-            <w:tcW w:type="dxa" w:w="624"/>
+            <w:tcW w:type="dxa" w:w="567"/>
             <w:shd w:val="clear" w:color="auto" w:fill="F3F4F6"/>
           </w:tcPr>
           <w:p>
@@ -2246,7 +2805,7 @@
         </w:tc>
         <w:tc>
           <w:tcPr>
-            <w:tcW w:type="dxa" w:w="794"/>
+            <w:tcW w:type="dxa" w:w="680"/>
             <w:shd w:val="clear" w:color="auto" w:fill="F3F4F6"/>
           </w:tcPr>
           <w:p>
@@ -2260,13 +2819,73 @@
                 <w:color w:val="111827"/>
                 <w:sz w:val="16"/>
               </w:rPr>
+              <w:t>0</w:t>
+            </w:r>
+          </w:p>
+        </w:tc>
+        <w:tc>
+          <w:tcPr>
+            <w:tcW w:type="dxa" w:w="850"/>
+            <w:shd w:val="clear" w:color="auto" w:fill="F3F4F6"/>
+          </w:tcPr>
+          <w:p>
+            <w:pPr>
+              <w:spacing w:before="40" w:after="40"/>
+              <w:jc w:val="center"/>
+            </w:pPr>
+            <w:r>
+              <w:rPr>
+                <w:rFonts w:ascii="Calibri" w:hAnsi="Calibri"/>
+                <w:color w:val="111827"/>
+                <w:sz w:val="16"/>
+              </w:rPr>
+              <w:t>0</w:t>
+            </w:r>
+          </w:p>
+        </w:tc>
+        <w:tc>
+          <w:tcPr>
+            <w:tcW w:type="dxa" w:w="567"/>
+            <w:shd w:val="clear" w:color="auto" w:fill="F3F4F6"/>
+          </w:tcPr>
+          <w:p>
+            <w:pPr>
+              <w:spacing w:before="40" w:after="40"/>
+              <w:jc w:val="center"/>
+            </w:pPr>
+            <w:r>
+              <w:rPr>
+                <w:rFonts w:ascii="Calibri" w:hAnsi="Calibri"/>
+                <w:color w:val="059669"/>
+                <w:sz w:val="16"/>
+              </w:rPr>
+              <w:t>0</w:t>
+            </w:r>
+          </w:p>
+        </w:tc>
+        <w:tc>
+          <w:tcPr>
+            <w:tcW w:type="dxa" w:w="680"/>
+            <w:shd w:val="clear" w:color="auto" w:fill="F3F4F6"/>
+          </w:tcPr>
+          <w:p>
+            <w:pPr>
+              <w:spacing w:before="40" w:after="40"/>
+              <w:jc w:val="center"/>
+            </w:pPr>
+            <w:r>
+              <w:rPr>
+                <w:rFonts w:ascii="Calibri" w:hAnsi="Calibri"/>
+                <w:color w:val="111827"/>
+                <w:sz w:val="16"/>
+              </w:rPr>
               <w:t>19</w:t>
             </w:r>
           </w:p>
         </w:tc>
         <w:tc>
           <w:tcPr>
-            <w:tcW w:type="dxa" w:w="794"/>
+            <w:tcW w:type="dxa" w:w="680"/>
             <w:shd w:val="clear" w:color="auto" w:fill="F3F4F6"/>
           </w:tcPr>
           <w:p>
@@ -2288,7 +2907,7 @@
       <w:tr>
         <w:tc>
           <w:tcPr>
-            <w:tcW w:type="dxa" w:w="340"/>
+            <w:tcW w:type="dxa" w:w="283"/>
             <w:shd w:val="clear" w:color="auto" w:fill="FFFFFF"/>
           </w:tcPr>
           <w:p>
@@ -2308,7 +2927,7 @@
         </w:tc>
         <w:tc>
           <w:tcPr>
-            <w:tcW w:type="dxa" w:w="2041"/>
+            <w:tcW w:type="dxa" w:w="1701"/>
             <w:shd w:val="clear" w:color="auto" w:fill="FFFFFF"/>
           </w:tcPr>
           <w:p>
@@ -2328,7 +2947,7 @@
         </w:tc>
         <w:tc>
           <w:tcPr>
-            <w:tcW w:type="dxa" w:w="1928"/>
+            <w:tcW w:type="dxa" w:w="1587"/>
             <w:shd w:val="clear" w:color="auto" w:fill="FFFFFF"/>
           </w:tcPr>
           <w:p>
@@ -2348,6 +2967,66 @@
         </w:tc>
         <w:tc>
           <w:tcPr>
+            <w:tcW w:type="dxa" w:w="737"/>
+            <w:shd w:val="clear" w:color="auto" w:fill="FFFFFF"/>
+          </w:tcPr>
+          <w:p>
+            <w:pPr>
+              <w:spacing w:before="40" w:after="40"/>
+              <w:jc w:val="center"/>
+            </w:pPr>
+            <w:r>
+              <w:rPr>
+                <w:rFonts w:ascii="Calibri" w:hAnsi="Calibri"/>
+                <w:color w:val="111827"/>
+                <w:sz w:val="16"/>
+              </w:rPr>
+              <w:t>not ranking</w:t>
+            </w:r>
+          </w:p>
+        </w:tc>
+        <w:tc>
+          <w:tcPr>
+            <w:tcW w:type="dxa" w:w="737"/>
+            <w:shd w:val="clear" w:color="auto" w:fill="FFFFFF"/>
+          </w:tcPr>
+          <w:p>
+            <w:pPr>
+              <w:spacing w:before="40" w:after="40"/>
+              <w:jc w:val="center"/>
+            </w:pPr>
+            <w:r>
+              <w:rPr>
+                <w:rFonts w:ascii="Calibri" w:hAnsi="Calibri"/>
+                <w:color w:val="111827"/>
+                <w:sz w:val="16"/>
+              </w:rPr>
+              <w:t>13.6</w:t>
+            </w:r>
+          </w:p>
+        </w:tc>
+        <w:tc>
+          <w:tcPr>
+            <w:tcW w:type="dxa" w:w="680"/>
+            <w:shd w:val="clear" w:color="auto" w:fill="FFFFFF"/>
+          </w:tcPr>
+          <w:p>
+            <w:pPr>
+              <w:spacing w:before="40" w:after="40"/>
+              <w:jc w:val="center"/>
+            </w:pPr>
+            <w:r>
+              <w:rPr>
+                <w:rFonts w:ascii="Calibri" w:hAnsi="Calibri"/>
+                <w:color w:val="111827"/>
+                <w:sz w:val="16"/>
+              </w:rPr>
+              <w:t>0</w:t>
+            </w:r>
+          </w:p>
+        </w:tc>
+        <w:tc>
+          <w:tcPr>
             <w:tcW w:type="dxa" w:w="850"/>
             <w:shd w:val="clear" w:color="auto" w:fill="FFFFFF"/>
           </w:tcPr>
@@ -2362,73 +3041,13 @@
                 <w:color w:val="111827"/>
                 <w:sz w:val="16"/>
               </w:rPr>
-              <w:t>not ranking</w:t>
-            </w:r>
-          </w:p>
-        </w:tc>
-        <w:tc>
-          <w:tcPr>
-            <w:tcW w:type="dxa" w:w="850"/>
-            <w:shd w:val="clear" w:color="auto" w:fill="FFFFFF"/>
-          </w:tcPr>
-          <w:p>
-            <w:pPr>
-              <w:spacing w:before="40" w:after="40"/>
-              <w:jc w:val="center"/>
-            </w:pPr>
-            <w:r>
-              <w:rPr>
-                <w:rFonts w:ascii="Calibri" w:hAnsi="Calibri"/>
-                <w:color w:val="111827"/>
-                <w:sz w:val="16"/>
-              </w:rPr>
-              <w:t>13.6</w:t>
-            </w:r>
-          </w:p>
-        </w:tc>
-        <w:tc>
-          <w:tcPr>
-            <w:tcW w:type="dxa" w:w="794"/>
-            <w:shd w:val="clear" w:color="auto" w:fill="FFFFFF"/>
-          </w:tcPr>
-          <w:p>
-            <w:pPr>
-              <w:spacing w:before="40" w:after="40"/>
-              <w:jc w:val="center"/>
-            </w:pPr>
-            <w:r>
-              <w:rPr>
-                <w:rFonts w:ascii="Calibri" w:hAnsi="Calibri"/>
-                <w:color w:val="111827"/>
-                <w:sz w:val="16"/>
-              </w:rPr>
-              <w:t>0</w:t>
-            </w:r>
-          </w:p>
-        </w:tc>
-        <w:tc>
-          <w:tcPr>
-            <w:tcW w:type="dxa" w:w="1020"/>
-            <w:shd w:val="clear" w:color="auto" w:fill="FFFFFF"/>
-          </w:tcPr>
-          <w:p>
-            <w:pPr>
-              <w:spacing w:before="40" w:after="40"/>
-              <w:jc w:val="center"/>
-            </w:pPr>
-            <w:r>
-              <w:rPr>
-                <w:rFonts w:ascii="Calibri" w:hAnsi="Calibri"/>
-                <w:color w:val="111827"/>
-                <w:sz w:val="16"/>
-              </w:rPr>
               <w:t>124</w:t>
             </w:r>
           </w:p>
         </w:tc>
         <w:tc>
           <w:tcPr>
-            <w:tcW w:type="dxa" w:w="624"/>
+            <w:tcW w:type="dxa" w:w="567"/>
             <w:shd w:val="clear" w:color="auto" w:fill="FFFFFF"/>
           </w:tcPr>
           <w:p>
@@ -2449,7 +3068,7 @@
         </w:tc>
         <w:tc>
           <w:tcPr>
-            <w:tcW w:type="dxa" w:w="794"/>
+            <w:tcW w:type="dxa" w:w="680"/>
             <w:shd w:val="clear" w:color="auto" w:fill="FFFFFF"/>
           </w:tcPr>
           <w:p>
@@ -2463,13 +3082,73 @@
                 <w:color w:val="111827"/>
                 <w:sz w:val="16"/>
               </w:rPr>
+              <w:t>0</w:t>
+            </w:r>
+          </w:p>
+        </w:tc>
+        <w:tc>
+          <w:tcPr>
+            <w:tcW w:type="dxa" w:w="850"/>
+            <w:shd w:val="clear" w:color="auto" w:fill="FFFFFF"/>
+          </w:tcPr>
+          <w:p>
+            <w:pPr>
+              <w:spacing w:before="40" w:after="40"/>
+              <w:jc w:val="center"/>
+            </w:pPr>
+            <w:r>
+              <w:rPr>
+                <w:rFonts w:ascii="Calibri" w:hAnsi="Calibri"/>
+                <w:color w:val="111827"/>
+                <w:sz w:val="16"/>
+              </w:rPr>
+              <w:t>0</w:t>
+            </w:r>
+          </w:p>
+        </w:tc>
+        <w:tc>
+          <w:tcPr>
+            <w:tcW w:type="dxa" w:w="567"/>
+            <w:shd w:val="clear" w:color="auto" w:fill="FFFFFF"/>
+          </w:tcPr>
+          <w:p>
+            <w:pPr>
+              <w:spacing w:before="40" w:after="40"/>
+              <w:jc w:val="center"/>
+            </w:pPr>
+            <w:r>
+              <w:rPr>
+                <w:rFonts w:ascii="Calibri" w:hAnsi="Calibri"/>
+                <w:color w:val="059669"/>
+                <w:sz w:val="16"/>
+              </w:rPr>
+              <w:t>0</w:t>
+            </w:r>
+          </w:p>
+        </w:tc>
+        <w:tc>
+          <w:tcPr>
+            <w:tcW w:type="dxa" w:w="680"/>
+            <w:shd w:val="clear" w:color="auto" w:fill="FFFFFF"/>
+          </w:tcPr>
+          <w:p>
+            <w:pPr>
+              <w:spacing w:before="40" w:after="40"/>
+              <w:jc w:val="center"/>
+            </w:pPr>
+            <w:r>
+              <w:rPr>
+                <w:rFonts w:ascii="Calibri" w:hAnsi="Calibri"/>
+                <w:color w:val="111827"/>
+                <w:sz w:val="16"/>
+              </w:rPr>
               <w:t>134</w:t>
             </w:r>
           </w:p>
         </w:tc>
         <w:tc>
           <w:tcPr>
-            <w:tcW w:type="dxa" w:w="794"/>
+            <w:tcW w:type="dxa" w:w="680"/>
             <w:shd w:val="clear" w:color="auto" w:fill="FFFFFF"/>
           </w:tcPr>
           <w:p>

</xml_diff>

<commit_message>
Add 'loyalty software' (KW0) to backlink gap analysis
Full SERP data from Ahrefs competitive analysis (June 2026, US).
Homepage at pos 4 with 735 RDs already exceeds top-5 median (502 RDs) —
no backlink gap. Path to pos 1–3 is AI Overview inclusion and content
depth rather than additional links.

Co-Authored-By: Claude Sonnet 4.6 <noreply@anthropic.com>
Claude-Session: https://claude.ai/code/session_01PUXopWm3tyc7SXkeM8DDZy
</commit_message>
<xml_diff>
--- a/backlink_gap_2026.docx
+++ b/backlink_gap_2026.docx
@@ -558,7 +558,7 @@
                 <w:color w:val="111827"/>
                 <w:sz w:val="16"/>
               </w:rPr>
-              <w:t>1</w:t>
+              <w:t>0</w:t>
             </w:r>
           </w:p>
         </w:tc>
@@ -578,7 +578,7 @@
                 <w:color w:val="111827"/>
                 <w:sz w:val="16"/>
               </w:rPr>
-              <w:t>customer loyalty software</w:t>
+              <w:t>loyalty software</w:t>
             </w:r>
           </w:p>
         </w:tc>
@@ -618,7 +618,7 @@
                 <w:color w:val="111827"/>
                 <w:sz w:val="16"/>
               </w:rPr>
-              <w:t>2</w:t>
+              <w:t>4</w:t>
             </w:r>
           </w:p>
         </w:tc>
@@ -638,7 +638,7 @@
                 <w:color w:val="111827"/>
                 <w:sz w:val="16"/>
               </w:rPr>
-              <w:t>6.8</w:t>
+              <w:t>4.0</w:t>
             </w:r>
           </w:p>
         </w:tc>
@@ -658,7 +658,7 @@
                 <w:color w:val="111827"/>
                 <w:sz w:val="16"/>
               </w:rPr>
-              <w:t>728</w:t>
+              <w:t>735</w:t>
             </w:r>
           </w:p>
         </w:tc>
@@ -678,7 +678,7 @@
                 <w:color w:val="111827"/>
                 <w:sz w:val="16"/>
               </w:rPr>
-              <w:t>179</w:t>
+              <w:t>502</w:t>
             </w:r>
           </w:p>
         </w:tc>
@@ -738,7 +738,7 @@
                 <w:color w:val="111827"/>
                 <w:sz w:val="16"/>
               </w:rPr>
-              <w:t>100</w:t>
+              <w:t>1</w:t>
             </w:r>
           </w:p>
         </w:tc>
@@ -778,7 +778,7 @@
                 <w:color w:val="111827"/>
                 <w:sz w:val="16"/>
               </w:rPr>
-              <w:t>189</w:t>
+              <w:t>512</w:t>
             </w:r>
           </w:p>
         </w:tc>
@@ -820,7 +820,7 @@
                 <w:color w:val="111827"/>
                 <w:sz w:val="16"/>
               </w:rPr>
-              <w:t>2</w:t>
+              <w:t>1</w:t>
             </w:r>
           </w:p>
         </w:tc>
@@ -840,7 +840,7 @@
                 <w:color w:val="111827"/>
                 <w:sz w:val="16"/>
               </w:rPr>
-              <w:t>best white label loyalty app</w:t>
+              <w:t>customer loyalty software</w:t>
             </w:r>
           </w:p>
         </w:tc>
@@ -860,6 +860,268 @@
                 <w:color w:val="111827"/>
                 <w:sz w:val="16"/>
               </w:rPr>
+              <w:t>/ (homepage)</w:t>
+            </w:r>
+          </w:p>
+        </w:tc>
+        <w:tc>
+          <w:tcPr>
+            <w:tcW w:type="dxa" w:w="737"/>
+            <w:shd w:val="clear" w:color="auto" w:fill="FFFFFF"/>
+          </w:tcPr>
+          <w:p>
+            <w:pPr>
+              <w:spacing w:before="40" w:after="40"/>
+              <w:jc w:val="center"/>
+            </w:pPr>
+            <w:r>
+              <w:rPr>
+                <w:rFonts w:ascii="Calibri" w:hAnsi="Calibri"/>
+                <w:color w:val="111827"/>
+                <w:sz w:val="16"/>
+              </w:rPr>
+              <w:t>2</w:t>
+            </w:r>
+          </w:p>
+        </w:tc>
+        <w:tc>
+          <w:tcPr>
+            <w:tcW w:type="dxa" w:w="737"/>
+            <w:shd w:val="clear" w:color="auto" w:fill="FFFFFF"/>
+          </w:tcPr>
+          <w:p>
+            <w:pPr>
+              <w:spacing w:before="40" w:after="40"/>
+              <w:jc w:val="center"/>
+            </w:pPr>
+            <w:r>
+              <w:rPr>
+                <w:rFonts w:ascii="Calibri" w:hAnsi="Calibri"/>
+                <w:color w:val="111827"/>
+                <w:sz w:val="16"/>
+              </w:rPr>
+              <w:t>6.8</w:t>
+            </w:r>
+          </w:p>
+        </w:tc>
+        <w:tc>
+          <w:tcPr>
+            <w:tcW w:type="dxa" w:w="680"/>
+            <w:shd w:val="clear" w:color="auto" w:fill="FFFFFF"/>
+          </w:tcPr>
+          <w:p>
+            <w:pPr>
+              <w:spacing w:before="40" w:after="40"/>
+              <w:jc w:val="center"/>
+            </w:pPr>
+            <w:r>
+              <w:rPr>
+                <w:rFonts w:ascii="Calibri" w:hAnsi="Calibri"/>
+                <w:color w:val="111827"/>
+                <w:sz w:val="16"/>
+              </w:rPr>
+              <w:t>728</w:t>
+            </w:r>
+          </w:p>
+        </w:tc>
+        <w:tc>
+          <w:tcPr>
+            <w:tcW w:type="dxa" w:w="850"/>
+            <w:shd w:val="clear" w:color="auto" w:fill="FFFFFF"/>
+          </w:tcPr>
+          <w:p>
+            <w:pPr>
+              <w:spacing w:before="40" w:after="40"/>
+              <w:jc w:val="center"/>
+            </w:pPr>
+            <w:r>
+              <w:rPr>
+                <w:rFonts w:ascii="Calibri" w:hAnsi="Calibri"/>
+                <w:color w:val="111827"/>
+                <w:sz w:val="16"/>
+              </w:rPr>
+              <w:t>179</w:t>
+            </w:r>
+          </w:p>
+        </w:tc>
+        <w:tc>
+          <w:tcPr>
+            <w:tcW w:type="dxa" w:w="567"/>
+            <w:shd w:val="clear" w:color="auto" w:fill="FFFFFF"/>
+          </w:tcPr>
+          <w:p>
+            <w:pPr>
+              <w:spacing w:before="40" w:after="40"/>
+              <w:jc w:val="center"/>
+            </w:pPr>
+            <w:r>
+              <w:rPr>
+                <w:rFonts w:ascii="Calibri" w:hAnsi="Calibri"/>
+                <w:color w:val="059669"/>
+                <w:sz w:val="16"/>
+              </w:rPr>
+              <w:t>0</w:t>
+            </w:r>
+          </w:p>
+        </w:tc>
+        <w:tc>
+          <w:tcPr>
+            <w:tcW w:type="dxa" w:w="680"/>
+            <w:shd w:val="clear" w:color="auto" w:fill="FFFFFF"/>
+          </w:tcPr>
+          <w:p>
+            <w:pPr>
+              <w:spacing w:before="40" w:after="40"/>
+              <w:jc w:val="center"/>
+            </w:pPr>
+            <w:r>
+              <w:rPr>
+                <w:rFonts w:ascii="Calibri" w:hAnsi="Calibri"/>
+                <w:color w:val="111827"/>
+                <w:sz w:val="16"/>
+              </w:rPr>
+              <w:t>100</w:t>
+            </w:r>
+          </w:p>
+        </w:tc>
+        <w:tc>
+          <w:tcPr>
+            <w:tcW w:type="dxa" w:w="850"/>
+            <w:shd w:val="clear" w:color="auto" w:fill="FFFFFF"/>
+          </w:tcPr>
+          <w:p>
+            <w:pPr>
+              <w:spacing w:before="40" w:after="40"/>
+              <w:jc w:val="center"/>
+            </w:pPr>
+            <w:r>
+              <w:rPr>
+                <w:rFonts w:ascii="Calibri" w:hAnsi="Calibri"/>
+                <w:color w:val="111827"/>
+                <w:sz w:val="16"/>
+              </w:rPr>
+              <w:t>100</w:t>
+            </w:r>
+          </w:p>
+        </w:tc>
+        <w:tc>
+          <w:tcPr>
+            <w:tcW w:type="dxa" w:w="567"/>
+            <w:shd w:val="clear" w:color="auto" w:fill="FFFFFF"/>
+          </w:tcPr>
+          <w:p>
+            <w:pPr>
+              <w:spacing w:before="40" w:after="40"/>
+              <w:jc w:val="center"/>
+            </w:pPr>
+            <w:r>
+              <w:rPr>
+                <w:rFonts w:ascii="Calibri" w:hAnsi="Calibri"/>
+                <w:color w:val="059669"/>
+                <w:sz w:val="16"/>
+              </w:rPr>
+              <w:t>0</w:t>
+            </w:r>
+          </w:p>
+        </w:tc>
+        <w:tc>
+          <w:tcPr>
+            <w:tcW w:type="dxa" w:w="680"/>
+            <w:shd w:val="clear" w:color="auto" w:fill="FFFFFF"/>
+          </w:tcPr>
+          <w:p>
+            <w:pPr>
+              <w:spacing w:before="40" w:after="40"/>
+              <w:jc w:val="center"/>
+            </w:pPr>
+            <w:r>
+              <w:rPr>
+                <w:rFonts w:ascii="Calibri" w:hAnsi="Calibri"/>
+                <w:color w:val="111827"/>
+                <w:sz w:val="16"/>
+              </w:rPr>
+              <w:t>189</w:t>
+            </w:r>
+          </w:p>
+        </w:tc>
+        <w:tc>
+          <w:tcPr>
+            <w:tcW w:type="dxa" w:w="680"/>
+            <w:shd w:val="clear" w:color="auto" w:fill="FFFFFF"/>
+          </w:tcPr>
+          <w:p>
+            <w:pPr>
+              <w:spacing w:before="40" w:after="40"/>
+              <w:jc w:val="center"/>
+            </w:pPr>
+            <w:r>
+              <w:rPr>
+                <w:rFonts w:ascii="Calibri" w:hAnsi="Calibri"/>
+                <w:color w:val="111827"/>
+                <w:sz w:val="16"/>
+              </w:rPr>
+              <w:t>0</w:t>
+            </w:r>
+          </w:p>
+        </w:tc>
+      </w:tr>
+      <w:tr>
+        <w:tc>
+          <w:tcPr>
+            <w:tcW w:type="dxa" w:w="283"/>
+            <w:shd w:val="clear" w:color="auto" w:fill="F3F4F6"/>
+          </w:tcPr>
+          <w:p>
+            <w:pPr>
+              <w:spacing w:before="40" w:after="40"/>
+              <w:jc w:val="center"/>
+            </w:pPr>
+            <w:r>
+              <w:rPr>
+                <w:rFonts w:ascii="Calibri" w:hAnsi="Calibri"/>
+                <w:color w:val="111827"/>
+                <w:sz w:val="16"/>
+              </w:rPr>
+              <w:t>2</w:t>
+            </w:r>
+          </w:p>
+        </w:tc>
+        <w:tc>
+          <w:tcPr>
+            <w:tcW w:type="dxa" w:w="1701"/>
+            <w:shd w:val="clear" w:color="auto" w:fill="F3F4F6"/>
+          </w:tcPr>
+          <w:p>
+            <w:pPr>
+              <w:spacing w:before="40" w:after="40"/>
+              <w:jc w:val="left"/>
+            </w:pPr>
+            <w:r>
+              <w:rPr>
+                <w:rFonts w:ascii="Calibri" w:hAnsi="Calibri"/>
+                <w:color w:val="111827"/>
+                <w:sz w:val="16"/>
+              </w:rPr>
+              <w:t>best white label loyalty app</w:t>
+            </w:r>
+          </w:p>
+        </w:tc>
+        <w:tc>
+          <w:tcPr>
+            <w:tcW w:type="dxa" w:w="1587"/>
+            <w:shd w:val="clear" w:color="auto" w:fill="F3F4F6"/>
+          </w:tcPr>
+          <w:p>
+            <w:pPr>
+              <w:spacing w:before="40" w:after="40"/>
+              <w:jc w:val="left"/>
+            </w:pPr>
+            <w:r>
+              <w:rPr>
+                <w:rFonts w:ascii="Calibri" w:hAnsi="Calibri"/>
+                <w:color w:val="111827"/>
+                <w:sz w:val="16"/>
+              </w:rPr>
               <w:t>/applications/white-label-loyalty</w:t>
             </w:r>
           </w:p>
@@ -867,7 +1129,7 @@
         <w:tc>
           <w:tcPr>
             <w:tcW w:type="dxa" w:w="737"/>
-            <w:shd w:val="clear" w:color="auto" w:fill="FFFFFF"/>
+            <w:shd w:val="clear" w:color="auto" w:fill="F3F4F6"/>
           </w:tcPr>
           <w:p>
             <w:pPr>
@@ -887,7 +1149,7 @@
         <w:tc>
           <w:tcPr>
             <w:tcW w:type="dxa" w:w="737"/>
-            <w:shd w:val="clear" w:color="auto" w:fill="FFFFFF"/>
+            <w:shd w:val="clear" w:color="auto" w:fill="F3F4F6"/>
           </w:tcPr>
           <w:p>
             <w:pPr>
@@ -907,7 +1169,7 @@
         <w:tc>
           <w:tcPr>
             <w:tcW w:type="dxa" w:w="680"/>
-            <w:shd w:val="clear" w:color="auto" w:fill="FFFFFF"/>
+            <w:shd w:val="clear" w:color="auto" w:fill="F3F4F6"/>
           </w:tcPr>
           <w:p>
             <w:pPr>
@@ -927,7 +1189,7 @@
         <w:tc>
           <w:tcPr>
             <w:tcW w:type="dxa" w:w="850"/>
-            <w:shd w:val="clear" w:color="auto" w:fill="FFFFFF"/>
+            <w:shd w:val="clear" w:color="auto" w:fill="F3F4F6"/>
           </w:tcPr>
           <w:p>
             <w:pPr>
@@ -947,7 +1209,7 @@
         <w:tc>
           <w:tcPr>
             <w:tcW w:type="dxa" w:w="567"/>
-            <w:shd w:val="clear" w:color="auto" w:fill="FFFFFF"/>
+            <w:shd w:val="clear" w:color="auto" w:fill="F3F4F6"/>
           </w:tcPr>
           <w:p>
             <w:pPr>
@@ -968,7 +1230,7 @@
         <w:tc>
           <w:tcPr>
             <w:tcW w:type="dxa" w:w="680"/>
-            <w:shd w:val="clear" w:color="auto" w:fill="FFFFFF"/>
+            <w:shd w:val="clear" w:color="auto" w:fill="F3F4F6"/>
           </w:tcPr>
           <w:p>
             <w:pPr>
@@ -988,7 +1250,7 @@
         <w:tc>
           <w:tcPr>
             <w:tcW w:type="dxa" w:w="850"/>
-            <w:shd w:val="clear" w:color="auto" w:fill="FFFFFF"/>
+            <w:shd w:val="clear" w:color="auto" w:fill="F3F4F6"/>
           </w:tcPr>
           <w:p>
             <w:pPr>
@@ -1008,7 +1270,7 @@
         <w:tc>
           <w:tcPr>
             <w:tcW w:type="dxa" w:w="567"/>
-            <w:shd w:val="clear" w:color="auto" w:fill="FFFFFF"/>
+            <w:shd w:val="clear" w:color="auto" w:fill="F3F4F6"/>
           </w:tcPr>
           <w:p>
             <w:pPr>
@@ -1028,7 +1290,7 @@
         <w:tc>
           <w:tcPr>
             <w:tcW w:type="dxa" w:w="680"/>
-            <w:shd w:val="clear" w:color="auto" w:fill="FFFFFF"/>
+            <w:shd w:val="clear" w:color="auto" w:fill="F3F4F6"/>
           </w:tcPr>
           <w:p>
             <w:pPr>
@@ -1048,7 +1310,7 @@
         <w:tc>
           <w:tcPr>
             <w:tcW w:type="dxa" w:w="680"/>
-            <w:shd w:val="clear" w:color="auto" w:fill="FFFFFF"/>
+            <w:shd w:val="clear" w:color="auto" w:fill="F3F4F6"/>
           </w:tcPr>
           <w:p>
             <w:pPr>
@@ -1070,7 +1332,7 @@
         <w:tc>
           <w:tcPr>
             <w:tcW w:type="dxa" w:w="283"/>
-            <w:shd w:val="clear" w:color="auto" w:fill="F3F4F6"/>
+            <w:shd w:val="clear" w:color="auto" w:fill="FFFFFF"/>
           </w:tcPr>
           <w:p>
             <w:pPr>
@@ -1090,7 +1352,7 @@
         <w:tc>
           <w:tcPr>
             <w:tcW w:type="dxa" w:w="1701"/>
-            <w:shd w:val="clear" w:color="auto" w:fill="F3F4F6"/>
+            <w:shd w:val="clear" w:color="auto" w:fill="FFFFFF"/>
           </w:tcPr>
           <w:p>
             <w:pPr>
@@ -1110,7 +1372,7 @@
         <w:tc>
           <w:tcPr>
             <w:tcW w:type="dxa" w:w="1587"/>
-            <w:shd w:val="clear" w:color="auto" w:fill="F3F4F6"/>
+            <w:shd w:val="clear" w:color="auto" w:fill="FFFFFF"/>
           </w:tcPr>
           <w:p>
             <w:pPr>
@@ -1130,7 +1392,7 @@
         <w:tc>
           <w:tcPr>
             <w:tcW w:type="dxa" w:w="737"/>
-            <w:shd w:val="clear" w:color="auto" w:fill="F3F4F6"/>
+            <w:shd w:val="clear" w:color="auto" w:fill="FFFFFF"/>
           </w:tcPr>
           <w:p>
             <w:pPr>
@@ -1150,7 +1412,7 @@
         <w:tc>
           <w:tcPr>
             <w:tcW w:type="dxa" w:w="737"/>
-            <w:shd w:val="clear" w:color="auto" w:fill="F3F4F6"/>
+            <w:shd w:val="clear" w:color="auto" w:fill="FFFFFF"/>
           </w:tcPr>
           <w:p>
             <w:pPr>
@@ -1170,7 +1432,7 @@
         <w:tc>
           <w:tcPr>
             <w:tcW w:type="dxa" w:w="680"/>
-            <w:shd w:val="clear" w:color="auto" w:fill="F3F4F6"/>
+            <w:shd w:val="clear" w:color="auto" w:fill="FFFFFF"/>
           </w:tcPr>
           <w:p>
             <w:pPr>
@@ -1190,7 +1452,7 @@
         <w:tc>
           <w:tcPr>
             <w:tcW w:type="dxa" w:w="850"/>
-            <w:shd w:val="clear" w:color="auto" w:fill="F3F4F6"/>
+            <w:shd w:val="clear" w:color="auto" w:fill="FFFFFF"/>
           </w:tcPr>
           <w:p>
             <w:pPr>
@@ -1210,7 +1472,7 @@
         <w:tc>
           <w:tcPr>
             <w:tcW w:type="dxa" w:w="567"/>
-            <w:shd w:val="clear" w:color="auto" w:fill="F3F4F6"/>
+            <w:shd w:val="clear" w:color="auto" w:fill="FFFFFF"/>
           </w:tcPr>
           <w:p>
             <w:pPr>
@@ -1231,6 +1493,108 @@
         <w:tc>
           <w:tcPr>
             <w:tcW w:type="dxa" w:w="680"/>
+            <w:shd w:val="clear" w:color="auto" w:fill="FFFFFF"/>
+          </w:tcPr>
+          <w:p>
+            <w:pPr>
+              <w:spacing w:before="40" w:after="40"/>
+              <w:jc w:val="center"/>
+            </w:pPr>
+            <w:r>
+              <w:rPr>
+                <w:rFonts w:ascii="Calibri" w:hAnsi="Calibri"/>
+                <w:color w:val="111827"/>
+                <w:sz w:val="16"/>
+              </w:rPr>
+              <w:t>0</w:t>
+            </w:r>
+          </w:p>
+        </w:tc>
+        <w:tc>
+          <w:tcPr>
+            <w:tcW w:type="dxa" w:w="850"/>
+            <w:shd w:val="clear" w:color="auto" w:fill="FFFFFF"/>
+          </w:tcPr>
+          <w:p>
+            <w:pPr>
+              <w:spacing w:before="40" w:after="40"/>
+              <w:jc w:val="center"/>
+            </w:pPr>
+            <w:r>
+              <w:rPr>
+                <w:rFonts w:ascii="Calibri" w:hAnsi="Calibri"/>
+                <w:color w:val="111827"/>
+                <w:sz w:val="16"/>
+              </w:rPr>
+              <w:t>0</w:t>
+            </w:r>
+          </w:p>
+        </w:tc>
+        <w:tc>
+          <w:tcPr>
+            <w:tcW w:type="dxa" w:w="567"/>
+            <w:shd w:val="clear" w:color="auto" w:fill="FFFFFF"/>
+          </w:tcPr>
+          <w:p>
+            <w:pPr>
+              <w:spacing w:before="40" w:after="40"/>
+              <w:jc w:val="center"/>
+            </w:pPr>
+            <w:r>
+              <w:rPr>
+                <w:rFonts w:ascii="Calibri" w:hAnsi="Calibri"/>
+                <w:color w:val="059669"/>
+                <w:sz w:val="16"/>
+              </w:rPr>
+              <w:t>0</w:t>
+            </w:r>
+          </w:p>
+        </w:tc>
+        <w:tc>
+          <w:tcPr>
+            <w:tcW w:type="dxa" w:w="680"/>
+            <w:shd w:val="clear" w:color="auto" w:fill="FFFFFF"/>
+          </w:tcPr>
+          <w:p>
+            <w:pPr>
+              <w:spacing w:before="40" w:after="40"/>
+              <w:jc w:val="center"/>
+            </w:pPr>
+            <w:r>
+              <w:rPr>
+                <w:rFonts w:ascii="Calibri" w:hAnsi="Calibri"/>
+                <w:color w:val="111827"/>
+                <w:sz w:val="16"/>
+              </w:rPr>
+              <w:t>32</w:t>
+            </w:r>
+          </w:p>
+        </w:tc>
+        <w:tc>
+          <w:tcPr>
+            <w:tcW w:type="dxa" w:w="680"/>
+            <w:shd w:val="clear" w:color="auto" w:fill="FFFFFF"/>
+          </w:tcPr>
+          <w:p>
+            <w:pPr>
+              <w:spacing w:before="40" w:after="40"/>
+              <w:jc w:val="center"/>
+            </w:pPr>
+            <w:r>
+              <w:rPr>
+                <w:rFonts w:ascii="Calibri" w:hAnsi="Calibri"/>
+                <w:color w:val="111827"/>
+                <w:sz w:val="16"/>
+              </w:rPr>
+              <w:t>20</w:t>
+            </w:r>
+          </w:p>
+        </w:tc>
+      </w:tr>
+      <w:tr>
+        <w:tc>
+          <w:tcPr>
+            <w:tcW w:type="dxa" w:w="283"/>
             <w:shd w:val="clear" w:color="auto" w:fill="F3F4F6"/>
           </w:tcPr>
           <w:p>
@@ -1244,7 +1608,107 @@
                 <w:color w:val="111827"/>
                 <w:sz w:val="16"/>
               </w:rPr>
-              <w:t>0</w:t>
+              <w:t>4</w:t>
+            </w:r>
+          </w:p>
+        </w:tc>
+        <w:tc>
+          <w:tcPr>
+            <w:tcW w:type="dxa" w:w="1701"/>
+            <w:shd w:val="clear" w:color="auto" w:fill="F3F4F6"/>
+          </w:tcPr>
+          <w:p>
+            <w:pPr>
+              <w:spacing w:before="40" w:after="40"/>
+              <w:jc w:val="left"/>
+            </w:pPr>
+            <w:r>
+              <w:rPr>
+                <w:rFonts w:ascii="Calibri" w:hAnsi="Calibri"/>
+                <w:color w:val="111827"/>
+                <w:sz w:val="16"/>
+              </w:rPr>
+              <w:t>loyalty program software</w:t>
+            </w:r>
+          </w:p>
+        </w:tc>
+        <w:tc>
+          <w:tcPr>
+            <w:tcW w:type="dxa" w:w="1587"/>
+            <w:shd w:val="clear" w:color="auto" w:fill="F3F4F6"/>
+          </w:tcPr>
+          <w:p>
+            <w:pPr>
+              <w:spacing w:before="40" w:after="40"/>
+              <w:jc w:val="left"/>
+            </w:pPr>
+            <w:r>
+              <w:rPr>
+                <w:rFonts w:ascii="Calibri" w:hAnsi="Calibri"/>
+                <w:color w:val="111827"/>
+                <w:sz w:val="16"/>
+              </w:rPr>
+              <w:t>/ (homepage)</w:t>
+            </w:r>
+          </w:p>
+        </w:tc>
+        <w:tc>
+          <w:tcPr>
+            <w:tcW w:type="dxa" w:w="737"/>
+            <w:shd w:val="clear" w:color="auto" w:fill="F3F4F6"/>
+          </w:tcPr>
+          <w:p>
+            <w:pPr>
+              <w:spacing w:before="40" w:after="40"/>
+              <w:jc w:val="center"/>
+            </w:pPr>
+            <w:r>
+              <w:rPr>
+                <w:rFonts w:ascii="Calibri" w:hAnsi="Calibri"/>
+                <w:color w:val="111827"/>
+                <w:sz w:val="16"/>
+              </w:rPr>
+              <w:t>4</w:t>
+            </w:r>
+          </w:p>
+        </w:tc>
+        <w:tc>
+          <w:tcPr>
+            <w:tcW w:type="dxa" w:w="737"/>
+            <w:shd w:val="clear" w:color="auto" w:fill="F3F4F6"/>
+          </w:tcPr>
+          <w:p>
+            <w:pPr>
+              <w:spacing w:before="40" w:after="40"/>
+              <w:jc w:val="center"/>
+            </w:pPr>
+            <w:r>
+              <w:rPr>
+                <w:rFonts w:ascii="Calibri" w:hAnsi="Calibri"/>
+                <w:color w:val="111827"/>
+                <w:sz w:val="16"/>
+              </w:rPr>
+              <w:t>12.0</w:t>
+            </w:r>
+          </w:p>
+        </w:tc>
+        <w:tc>
+          <w:tcPr>
+            <w:tcW w:type="dxa" w:w="680"/>
+            <w:shd w:val="clear" w:color="auto" w:fill="F3F4F6"/>
+          </w:tcPr>
+          <w:p>
+            <w:pPr>
+              <w:spacing w:before="40" w:after="40"/>
+              <w:jc w:val="center"/>
+            </w:pPr>
+            <w:r>
+              <w:rPr>
+                <w:rFonts w:ascii="Calibri" w:hAnsi="Calibri"/>
+                <w:color w:val="111827"/>
+                <w:sz w:val="16"/>
+              </w:rPr>
+              <w:t>728</w:t>
             </w:r>
           </w:p>
         </w:tc>
@@ -1264,7 +1728,7 @@
                 <w:color w:val="111827"/>
                 <w:sz w:val="16"/>
               </w:rPr>
-              <w:t>0</w:t>
+              <w:t>179</w:t>
             </w:r>
           </w:p>
         </w:tc>
@@ -1304,7 +1768,47 @@
                 <w:color w:val="111827"/>
                 <w:sz w:val="16"/>
               </w:rPr>
-              <w:t>32</w:t>
+              <w:t>100</w:t>
+            </w:r>
+          </w:p>
+        </w:tc>
+        <w:tc>
+          <w:tcPr>
+            <w:tcW w:type="dxa" w:w="850"/>
+            <w:shd w:val="clear" w:color="auto" w:fill="F3F4F6"/>
+          </w:tcPr>
+          <w:p>
+            <w:pPr>
+              <w:spacing w:before="40" w:after="40"/>
+              <w:jc w:val="center"/>
+            </w:pPr>
+            <w:r>
+              <w:rPr>
+                <w:rFonts w:ascii="Calibri" w:hAnsi="Calibri"/>
+                <w:color w:val="111827"/>
+                <w:sz w:val="16"/>
+              </w:rPr>
+              <w:t>1</w:t>
+            </w:r>
+          </w:p>
+        </w:tc>
+        <w:tc>
+          <w:tcPr>
+            <w:tcW w:type="dxa" w:w="567"/>
+            <w:shd w:val="clear" w:color="auto" w:fill="F3F4F6"/>
+          </w:tcPr>
+          <w:p>
+            <w:pPr>
+              <w:spacing w:before="40" w:after="40"/>
+              <w:jc w:val="center"/>
+            </w:pPr>
+            <w:r>
+              <w:rPr>
+                <w:rFonts w:ascii="Calibri" w:hAnsi="Calibri"/>
+                <w:color w:val="059669"/>
+                <w:sz w:val="16"/>
+              </w:rPr>
+              <w:t>0</w:t>
             </w:r>
           </w:p>
         </w:tc>
@@ -1324,7 +1828,27 @@
                 <w:color w:val="111827"/>
                 <w:sz w:val="16"/>
               </w:rPr>
-              <w:t>20</w:t>
+              <w:t>189</w:t>
+            </w:r>
+          </w:p>
+        </w:tc>
+        <w:tc>
+          <w:tcPr>
+            <w:tcW w:type="dxa" w:w="680"/>
+            <w:shd w:val="clear" w:color="auto" w:fill="F3F4F6"/>
+          </w:tcPr>
+          <w:p>
+            <w:pPr>
+              <w:spacing w:before="40" w:after="40"/>
+              <w:jc w:val="center"/>
+            </w:pPr>
+            <w:r>
+              <w:rPr>
+                <w:rFonts w:ascii="Calibri" w:hAnsi="Calibri"/>
+                <w:color w:val="111827"/>
+                <w:sz w:val="16"/>
+              </w:rPr>
+              <w:t>0</w:t>
             </w:r>
           </w:p>
         </w:tc>
@@ -1346,7 +1870,7 @@
                 <w:color w:val="111827"/>
                 <w:sz w:val="16"/>
               </w:rPr>
-              <w:t>4</w:t>
+              <w:t>5</w:t>
             </w:r>
           </w:p>
         </w:tc>
@@ -1366,7 +1890,7 @@
                 <w:color w:val="111827"/>
                 <w:sz w:val="16"/>
               </w:rPr>
-              <w:t>loyalty program software</w:t>
+              <w:t>customer loyalty program software</w:t>
             </w:r>
           </w:p>
         </w:tc>
@@ -1426,7 +1950,7 @@
                 <w:color w:val="111827"/>
                 <w:sz w:val="16"/>
               </w:rPr>
-              <w:t>12.0</w:t>
+              <w:t>13.7</w:t>
             </w:r>
           </w:p>
         </w:tc>
@@ -1526,7 +2050,7 @@
                 <w:color w:val="111827"/>
                 <w:sz w:val="16"/>
               </w:rPr>
-              <w:t>1</w:t>
+              <w:t>100</w:t>
             </w:r>
           </w:p>
         </w:tc>
@@ -1608,7 +2132,7 @@
                 <w:color w:val="111827"/>
                 <w:sz w:val="16"/>
               </w:rPr>
-              <w:t>5</w:t>
+              <w:t>6</w:t>
             </w:r>
           </w:p>
         </w:tc>
@@ -1628,7 +2152,7 @@
                 <w:color w:val="111827"/>
                 <w:sz w:val="16"/>
               </w:rPr>
-              <w:t>customer loyalty program software</w:t>
+              <w:t>customer loyalty platform</w:t>
             </w:r>
           </w:p>
         </w:tc>
@@ -1648,7 +2172,7 @@
                 <w:color w:val="111827"/>
                 <w:sz w:val="16"/>
               </w:rPr>
-              <w:t>/ (homepage)</w:t>
+              <w:t>/product/reward-management-system</w:t>
             </w:r>
           </w:p>
         </w:tc>
@@ -1668,7 +2192,7 @@
                 <w:color w:val="111827"/>
                 <w:sz w:val="16"/>
               </w:rPr>
-              <w:t>4</w:t>
+              <w:t>not ranking</w:t>
             </w:r>
           </w:p>
         </w:tc>
@@ -1688,7 +2212,7 @@
                 <w:color w:val="111827"/>
                 <w:sz w:val="16"/>
               </w:rPr>
-              <w:t>13.7</w:t>
+              <w:t>12.1</w:t>
             </w:r>
           </w:p>
         </w:tc>
@@ -1708,7 +2232,7 @@
                 <w:color w:val="111827"/>
                 <w:sz w:val="16"/>
               </w:rPr>
-              <w:t>728</w:t>
+              <w:t>0</w:t>
             </w:r>
           </w:p>
         </w:tc>
@@ -1728,7 +2252,7 @@
                 <w:color w:val="111827"/>
                 <w:sz w:val="16"/>
               </w:rPr>
-              <w:t>179</w:t>
+              <w:t>22</w:t>
             </w:r>
           </w:p>
         </w:tc>
@@ -1736,268 +2260,6 @@
           <w:tcPr>
             <w:tcW w:type="dxa" w:w="567"/>
             <w:shd w:val="clear" w:color="auto" w:fill="F3F4F6"/>
-          </w:tcPr>
-          <w:p>
-            <w:pPr>
-              <w:spacing w:before="40" w:after="40"/>
-              <w:jc w:val="center"/>
-            </w:pPr>
-            <w:r>
-              <w:rPr>
-                <w:rFonts w:ascii="Calibri" w:hAnsi="Calibri"/>
-                <w:color w:val="059669"/>
-                <w:sz w:val="16"/>
-              </w:rPr>
-              <w:t>0</w:t>
-            </w:r>
-          </w:p>
-        </w:tc>
-        <w:tc>
-          <w:tcPr>
-            <w:tcW w:type="dxa" w:w="680"/>
-            <w:shd w:val="clear" w:color="auto" w:fill="F3F4F6"/>
-          </w:tcPr>
-          <w:p>
-            <w:pPr>
-              <w:spacing w:before="40" w:after="40"/>
-              <w:jc w:val="center"/>
-            </w:pPr>
-            <w:r>
-              <w:rPr>
-                <w:rFonts w:ascii="Calibri" w:hAnsi="Calibri"/>
-                <w:color w:val="111827"/>
-                <w:sz w:val="16"/>
-              </w:rPr>
-              <w:t>100</w:t>
-            </w:r>
-          </w:p>
-        </w:tc>
-        <w:tc>
-          <w:tcPr>
-            <w:tcW w:type="dxa" w:w="850"/>
-            <w:shd w:val="clear" w:color="auto" w:fill="F3F4F6"/>
-          </w:tcPr>
-          <w:p>
-            <w:pPr>
-              <w:spacing w:before="40" w:after="40"/>
-              <w:jc w:val="center"/>
-            </w:pPr>
-            <w:r>
-              <w:rPr>
-                <w:rFonts w:ascii="Calibri" w:hAnsi="Calibri"/>
-                <w:color w:val="111827"/>
-                <w:sz w:val="16"/>
-              </w:rPr>
-              <w:t>100</w:t>
-            </w:r>
-          </w:p>
-        </w:tc>
-        <w:tc>
-          <w:tcPr>
-            <w:tcW w:type="dxa" w:w="567"/>
-            <w:shd w:val="clear" w:color="auto" w:fill="F3F4F6"/>
-          </w:tcPr>
-          <w:p>
-            <w:pPr>
-              <w:spacing w:before="40" w:after="40"/>
-              <w:jc w:val="center"/>
-            </w:pPr>
-            <w:r>
-              <w:rPr>
-                <w:rFonts w:ascii="Calibri" w:hAnsi="Calibri"/>
-                <w:color w:val="059669"/>
-                <w:sz w:val="16"/>
-              </w:rPr>
-              <w:t>0</w:t>
-            </w:r>
-          </w:p>
-        </w:tc>
-        <w:tc>
-          <w:tcPr>
-            <w:tcW w:type="dxa" w:w="680"/>
-            <w:shd w:val="clear" w:color="auto" w:fill="F3F4F6"/>
-          </w:tcPr>
-          <w:p>
-            <w:pPr>
-              <w:spacing w:before="40" w:after="40"/>
-              <w:jc w:val="center"/>
-            </w:pPr>
-            <w:r>
-              <w:rPr>
-                <w:rFonts w:ascii="Calibri" w:hAnsi="Calibri"/>
-                <w:color w:val="111827"/>
-                <w:sz w:val="16"/>
-              </w:rPr>
-              <w:t>189</w:t>
-            </w:r>
-          </w:p>
-        </w:tc>
-        <w:tc>
-          <w:tcPr>
-            <w:tcW w:type="dxa" w:w="680"/>
-            <w:shd w:val="clear" w:color="auto" w:fill="F3F4F6"/>
-          </w:tcPr>
-          <w:p>
-            <w:pPr>
-              <w:spacing w:before="40" w:after="40"/>
-              <w:jc w:val="center"/>
-            </w:pPr>
-            <w:r>
-              <w:rPr>
-                <w:rFonts w:ascii="Calibri" w:hAnsi="Calibri"/>
-                <w:color w:val="111827"/>
-                <w:sz w:val="16"/>
-              </w:rPr>
-              <w:t>0</w:t>
-            </w:r>
-          </w:p>
-        </w:tc>
-      </w:tr>
-      <w:tr>
-        <w:tc>
-          <w:tcPr>
-            <w:tcW w:type="dxa" w:w="283"/>
-            <w:shd w:val="clear" w:color="auto" w:fill="FFFFFF"/>
-          </w:tcPr>
-          <w:p>
-            <w:pPr>
-              <w:spacing w:before="40" w:after="40"/>
-              <w:jc w:val="center"/>
-            </w:pPr>
-            <w:r>
-              <w:rPr>
-                <w:rFonts w:ascii="Calibri" w:hAnsi="Calibri"/>
-                <w:color w:val="111827"/>
-                <w:sz w:val="16"/>
-              </w:rPr>
-              <w:t>6</w:t>
-            </w:r>
-          </w:p>
-        </w:tc>
-        <w:tc>
-          <w:tcPr>
-            <w:tcW w:type="dxa" w:w="1701"/>
-            <w:shd w:val="clear" w:color="auto" w:fill="FFFFFF"/>
-          </w:tcPr>
-          <w:p>
-            <w:pPr>
-              <w:spacing w:before="40" w:after="40"/>
-              <w:jc w:val="left"/>
-            </w:pPr>
-            <w:r>
-              <w:rPr>
-                <w:rFonts w:ascii="Calibri" w:hAnsi="Calibri"/>
-                <w:color w:val="111827"/>
-                <w:sz w:val="16"/>
-              </w:rPr>
-              <w:t>customer loyalty platform</w:t>
-            </w:r>
-          </w:p>
-        </w:tc>
-        <w:tc>
-          <w:tcPr>
-            <w:tcW w:type="dxa" w:w="1587"/>
-            <w:shd w:val="clear" w:color="auto" w:fill="FFFFFF"/>
-          </w:tcPr>
-          <w:p>
-            <w:pPr>
-              <w:spacing w:before="40" w:after="40"/>
-              <w:jc w:val="left"/>
-            </w:pPr>
-            <w:r>
-              <w:rPr>
-                <w:rFonts w:ascii="Calibri" w:hAnsi="Calibri"/>
-                <w:color w:val="111827"/>
-                <w:sz w:val="16"/>
-              </w:rPr>
-              <w:t>/product/reward-management-system</w:t>
-            </w:r>
-          </w:p>
-        </w:tc>
-        <w:tc>
-          <w:tcPr>
-            <w:tcW w:type="dxa" w:w="737"/>
-            <w:shd w:val="clear" w:color="auto" w:fill="FFFFFF"/>
-          </w:tcPr>
-          <w:p>
-            <w:pPr>
-              <w:spacing w:before="40" w:after="40"/>
-              <w:jc w:val="center"/>
-            </w:pPr>
-            <w:r>
-              <w:rPr>
-                <w:rFonts w:ascii="Calibri" w:hAnsi="Calibri"/>
-                <w:color w:val="111827"/>
-                <w:sz w:val="16"/>
-              </w:rPr>
-              <w:t>not ranking</w:t>
-            </w:r>
-          </w:p>
-        </w:tc>
-        <w:tc>
-          <w:tcPr>
-            <w:tcW w:type="dxa" w:w="737"/>
-            <w:shd w:val="clear" w:color="auto" w:fill="FFFFFF"/>
-          </w:tcPr>
-          <w:p>
-            <w:pPr>
-              <w:spacing w:before="40" w:after="40"/>
-              <w:jc w:val="center"/>
-            </w:pPr>
-            <w:r>
-              <w:rPr>
-                <w:rFonts w:ascii="Calibri" w:hAnsi="Calibri"/>
-                <w:color w:val="111827"/>
-                <w:sz w:val="16"/>
-              </w:rPr>
-              <w:t>12.1</w:t>
-            </w:r>
-          </w:p>
-        </w:tc>
-        <w:tc>
-          <w:tcPr>
-            <w:tcW w:type="dxa" w:w="680"/>
-            <w:shd w:val="clear" w:color="auto" w:fill="FFFFFF"/>
-          </w:tcPr>
-          <w:p>
-            <w:pPr>
-              <w:spacing w:before="40" w:after="40"/>
-              <w:jc w:val="center"/>
-            </w:pPr>
-            <w:r>
-              <w:rPr>
-                <w:rFonts w:ascii="Calibri" w:hAnsi="Calibri"/>
-                <w:color w:val="111827"/>
-                <w:sz w:val="16"/>
-              </w:rPr>
-              <w:t>0</w:t>
-            </w:r>
-          </w:p>
-        </w:tc>
-        <w:tc>
-          <w:tcPr>
-            <w:tcW w:type="dxa" w:w="850"/>
-            <w:shd w:val="clear" w:color="auto" w:fill="FFFFFF"/>
-          </w:tcPr>
-          <w:p>
-            <w:pPr>
-              <w:spacing w:before="40" w:after="40"/>
-              <w:jc w:val="center"/>
-            </w:pPr>
-            <w:r>
-              <w:rPr>
-                <w:rFonts w:ascii="Calibri" w:hAnsi="Calibri"/>
-                <w:color w:val="111827"/>
-                <w:sz w:val="16"/>
-              </w:rPr>
-              <w:t>22</w:t>
-            </w:r>
-          </w:p>
-        </w:tc>
-        <w:tc>
-          <w:tcPr>
-            <w:tcW w:type="dxa" w:w="567"/>
-            <w:shd w:val="clear" w:color="auto" w:fill="FFFFFF"/>
           </w:tcPr>
           <w:p>
             <w:pPr>
@@ -2018,7 +2280,7 @@
         <w:tc>
           <w:tcPr>
             <w:tcW w:type="dxa" w:w="680"/>
-            <w:shd w:val="clear" w:color="auto" w:fill="FFFFFF"/>
+            <w:shd w:val="clear" w:color="auto" w:fill="F3F4F6"/>
           </w:tcPr>
           <w:p>
             <w:pPr>
@@ -2038,7 +2300,7 @@
         <w:tc>
           <w:tcPr>
             <w:tcW w:type="dxa" w:w="850"/>
-            <w:shd w:val="clear" w:color="auto" w:fill="FFFFFF"/>
+            <w:shd w:val="clear" w:color="auto" w:fill="F3F4F6"/>
           </w:tcPr>
           <w:p>
             <w:pPr>
@@ -2058,7 +2320,7 @@
         <w:tc>
           <w:tcPr>
             <w:tcW w:type="dxa" w:w="567"/>
-            <w:shd w:val="clear" w:color="auto" w:fill="FFFFFF"/>
+            <w:shd w:val="clear" w:color="auto" w:fill="F3F4F6"/>
           </w:tcPr>
           <w:p>
             <w:pPr>
@@ -2078,7 +2340,7 @@
         <w:tc>
           <w:tcPr>
             <w:tcW w:type="dxa" w:w="680"/>
-            <w:shd w:val="clear" w:color="auto" w:fill="FFFFFF"/>
+            <w:shd w:val="clear" w:color="auto" w:fill="F3F4F6"/>
           </w:tcPr>
           <w:p>
             <w:pPr>
@@ -2098,7 +2360,7 @@
         <w:tc>
           <w:tcPr>
             <w:tcW w:type="dxa" w:w="680"/>
-            <w:shd w:val="clear" w:color="auto" w:fill="FFFFFF"/>
+            <w:shd w:val="clear" w:color="auto" w:fill="F3F4F6"/>
           </w:tcPr>
           <w:p>
             <w:pPr>
@@ -2120,6 +2382,268 @@
         <w:tc>
           <w:tcPr>
             <w:tcW w:type="dxa" w:w="283"/>
+            <w:shd w:val="clear" w:color="auto" w:fill="FFFFFF"/>
+          </w:tcPr>
+          <w:p>
+            <w:pPr>
+              <w:spacing w:before="40" w:after="40"/>
+              <w:jc w:val="center"/>
+            </w:pPr>
+            <w:r>
+              <w:rPr>
+                <w:rFonts w:ascii="Calibri" w:hAnsi="Calibri"/>
+                <w:color w:val="111827"/>
+                <w:sz w:val="16"/>
+              </w:rPr>
+              <w:t>7</w:t>
+            </w:r>
+          </w:p>
+        </w:tc>
+        <w:tc>
+          <w:tcPr>
+            <w:tcW w:type="dxa" w:w="1701"/>
+            <w:shd w:val="clear" w:color="auto" w:fill="FFFFFF"/>
+          </w:tcPr>
+          <w:p>
+            <w:pPr>
+              <w:spacing w:before="40" w:after="40"/>
+              <w:jc w:val="left"/>
+            </w:pPr>
+            <w:r>
+              <w:rPr>
+                <w:rFonts w:ascii="Calibri" w:hAnsi="Calibri"/>
+                <w:color w:val="111827"/>
+                <w:sz w:val="16"/>
+              </w:rPr>
+              <w:t>loyalty system</w:t>
+            </w:r>
+          </w:p>
+        </w:tc>
+        <w:tc>
+          <w:tcPr>
+            <w:tcW w:type="dxa" w:w="1587"/>
+            <w:shd w:val="clear" w:color="auto" w:fill="FFFFFF"/>
+          </w:tcPr>
+          <w:p>
+            <w:pPr>
+              <w:spacing w:before="40" w:after="40"/>
+              <w:jc w:val="left"/>
+            </w:pPr>
+            <w:r>
+              <w:rPr>
+                <w:rFonts w:ascii="Calibri" w:hAnsi="Calibri"/>
+                <w:color w:val="111827"/>
+                <w:sz w:val="16"/>
+              </w:rPr>
+              <w:t>/ (homepage)</w:t>
+            </w:r>
+          </w:p>
+        </w:tc>
+        <w:tc>
+          <w:tcPr>
+            <w:tcW w:type="dxa" w:w="737"/>
+            <w:shd w:val="clear" w:color="auto" w:fill="FFFFFF"/>
+          </w:tcPr>
+          <w:p>
+            <w:pPr>
+              <w:spacing w:before="40" w:after="40"/>
+              <w:jc w:val="center"/>
+            </w:pPr>
+            <w:r>
+              <w:rPr>
+                <w:rFonts w:ascii="Calibri" w:hAnsi="Calibri"/>
+                <w:color w:val="111827"/>
+                <w:sz w:val="16"/>
+              </w:rPr>
+              <w:t>4</w:t>
+            </w:r>
+          </w:p>
+        </w:tc>
+        <w:tc>
+          <w:tcPr>
+            <w:tcW w:type="dxa" w:w="737"/>
+            <w:shd w:val="clear" w:color="auto" w:fill="FFFFFF"/>
+          </w:tcPr>
+          <w:p>
+            <w:pPr>
+              <w:spacing w:before="40" w:after="40"/>
+              <w:jc w:val="center"/>
+            </w:pPr>
+            <w:r>
+              <w:rPr>
+                <w:rFonts w:ascii="Calibri" w:hAnsi="Calibri"/>
+                <w:color w:val="111827"/>
+                <w:sz w:val="16"/>
+              </w:rPr>
+              <w:t>14.4</w:t>
+            </w:r>
+          </w:p>
+        </w:tc>
+        <w:tc>
+          <w:tcPr>
+            <w:tcW w:type="dxa" w:w="680"/>
+            <w:shd w:val="clear" w:color="auto" w:fill="FFFFFF"/>
+          </w:tcPr>
+          <w:p>
+            <w:pPr>
+              <w:spacing w:before="40" w:after="40"/>
+              <w:jc w:val="center"/>
+            </w:pPr>
+            <w:r>
+              <w:rPr>
+                <w:rFonts w:ascii="Calibri" w:hAnsi="Calibri"/>
+                <w:color w:val="111827"/>
+                <w:sz w:val="16"/>
+              </w:rPr>
+              <w:t>728</w:t>
+            </w:r>
+          </w:p>
+        </w:tc>
+        <w:tc>
+          <w:tcPr>
+            <w:tcW w:type="dxa" w:w="850"/>
+            <w:shd w:val="clear" w:color="auto" w:fill="FFFFFF"/>
+          </w:tcPr>
+          <w:p>
+            <w:pPr>
+              <w:spacing w:before="40" w:after="40"/>
+              <w:jc w:val="center"/>
+            </w:pPr>
+            <w:r>
+              <w:rPr>
+                <w:rFonts w:ascii="Calibri" w:hAnsi="Calibri"/>
+                <w:color w:val="111827"/>
+                <w:sz w:val="16"/>
+              </w:rPr>
+              <w:t>491</w:t>
+            </w:r>
+          </w:p>
+        </w:tc>
+        <w:tc>
+          <w:tcPr>
+            <w:tcW w:type="dxa" w:w="567"/>
+            <w:shd w:val="clear" w:color="auto" w:fill="FFFFFF"/>
+          </w:tcPr>
+          <w:p>
+            <w:pPr>
+              <w:spacing w:before="40" w:after="40"/>
+              <w:jc w:val="center"/>
+            </w:pPr>
+            <w:r>
+              <w:rPr>
+                <w:rFonts w:ascii="Calibri" w:hAnsi="Calibri"/>
+                <w:color w:val="059669"/>
+                <w:sz w:val="16"/>
+              </w:rPr>
+              <w:t>0</w:t>
+            </w:r>
+          </w:p>
+        </w:tc>
+        <w:tc>
+          <w:tcPr>
+            <w:tcW w:type="dxa" w:w="680"/>
+            <w:shd w:val="clear" w:color="auto" w:fill="FFFFFF"/>
+          </w:tcPr>
+          <w:p>
+            <w:pPr>
+              <w:spacing w:before="40" w:after="40"/>
+              <w:jc w:val="center"/>
+            </w:pPr>
+            <w:r>
+              <w:rPr>
+                <w:rFonts w:ascii="Calibri" w:hAnsi="Calibri"/>
+                <w:color w:val="111827"/>
+                <w:sz w:val="16"/>
+              </w:rPr>
+              <w:t>100</w:t>
+            </w:r>
+          </w:p>
+        </w:tc>
+        <w:tc>
+          <w:tcPr>
+            <w:tcW w:type="dxa" w:w="850"/>
+            <w:shd w:val="clear" w:color="auto" w:fill="FFFFFF"/>
+          </w:tcPr>
+          <w:p>
+            <w:pPr>
+              <w:spacing w:before="40" w:after="40"/>
+              <w:jc w:val="center"/>
+            </w:pPr>
+            <w:r>
+              <w:rPr>
+                <w:rFonts w:ascii="Calibri" w:hAnsi="Calibri"/>
+                <w:color w:val="111827"/>
+                <w:sz w:val="16"/>
+              </w:rPr>
+              <w:t>100</w:t>
+            </w:r>
+          </w:p>
+        </w:tc>
+        <w:tc>
+          <w:tcPr>
+            <w:tcW w:type="dxa" w:w="567"/>
+            <w:shd w:val="clear" w:color="auto" w:fill="FFFFFF"/>
+          </w:tcPr>
+          <w:p>
+            <w:pPr>
+              <w:spacing w:before="40" w:after="40"/>
+              <w:jc w:val="center"/>
+            </w:pPr>
+            <w:r>
+              <w:rPr>
+                <w:rFonts w:ascii="Calibri" w:hAnsi="Calibri"/>
+                <w:color w:val="059669"/>
+                <w:sz w:val="16"/>
+              </w:rPr>
+              <w:t>0</w:t>
+            </w:r>
+          </w:p>
+        </w:tc>
+        <w:tc>
+          <w:tcPr>
+            <w:tcW w:type="dxa" w:w="680"/>
+            <w:shd w:val="clear" w:color="auto" w:fill="FFFFFF"/>
+          </w:tcPr>
+          <w:p>
+            <w:pPr>
+              <w:spacing w:before="40" w:after="40"/>
+              <w:jc w:val="center"/>
+            </w:pPr>
+            <w:r>
+              <w:rPr>
+                <w:rFonts w:ascii="Calibri" w:hAnsi="Calibri"/>
+                <w:color w:val="111827"/>
+                <w:sz w:val="16"/>
+              </w:rPr>
+              <w:t>501</w:t>
+            </w:r>
+          </w:p>
+        </w:tc>
+        <w:tc>
+          <w:tcPr>
+            <w:tcW w:type="dxa" w:w="680"/>
+            <w:shd w:val="clear" w:color="auto" w:fill="FFFFFF"/>
+          </w:tcPr>
+          <w:p>
+            <w:pPr>
+              <w:spacing w:before="40" w:after="40"/>
+              <w:jc w:val="center"/>
+            </w:pPr>
+            <w:r>
+              <w:rPr>
+                <w:rFonts w:ascii="Calibri" w:hAnsi="Calibri"/>
+                <w:color w:val="111827"/>
+                <w:sz w:val="16"/>
+              </w:rPr>
+              <w:t>0</w:t>
+            </w:r>
+          </w:p>
+        </w:tc>
+      </w:tr>
+      <w:tr>
+        <w:tc>
+          <w:tcPr>
+            <w:tcW w:type="dxa" w:w="283"/>
             <w:shd w:val="clear" w:color="auto" w:fill="F3F4F6"/>
           </w:tcPr>
           <w:p>
@@ -2133,7 +2657,7 @@
                 <w:color w:val="111827"/>
                 <w:sz w:val="16"/>
               </w:rPr>
-              <w:t>7</w:t>
+              <w:t>8</w:t>
             </w:r>
           </w:p>
         </w:tc>
@@ -2153,7 +2677,7 @@
                 <w:color w:val="111827"/>
                 <w:sz w:val="16"/>
               </w:rPr>
-              <w:t>loyalty system</w:t>
+              <w:t>loyalty program api</w:t>
             </w:r>
           </w:p>
         </w:tc>
@@ -2173,7 +2697,7 @@
                 <w:color w:val="111827"/>
                 <w:sz w:val="16"/>
               </w:rPr>
-              <w:t>/ (homepage)</w:t>
+              <w:t>/technology/loyalty-program-api</w:t>
             </w:r>
           </w:p>
         </w:tc>
@@ -2193,7 +2717,7 @@
                 <w:color w:val="111827"/>
                 <w:sz w:val="16"/>
               </w:rPr>
-              <w:t>4</w:t>
+              <w:t>2</w:t>
             </w:r>
           </w:p>
         </w:tc>
@@ -2213,7 +2737,7 @@
                 <w:color w:val="111827"/>
                 <w:sz w:val="16"/>
               </w:rPr>
-              <w:t>14.4</w:t>
+              <w:t>17.1</w:t>
             </w:r>
           </w:p>
         </w:tc>
@@ -2233,7 +2757,7 @@
                 <w:color w:val="111827"/>
                 <w:sz w:val="16"/>
               </w:rPr>
-              <w:t>728</w:t>
+              <w:t>0</w:t>
             </w:r>
           </w:p>
         </w:tc>
@@ -2253,7 +2777,7 @@
                 <w:color w:val="111827"/>
                 <w:sz w:val="16"/>
               </w:rPr>
-              <w:t>491</w:t>
+              <w:t>12</w:t>
             </w:r>
           </w:p>
         </w:tc>
@@ -2261,268 +2785,6 @@
           <w:tcPr>
             <w:tcW w:type="dxa" w:w="567"/>
             <w:shd w:val="clear" w:color="auto" w:fill="F3F4F6"/>
-          </w:tcPr>
-          <w:p>
-            <w:pPr>
-              <w:spacing w:before="40" w:after="40"/>
-              <w:jc w:val="center"/>
-            </w:pPr>
-            <w:r>
-              <w:rPr>
-                <w:rFonts w:ascii="Calibri" w:hAnsi="Calibri"/>
-                <w:color w:val="059669"/>
-                <w:sz w:val="16"/>
-              </w:rPr>
-              <w:t>0</w:t>
-            </w:r>
-          </w:p>
-        </w:tc>
-        <w:tc>
-          <w:tcPr>
-            <w:tcW w:type="dxa" w:w="680"/>
-            <w:shd w:val="clear" w:color="auto" w:fill="F3F4F6"/>
-          </w:tcPr>
-          <w:p>
-            <w:pPr>
-              <w:spacing w:before="40" w:after="40"/>
-              <w:jc w:val="center"/>
-            </w:pPr>
-            <w:r>
-              <w:rPr>
-                <w:rFonts w:ascii="Calibri" w:hAnsi="Calibri"/>
-                <w:color w:val="111827"/>
-                <w:sz w:val="16"/>
-              </w:rPr>
-              <w:t>100</w:t>
-            </w:r>
-          </w:p>
-        </w:tc>
-        <w:tc>
-          <w:tcPr>
-            <w:tcW w:type="dxa" w:w="850"/>
-            <w:shd w:val="clear" w:color="auto" w:fill="F3F4F6"/>
-          </w:tcPr>
-          <w:p>
-            <w:pPr>
-              <w:spacing w:before="40" w:after="40"/>
-              <w:jc w:val="center"/>
-            </w:pPr>
-            <w:r>
-              <w:rPr>
-                <w:rFonts w:ascii="Calibri" w:hAnsi="Calibri"/>
-                <w:color w:val="111827"/>
-                <w:sz w:val="16"/>
-              </w:rPr>
-              <w:t>100</w:t>
-            </w:r>
-          </w:p>
-        </w:tc>
-        <w:tc>
-          <w:tcPr>
-            <w:tcW w:type="dxa" w:w="567"/>
-            <w:shd w:val="clear" w:color="auto" w:fill="F3F4F6"/>
-          </w:tcPr>
-          <w:p>
-            <w:pPr>
-              <w:spacing w:before="40" w:after="40"/>
-              <w:jc w:val="center"/>
-            </w:pPr>
-            <w:r>
-              <w:rPr>
-                <w:rFonts w:ascii="Calibri" w:hAnsi="Calibri"/>
-                <w:color w:val="059669"/>
-                <w:sz w:val="16"/>
-              </w:rPr>
-              <w:t>0</w:t>
-            </w:r>
-          </w:p>
-        </w:tc>
-        <w:tc>
-          <w:tcPr>
-            <w:tcW w:type="dxa" w:w="680"/>
-            <w:shd w:val="clear" w:color="auto" w:fill="F3F4F6"/>
-          </w:tcPr>
-          <w:p>
-            <w:pPr>
-              <w:spacing w:before="40" w:after="40"/>
-              <w:jc w:val="center"/>
-            </w:pPr>
-            <w:r>
-              <w:rPr>
-                <w:rFonts w:ascii="Calibri" w:hAnsi="Calibri"/>
-                <w:color w:val="111827"/>
-                <w:sz w:val="16"/>
-              </w:rPr>
-              <w:t>501</w:t>
-            </w:r>
-          </w:p>
-        </w:tc>
-        <w:tc>
-          <w:tcPr>
-            <w:tcW w:type="dxa" w:w="680"/>
-            <w:shd w:val="clear" w:color="auto" w:fill="F3F4F6"/>
-          </w:tcPr>
-          <w:p>
-            <w:pPr>
-              <w:spacing w:before="40" w:after="40"/>
-              <w:jc w:val="center"/>
-            </w:pPr>
-            <w:r>
-              <w:rPr>
-                <w:rFonts w:ascii="Calibri" w:hAnsi="Calibri"/>
-                <w:color w:val="111827"/>
-                <w:sz w:val="16"/>
-              </w:rPr>
-              <w:t>0</w:t>
-            </w:r>
-          </w:p>
-        </w:tc>
-      </w:tr>
-      <w:tr>
-        <w:tc>
-          <w:tcPr>
-            <w:tcW w:type="dxa" w:w="283"/>
-            <w:shd w:val="clear" w:color="auto" w:fill="FFFFFF"/>
-          </w:tcPr>
-          <w:p>
-            <w:pPr>
-              <w:spacing w:before="40" w:after="40"/>
-              <w:jc w:val="center"/>
-            </w:pPr>
-            <w:r>
-              <w:rPr>
-                <w:rFonts w:ascii="Calibri" w:hAnsi="Calibri"/>
-                <w:color w:val="111827"/>
-                <w:sz w:val="16"/>
-              </w:rPr>
-              <w:t>8</w:t>
-            </w:r>
-          </w:p>
-        </w:tc>
-        <w:tc>
-          <w:tcPr>
-            <w:tcW w:type="dxa" w:w="1701"/>
-            <w:shd w:val="clear" w:color="auto" w:fill="FFFFFF"/>
-          </w:tcPr>
-          <w:p>
-            <w:pPr>
-              <w:spacing w:before="40" w:after="40"/>
-              <w:jc w:val="left"/>
-            </w:pPr>
-            <w:r>
-              <w:rPr>
-                <w:rFonts w:ascii="Calibri" w:hAnsi="Calibri"/>
-                <w:color w:val="111827"/>
-                <w:sz w:val="16"/>
-              </w:rPr>
-              <w:t>loyalty program api</w:t>
-            </w:r>
-          </w:p>
-        </w:tc>
-        <w:tc>
-          <w:tcPr>
-            <w:tcW w:type="dxa" w:w="1587"/>
-            <w:shd w:val="clear" w:color="auto" w:fill="FFFFFF"/>
-          </w:tcPr>
-          <w:p>
-            <w:pPr>
-              <w:spacing w:before="40" w:after="40"/>
-              <w:jc w:val="left"/>
-            </w:pPr>
-            <w:r>
-              <w:rPr>
-                <w:rFonts w:ascii="Calibri" w:hAnsi="Calibri"/>
-                <w:color w:val="111827"/>
-                <w:sz w:val="16"/>
-              </w:rPr>
-              <w:t>/technology/loyalty-program-api</w:t>
-            </w:r>
-          </w:p>
-        </w:tc>
-        <w:tc>
-          <w:tcPr>
-            <w:tcW w:type="dxa" w:w="737"/>
-            <w:shd w:val="clear" w:color="auto" w:fill="FFFFFF"/>
-          </w:tcPr>
-          <w:p>
-            <w:pPr>
-              <w:spacing w:before="40" w:after="40"/>
-              <w:jc w:val="center"/>
-            </w:pPr>
-            <w:r>
-              <w:rPr>
-                <w:rFonts w:ascii="Calibri" w:hAnsi="Calibri"/>
-                <w:color w:val="111827"/>
-                <w:sz w:val="16"/>
-              </w:rPr>
-              <w:t>2</w:t>
-            </w:r>
-          </w:p>
-        </w:tc>
-        <w:tc>
-          <w:tcPr>
-            <w:tcW w:type="dxa" w:w="737"/>
-            <w:shd w:val="clear" w:color="auto" w:fill="FFFFFF"/>
-          </w:tcPr>
-          <w:p>
-            <w:pPr>
-              <w:spacing w:before="40" w:after="40"/>
-              <w:jc w:val="center"/>
-            </w:pPr>
-            <w:r>
-              <w:rPr>
-                <w:rFonts w:ascii="Calibri" w:hAnsi="Calibri"/>
-                <w:color w:val="111827"/>
-                <w:sz w:val="16"/>
-              </w:rPr>
-              <w:t>17.1</w:t>
-            </w:r>
-          </w:p>
-        </w:tc>
-        <w:tc>
-          <w:tcPr>
-            <w:tcW w:type="dxa" w:w="680"/>
-            <w:shd w:val="clear" w:color="auto" w:fill="FFFFFF"/>
-          </w:tcPr>
-          <w:p>
-            <w:pPr>
-              <w:spacing w:before="40" w:after="40"/>
-              <w:jc w:val="center"/>
-            </w:pPr>
-            <w:r>
-              <w:rPr>
-                <w:rFonts w:ascii="Calibri" w:hAnsi="Calibri"/>
-                <w:color w:val="111827"/>
-                <w:sz w:val="16"/>
-              </w:rPr>
-              <w:t>0</w:t>
-            </w:r>
-          </w:p>
-        </w:tc>
-        <w:tc>
-          <w:tcPr>
-            <w:tcW w:type="dxa" w:w="850"/>
-            <w:shd w:val="clear" w:color="auto" w:fill="FFFFFF"/>
-          </w:tcPr>
-          <w:p>
-            <w:pPr>
-              <w:spacing w:before="40" w:after="40"/>
-              <w:jc w:val="center"/>
-            </w:pPr>
-            <w:r>
-              <w:rPr>
-                <w:rFonts w:ascii="Calibri" w:hAnsi="Calibri"/>
-                <w:color w:val="111827"/>
-                <w:sz w:val="16"/>
-              </w:rPr>
-              <w:t>12</w:t>
-            </w:r>
-          </w:p>
-        </w:tc>
-        <w:tc>
-          <w:tcPr>
-            <w:tcW w:type="dxa" w:w="567"/>
-            <w:shd w:val="clear" w:color="auto" w:fill="FFFFFF"/>
           </w:tcPr>
           <w:p>
             <w:pPr>
@@ -2543,7 +2805,7 @@
         <w:tc>
           <w:tcPr>
             <w:tcW w:type="dxa" w:w="680"/>
-            <w:shd w:val="clear" w:color="auto" w:fill="FFFFFF"/>
+            <w:shd w:val="clear" w:color="auto" w:fill="F3F4F6"/>
           </w:tcPr>
           <w:p>
             <w:pPr>
@@ -2563,7 +2825,7 @@
         <w:tc>
           <w:tcPr>
             <w:tcW w:type="dxa" w:w="850"/>
-            <w:shd w:val="clear" w:color="auto" w:fill="FFFFFF"/>
+            <w:shd w:val="clear" w:color="auto" w:fill="F3F4F6"/>
           </w:tcPr>
           <w:p>
             <w:pPr>
@@ -2583,7 +2845,7 @@
         <w:tc>
           <w:tcPr>
             <w:tcW w:type="dxa" w:w="567"/>
-            <w:shd w:val="clear" w:color="auto" w:fill="FFFFFF"/>
+            <w:shd w:val="clear" w:color="auto" w:fill="F3F4F6"/>
           </w:tcPr>
           <w:p>
             <w:pPr>
@@ -2603,7 +2865,7 @@
         <w:tc>
           <w:tcPr>
             <w:tcW w:type="dxa" w:w="680"/>
-            <w:shd w:val="clear" w:color="auto" w:fill="FFFFFF"/>
+            <w:shd w:val="clear" w:color="auto" w:fill="F3F4F6"/>
           </w:tcPr>
           <w:p>
             <w:pPr>
@@ -2623,7 +2885,7 @@
         <w:tc>
           <w:tcPr>
             <w:tcW w:type="dxa" w:w="680"/>
-            <w:shd w:val="clear" w:color="auto" w:fill="FFFFFF"/>
+            <w:shd w:val="clear" w:color="auto" w:fill="F3F4F6"/>
           </w:tcPr>
           <w:p>
             <w:pPr>
@@ -2645,7 +2907,7 @@
         <w:tc>
           <w:tcPr>
             <w:tcW w:type="dxa" w:w="283"/>
-            <w:shd w:val="clear" w:color="auto" w:fill="F3F4F6"/>
+            <w:shd w:val="clear" w:color="auto" w:fill="FFFFFF"/>
           </w:tcPr>
           <w:p>
             <w:pPr>
@@ -2665,7 +2927,7 @@
         <w:tc>
           <w:tcPr>
             <w:tcW w:type="dxa" w:w="1701"/>
-            <w:shd w:val="clear" w:color="auto" w:fill="F3F4F6"/>
+            <w:shd w:val="clear" w:color="auto" w:fill="FFFFFF"/>
           </w:tcPr>
           <w:p>
             <w:pPr>
@@ -2685,7 +2947,7 @@
         <w:tc>
           <w:tcPr>
             <w:tcW w:type="dxa" w:w="1587"/>
-            <w:shd w:val="clear" w:color="auto" w:fill="F3F4F6"/>
+            <w:shd w:val="clear" w:color="auto" w:fill="FFFFFF"/>
           </w:tcPr>
           <w:p>
             <w:pPr>
@@ -2705,7 +2967,7 @@
         <w:tc>
           <w:tcPr>
             <w:tcW w:type="dxa" w:w="737"/>
-            <w:shd w:val="clear" w:color="auto" w:fill="F3F4F6"/>
+            <w:shd w:val="clear" w:color="auto" w:fill="FFFFFF"/>
           </w:tcPr>
           <w:p>
             <w:pPr>
@@ -2725,7 +2987,7 @@
         <w:tc>
           <w:tcPr>
             <w:tcW w:type="dxa" w:w="737"/>
-            <w:shd w:val="clear" w:color="auto" w:fill="F3F4F6"/>
+            <w:shd w:val="clear" w:color="auto" w:fill="FFFFFF"/>
           </w:tcPr>
           <w:p>
             <w:pPr>
@@ -2745,7 +3007,7 @@
         <w:tc>
           <w:tcPr>
             <w:tcW w:type="dxa" w:w="680"/>
-            <w:shd w:val="clear" w:color="auto" w:fill="F3F4F6"/>
+            <w:shd w:val="clear" w:color="auto" w:fill="FFFFFF"/>
           </w:tcPr>
           <w:p>
             <w:pPr>
@@ -2765,7 +3027,7 @@
         <w:tc>
           <w:tcPr>
             <w:tcW w:type="dxa" w:w="850"/>
-            <w:shd w:val="clear" w:color="auto" w:fill="F3F4F6"/>
+            <w:shd w:val="clear" w:color="auto" w:fill="FFFFFF"/>
           </w:tcPr>
           <w:p>
             <w:pPr>
@@ -2785,7 +3047,7 @@
         <w:tc>
           <w:tcPr>
             <w:tcW w:type="dxa" w:w="567"/>
-            <w:shd w:val="clear" w:color="auto" w:fill="F3F4F6"/>
+            <w:shd w:val="clear" w:color="auto" w:fill="FFFFFF"/>
           </w:tcPr>
           <w:p>
             <w:pPr>
@@ -2806,6 +3068,208 @@
         <w:tc>
           <w:tcPr>
             <w:tcW w:type="dxa" w:w="680"/>
+            <w:shd w:val="clear" w:color="auto" w:fill="FFFFFF"/>
+          </w:tcPr>
+          <w:p>
+            <w:pPr>
+              <w:spacing w:before="40" w:after="40"/>
+              <w:jc w:val="center"/>
+            </w:pPr>
+            <w:r>
+              <w:rPr>
+                <w:rFonts w:ascii="Calibri" w:hAnsi="Calibri"/>
+                <w:color w:val="111827"/>
+                <w:sz w:val="16"/>
+              </w:rPr>
+              <w:t>0</w:t>
+            </w:r>
+          </w:p>
+        </w:tc>
+        <w:tc>
+          <w:tcPr>
+            <w:tcW w:type="dxa" w:w="850"/>
+            <w:shd w:val="clear" w:color="auto" w:fill="FFFFFF"/>
+          </w:tcPr>
+          <w:p>
+            <w:pPr>
+              <w:spacing w:before="40" w:after="40"/>
+              <w:jc w:val="center"/>
+            </w:pPr>
+            <w:r>
+              <w:rPr>
+                <w:rFonts w:ascii="Calibri" w:hAnsi="Calibri"/>
+                <w:color w:val="111827"/>
+                <w:sz w:val="16"/>
+              </w:rPr>
+              <w:t>0</w:t>
+            </w:r>
+          </w:p>
+        </w:tc>
+        <w:tc>
+          <w:tcPr>
+            <w:tcW w:type="dxa" w:w="567"/>
+            <w:shd w:val="clear" w:color="auto" w:fill="FFFFFF"/>
+          </w:tcPr>
+          <w:p>
+            <w:pPr>
+              <w:spacing w:before="40" w:after="40"/>
+              <w:jc w:val="center"/>
+            </w:pPr>
+            <w:r>
+              <w:rPr>
+                <w:rFonts w:ascii="Calibri" w:hAnsi="Calibri"/>
+                <w:color w:val="059669"/>
+                <w:sz w:val="16"/>
+              </w:rPr>
+              <w:t>0</w:t>
+            </w:r>
+          </w:p>
+        </w:tc>
+        <w:tc>
+          <w:tcPr>
+            <w:tcW w:type="dxa" w:w="680"/>
+            <w:shd w:val="clear" w:color="auto" w:fill="FFFFFF"/>
+          </w:tcPr>
+          <w:p>
+            <w:pPr>
+              <w:spacing w:before="40" w:after="40"/>
+              <w:jc w:val="center"/>
+            </w:pPr>
+            <w:r>
+              <w:rPr>
+                <w:rFonts w:ascii="Calibri" w:hAnsi="Calibri"/>
+                <w:color w:val="111827"/>
+                <w:sz w:val="16"/>
+              </w:rPr>
+              <w:t>19</w:t>
+            </w:r>
+          </w:p>
+        </w:tc>
+        <w:tc>
+          <w:tcPr>
+            <w:tcW w:type="dxa" w:w="680"/>
+            <w:shd w:val="clear" w:color="auto" w:fill="FFFFFF"/>
+          </w:tcPr>
+          <w:p>
+            <w:pPr>
+              <w:spacing w:before="40" w:after="40"/>
+              <w:jc w:val="center"/>
+            </w:pPr>
+            <w:r>
+              <w:rPr>
+                <w:rFonts w:ascii="Calibri" w:hAnsi="Calibri"/>
+                <w:color w:val="111827"/>
+                <w:sz w:val="16"/>
+              </w:rPr>
+              <w:t>9</w:t>
+            </w:r>
+          </w:p>
+        </w:tc>
+      </w:tr>
+      <w:tr>
+        <w:tc>
+          <w:tcPr>
+            <w:tcW w:type="dxa" w:w="283"/>
+            <w:shd w:val="clear" w:color="auto" w:fill="F3F4F6"/>
+          </w:tcPr>
+          <w:p>
+            <w:pPr>
+              <w:spacing w:before="40" w:after="40"/>
+              <w:jc w:val="center"/>
+            </w:pPr>
+            <w:r>
+              <w:rPr>
+                <w:rFonts w:ascii="Calibri" w:hAnsi="Calibri"/>
+                <w:color w:val="111827"/>
+                <w:sz w:val="16"/>
+              </w:rPr>
+              <w:t>10</w:t>
+            </w:r>
+          </w:p>
+        </w:tc>
+        <w:tc>
+          <w:tcPr>
+            <w:tcW w:type="dxa" w:w="1701"/>
+            <w:shd w:val="clear" w:color="auto" w:fill="F3F4F6"/>
+          </w:tcPr>
+          <w:p>
+            <w:pPr>
+              <w:spacing w:before="40" w:after="40"/>
+              <w:jc w:val="left"/>
+            </w:pPr>
+            <w:r>
+              <w:rPr>
+                <w:rFonts w:ascii="Calibri" w:hAnsi="Calibri"/>
+                <w:color w:val="111827"/>
+                <w:sz w:val="16"/>
+              </w:rPr>
+              <w:t>loyalty points</w:t>
+            </w:r>
+          </w:p>
+        </w:tc>
+        <w:tc>
+          <w:tcPr>
+            <w:tcW w:type="dxa" w:w="1587"/>
+            <w:shd w:val="clear" w:color="auto" w:fill="F3F4F6"/>
+          </w:tcPr>
+          <w:p>
+            <w:pPr>
+              <w:spacing w:before="40" w:after="40"/>
+              <w:jc w:val="left"/>
+            </w:pPr>
+            <w:r>
+              <w:rPr>
+                <w:rFonts w:ascii="Calibri" w:hAnsi="Calibri"/>
+                <w:color w:val="111827"/>
+                <w:sz w:val="16"/>
+              </w:rPr>
+              <w:t>/product/loyalty-points-system</w:t>
+            </w:r>
+          </w:p>
+        </w:tc>
+        <w:tc>
+          <w:tcPr>
+            <w:tcW w:type="dxa" w:w="737"/>
+            <w:shd w:val="clear" w:color="auto" w:fill="F3F4F6"/>
+          </w:tcPr>
+          <w:p>
+            <w:pPr>
+              <w:spacing w:before="40" w:after="40"/>
+              <w:jc w:val="center"/>
+            </w:pPr>
+            <w:r>
+              <w:rPr>
+                <w:rFonts w:ascii="Calibri" w:hAnsi="Calibri"/>
+                <w:color w:val="111827"/>
+                <w:sz w:val="16"/>
+              </w:rPr>
+              <w:t>not ranking</w:t>
+            </w:r>
+          </w:p>
+        </w:tc>
+        <w:tc>
+          <w:tcPr>
+            <w:tcW w:type="dxa" w:w="737"/>
+            <w:shd w:val="clear" w:color="auto" w:fill="F3F4F6"/>
+          </w:tcPr>
+          <w:p>
+            <w:pPr>
+              <w:spacing w:before="40" w:after="40"/>
+              <w:jc w:val="center"/>
+            </w:pPr>
+            <w:r>
+              <w:rPr>
+                <w:rFonts w:ascii="Calibri" w:hAnsi="Calibri"/>
+                <w:color w:val="111827"/>
+                <w:sz w:val="16"/>
+              </w:rPr>
+              <w:t>13.6</w:t>
+            </w:r>
+          </w:p>
+        </w:tc>
+        <w:tc>
+          <w:tcPr>
+            <w:tcW w:type="dxa" w:w="680"/>
             <w:shd w:val="clear" w:color="auto" w:fill="F3F4F6"/>
           </w:tcPr>
           <w:p>
@@ -2839,7 +3303,7 @@
                 <w:color w:val="111827"/>
                 <w:sz w:val="16"/>
               </w:rPr>
-              <w:t>0</w:t>
+              <w:t>124</w:t>
             </w:r>
           </w:p>
         </w:tc>
@@ -2847,208 +3311,6 @@
           <w:tcPr>
             <w:tcW w:type="dxa" w:w="567"/>
             <w:shd w:val="clear" w:color="auto" w:fill="F3F4F6"/>
-          </w:tcPr>
-          <w:p>
-            <w:pPr>
-              <w:spacing w:before="40" w:after="40"/>
-              <w:jc w:val="center"/>
-            </w:pPr>
-            <w:r>
-              <w:rPr>
-                <w:rFonts w:ascii="Calibri" w:hAnsi="Calibri"/>
-                <w:color w:val="059669"/>
-                <w:sz w:val="16"/>
-              </w:rPr>
-              <w:t>0</w:t>
-            </w:r>
-          </w:p>
-        </w:tc>
-        <w:tc>
-          <w:tcPr>
-            <w:tcW w:type="dxa" w:w="680"/>
-            <w:shd w:val="clear" w:color="auto" w:fill="F3F4F6"/>
-          </w:tcPr>
-          <w:p>
-            <w:pPr>
-              <w:spacing w:before="40" w:after="40"/>
-              <w:jc w:val="center"/>
-            </w:pPr>
-            <w:r>
-              <w:rPr>
-                <w:rFonts w:ascii="Calibri" w:hAnsi="Calibri"/>
-                <w:color w:val="111827"/>
-                <w:sz w:val="16"/>
-              </w:rPr>
-              <w:t>19</w:t>
-            </w:r>
-          </w:p>
-        </w:tc>
-        <w:tc>
-          <w:tcPr>
-            <w:tcW w:type="dxa" w:w="680"/>
-            <w:shd w:val="clear" w:color="auto" w:fill="F3F4F6"/>
-          </w:tcPr>
-          <w:p>
-            <w:pPr>
-              <w:spacing w:before="40" w:after="40"/>
-              <w:jc w:val="center"/>
-            </w:pPr>
-            <w:r>
-              <w:rPr>
-                <w:rFonts w:ascii="Calibri" w:hAnsi="Calibri"/>
-                <w:color w:val="111827"/>
-                <w:sz w:val="16"/>
-              </w:rPr>
-              <w:t>9</w:t>
-            </w:r>
-          </w:p>
-        </w:tc>
-      </w:tr>
-      <w:tr>
-        <w:tc>
-          <w:tcPr>
-            <w:tcW w:type="dxa" w:w="283"/>
-            <w:shd w:val="clear" w:color="auto" w:fill="FFFFFF"/>
-          </w:tcPr>
-          <w:p>
-            <w:pPr>
-              <w:spacing w:before="40" w:after="40"/>
-              <w:jc w:val="center"/>
-            </w:pPr>
-            <w:r>
-              <w:rPr>
-                <w:rFonts w:ascii="Calibri" w:hAnsi="Calibri"/>
-                <w:color w:val="111827"/>
-                <w:sz w:val="16"/>
-              </w:rPr>
-              <w:t>10</w:t>
-            </w:r>
-          </w:p>
-        </w:tc>
-        <w:tc>
-          <w:tcPr>
-            <w:tcW w:type="dxa" w:w="1701"/>
-            <w:shd w:val="clear" w:color="auto" w:fill="FFFFFF"/>
-          </w:tcPr>
-          <w:p>
-            <w:pPr>
-              <w:spacing w:before="40" w:after="40"/>
-              <w:jc w:val="left"/>
-            </w:pPr>
-            <w:r>
-              <w:rPr>
-                <w:rFonts w:ascii="Calibri" w:hAnsi="Calibri"/>
-                <w:color w:val="111827"/>
-                <w:sz w:val="16"/>
-              </w:rPr>
-              <w:t>loyalty points</w:t>
-            </w:r>
-          </w:p>
-        </w:tc>
-        <w:tc>
-          <w:tcPr>
-            <w:tcW w:type="dxa" w:w="1587"/>
-            <w:shd w:val="clear" w:color="auto" w:fill="FFFFFF"/>
-          </w:tcPr>
-          <w:p>
-            <w:pPr>
-              <w:spacing w:before="40" w:after="40"/>
-              <w:jc w:val="left"/>
-            </w:pPr>
-            <w:r>
-              <w:rPr>
-                <w:rFonts w:ascii="Calibri" w:hAnsi="Calibri"/>
-                <w:color w:val="111827"/>
-                <w:sz w:val="16"/>
-              </w:rPr>
-              <w:t>/product/loyalty-points-system</w:t>
-            </w:r>
-          </w:p>
-        </w:tc>
-        <w:tc>
-          <w:tcPr>
-            <w:tcW w:type="dxa" w:w="737"/>
-            <w:shd w:val="clear" w:color="auto" w:fill="FFFFFF"/>
-          </w:tcPr>
-          <w:p>
-            <w:pPr>
-              <w:spacing w:before="40" w:after="40"/>
-              <w:jc w:val="center"/>
-            </w:pPr>
-            <w:r>
-              <w:rPr>
-                <w:rFonts w:ascii="Calibri" w:hAnsi="Calibri"/>
-                <w:color w:val="111827"/>
-                <w:sz w:val="16"/>
-              </w:rPr>
-              <w:t>not ranking</w:t>
-            </w:r>
-          </w:p>
-        </w:tc>
-        <w:tc>
-          <w:tcPr>
-            <w:tcW w:type="dxa" w:w="737"/>
-            <w:shd w:val="clear" w:color="auto" w:fill="FFFFFF"/>
-          </w:tcPr>
-          <w:p>
-            <w:pPr>
-              <w:spacing w:before="40" w:after="40"/>
-              <w:jc w:val="center"/>
-            </w:pPr>
-            <w:r>
-              <w:rPr>
-                <w:rFonts w:ascii="Calibri" w:hAnsi="Calibri"/>
-                <w:color w:val="111827"/>
-                <w:sz w:val="16"/>
-              </w:rPr>
-              <w:t>13.6</w:t>
-            </w:r>
-          </w:p>
-        </w:tc>
-        <w:tc>
-          <w:tcPr>
-            <w:tcW w:type="dxa" w:w="680"/>
-            <w:shd w:val="clear" w:color="auto" w:fill="FFFFFF"/>
-          </w:tcPr>
-          <w:p>
-            <w:pPr>
-              <w:spacing w:before="40" w:after="40"/>
-              <w:jc w:val="center"/>
-            </w:pPr>
-            <w:r>
-              <w:rPr>
-                <w:rFonts w:ascii="Calibri" w:hAnsi="Calibri"/>
-                <w:color w:val="111827"/>
-                <w:sz w:val="16"/>
-              </w:rPr>
-              <w:t>0</w:t>
-            </w:r>
-          </w:p>
-        </w:tc>
-        <w:tc>
-          <w:tcPr>
-            <w:tcW w:type="dxa" w:w="850"/>
-            <w:shd w:val="clear" w:color="auto" w:fill="FFFFFF"/>
-          </w:tcPr>
-          <w:p>
-            <w:pPr>
-              <w:spacing w:before="40" w:after="40"/>
-              <w:jc w:val="center"/>
-            </w:pPr>
-            <w:r>
-              <w:rPr>
-                <w:rFonts w:ascii="Calibri" w:hAnsi="Calibri"/>
-                <w:color w:val="111827"/>
-                <w:sz w:val="16"/>
-              </w:rPr>
-              <w:t>124</w:t>
-            </w:r>
-          </w:p>
-        </w:tc>
-        <w:tc>
-          <w:tcPr>
-            <w:tcW w:type="dxa" w:w="567"/>
-            <w:shd w:val="clear" w:color="auto" w:fill="FFFFFF"/>
           </w:tcPr>
           <w:p>
             <w:pPr>
@@ -3069,7 +3331,7 @@
         <w:tc>
           <w:tcPr>
             <w:tcW w:type="dxa" w:w="680"/>
-            <w:shd w:val="clear" w:color="auto" w:fill="FFFFFF"/>
+            <w:shd w:val="clear" w:color="auto" w:fill="F3F4F6"/>
           </w:tcPr>
           <w:p>
             <w:pPr>
@@ -3089,7 +3351,7 @@
         <w:tc>
           <w:tcPr>
             <w:tcW w:type="dxa" w:w="850"/>
-            <w:shd w:val="clear" w:color="auto" w:fill="FFFFFF"/>
+            <w:shd w:val="clear" w:color="auto" w:fill="F3F4F6"/>
           </w:tcPr>
           <w:p>
             <w:pPr>
@@ -3109,7 +3371,7 @@
         <w:tc>
           <w:tcPr>
             <w:tcW w:type="dxa" w:w="567"/>
-            <w:shd w:val="clear" w:color="auto" w:fill="FFFFFF"/>
+            <w:shd w:val="clear" w:color="auto" w:fill="F3F4F6"/>
           </w:tcPr>
           <w:p>
             <w:pPr>
@@ -3129,7 +3391,7 @@
         <w:tc>
           <w:tcPr>
             <w:tcW w:type="dxa" w:w="680"/>
-            <w:shd w:val="clear" w:color="auto" w:fill="FFFFFF"/>
+            <w:shd w:val="clear" w:color="auto" w:fill="F3F4F6"/>
           </w:tcPr>
           <w:p>
             <w:pPr>
@@ -3149,7 +3411,7 @@
         <w:tc>
           <w:tcPr>
             <w:tcW w:type="dxa" w:w="680"/>
-            <w:shd w:val="clear" w:color="auto" w:fill="FFFFFF"/>
+            <w:shd w:val="clear" w:color="auto" w:fill="F3F4F6"/>
           </w:tcPr>
           <w:p>
             <w:pPr>
@@ -3185,6 +3447,1424 @@
           <w:sz w:val="32"/>
         </w:rPr>
         <w:t>Per-Keyword Detail</w:t>
+      </w:r>
+    </w:p>
+    <w:p>
+      <w:pPr>
+        <w:spacing w:before="200" w:after="80"/>
+      </w:pPr>
+      <w:r>
+        <w:rPr>
+          <w:rFonts w:ascii="Calibri" w:hAnsi="Calibri"/>
+          <w:b/>
+          <w:i w:val="0"/>
+          <w:color w:val="111827"/>
+          <w:sz w:val="24"/>
+        </w:rPr>
+        <w:t>#0 — Loyalty Software</w:t>
+      </w:r>
+    </w:p>
+    <w:tbl>
+      <w:tblPr>
+        <w:tblW w:type="auto" w:w="0"/>
+        <w:jc w:val="left"/>
+        <w:tblLook w:firstColumn="1" w:firstRow="1" w:lastColumn="0" w:lastRow="0" w:noHBand="0" w:noVBand="1" w:val="04A0"/>
+      </w:tblPr>
+      <w:tblGrid>
+        <w:gridCol w:w="2351"/>
+        <w:gridCol w:w="2351"/>
+        <w:gridCol w:w="2351"/>
+        <w:gridCol w:w="2351"/>
+      </w:tblGrid>
+      <w:tr>
+        <w:tc>
+          <w:tcPr>
+            <w:tcW w:type="dxa" w:w="2351"/>
+            <w:shd w:val="clear" w:color="auto" w:fill="F3F4F6"/>
+          </w:tcPr>
+          <w:p>
+            <w:pPr>
+              <w:spacing w:before="120" w:after="120"/>
+              <w:jc w:val="center"/>
+            </w:pPr>
+            <w:r>
+              <w:rPr>
+                <w:rFonts w:ascii="Calibri" w:hAnsi="Calibri"/>
+                <w:b/>
+                <w:color w:val="1A56DB"/>
+                <w:sz w:val="28"/>
+              </w:rPr>
+              <w:t>/ (homepage)</w:t>
+              <w:br/>
+            </w:r>
+            <w:r>
+              <w:rPr>
+                <w:rFonts w:ascii="Calibri" w:hAnsi="Calibri"/>
+                <w:color w:val="6B7280"/>
+                <w:sz w:val="16"/>
+              </w:rPr>
+              <w:t>Focus Page</w:t>
+            </w:r>
+          </w:p>
+        </w:tc>
+        <w:tc>
+          <w:tcPr>
+            <w:tcW w:type="dxa" w:w="2351"/>
+            <w:shd w:val="clear" w:color="auto" w:fill="F3F4F6"/>
+          </w:tcPr>
+          <w:p>
+            <w:pPr>
+              <w:spacing w:before="120" w:after="120"/>
+              <w:jc w:val="center"/>
+            </w:pPr>
+            <w:r>
+              <w:rPr>
+                <w:rFonts w:ascii="Calibri" w:hAnsi="Calibri"/>
+                <w:b/>
+                <w:color w:val="1A56DB"/>
+                <w:sz w:val="28"/>
+              </w:rPr>
+              <w:t>4</w:t>
+              <w:br/>
+            </w:r>
+            <w:r>
+              <w:rPr>
+                <w:rFonts w:ascii="Calibri" w:hAnsi="Calibri"/>
+                <w:color w:val="6B7280"/>
+                <w:sz w:val="16"/>
+              </w:rPr>
+              <w:t>Pos (Ahrefs)</w:t>
+            </w:r>
+          </w:p>
+        </w:tc>
+        <w:tc>
+          <w:tcPr>
+            <w:tcW w:type="dxa" w:w="2351"/>
+            <w:shd w:val="clear" w:color="auto" w:fill="F3F4F6"/>
+          </w:tcPr>
+          <w:p>
+            <w:pPr>
+              <w:spacing w:before="120" w:after="120"/>
+              <w:jc w:val="center"/>
+            </w:pPr>
+            <w:r>
+              <w:rPr>
+                <w:rFonts w:ascii="Calibri" w:hAnsi="Calibri"/>
+                <w:b/>
+                <w:color w:val="1A56DB"/>
+                <w:sz w:val="28"/>
+              </w:rPr>
+              <w:t>4.0</w:t>
+              <w:br/>
+            </w:r>
+            <w:r>
+              <w:rPr>
+                <w:rFonts w:ascii="Calibri" w:hAnsi="Calibri"/>
+                <w:color w:val="6B7280"/>
+                <w:sz w:val="16"/>
+              </w:rPr>
+              <w:t>Pos (GSC May '26)</w:t>
+            </w:r>
+          </w:p>
+        </w:tc>
+        <w:tc>
+          <w:tcPr>
+            <w:tcW w:type="dxa" w:w="2351"/>
+            <w:shd w:val="clear" w:color="auto" w:fill="F3F4F6"/>
+          </w:tcPr>
+          <w:p>
+            <w:pPr>
+              <w:spacing w:before="120" w:after="120"/>
+              <w:jc w:val="center"/>
+            </w:pPr>
+            <w:r>
+              <w:rPr>
+                <w:rFonts w:ascii="Calibri" w:hAnsi="Calibri"/>
+                <w:b/>
+                <w:color w:val="1A56DB"/>
+                <w:sz w:val="28"/>
+              </w:rPr>
+              <w:t>No gap</w:t>
+              <w:br/>
+            </w:r>
+            <w:r>
+              <w:rPr>
+                <w:rFonts w:ascii="Calibri" w:hAnsi="Calibri"/>
+                <w:color w:val="6B7280"/>
+                <w:sz w:val="16"/>
+              </w:rPr>
+              <w:t>Gap</w:t>
+            </w:r>
+          </w:p>
+        </w:tc>
+      </w:tr>
+    </w:tbl>
+    <w:p/>
+    <w:tbl>
+      <w:tblPr>
+        <w:tblW w:type="auto" w:w="0"/>
+        <w:jc w:val="left"/>
+        <w:tblLook w:firstColumn="1" w:firstRow="1" w:lastColumn="0" w:lastRow="0" w:noHBand="0" w:noVBand="1" w:val="04A0"/>
+      </w:tblPr>
+      <w:tblGrid>
+        <w:gridCol w:w="1568"/>
+        <w:gridCol w:w="1568"/>
+        <w:gridCol w:w="1568"/>
+        <w:gridCol w:w="1568"/>
+        <w:gridCol w:w="1568"/>
+        <w:gridCol w:w="1568"/>
+      </w:tblGrid>
+      <w:tr>
+        <w:tc>
+          <w:tcPr>
+            <w:tcW w:type="dxa" w:w="454"/>
+            <w:shd w:val="clear" w:color="auto" w:fill="111827"/>
+          </w:tcPr>
+          <w:p>
+            <w:pPr>
+              <w:jc w:val="center"/>
+            </w:pPr>
+            <w:r>
+              <w:rPr>
+                <w:rFonts w:ascii="Calibri" w:hAnsi="Calibri"/>
+                <w:b/>
+                <w:color w:val="FFFFFF"/>
+                <w:sz w:val="15"/>
+              </w:rPr>
+              <w:t>Pos</w:t>
+            </w:r>
+          </w:p>
+        </w:tc>
+        <w:tc>
+          <w:tcPr>
+            <w:tcW w:type="dxa" w:w="4252"/>
+            <w:shd w:val="clear" w:color="auto" w:fill="111827"/>
+          </w:tcPr>
+          <w:p>
+            <w:pPr>
+              <w:jc w:val="center"/>
+            </w:pPr>
+            <w:r>
+              <w:rPr>
+                <w:rFonts w:ascii="Calibri" w:hAnsi="Calibri"/>
+                <w:b/>
+                <w:color w:val="FFFFFF"/>
+                <w:sz w:val="15"/>
+              </w:rPr>
+              <w:t>URL</w:t>
+            </w:r>
+          </w:p>
+        </w:tc>
+        <w:tc>
+          <w:tcPr>
+            <w:tcW w:type="dxa" w:w="510"/>
+            <w:shd w:val="clear" w:color="auto" w:fill="111827"/>
+          </w:tcPr>
+          <w:p>
+            <w:pPr>
+              <w:jc w:val="center"/>
+            </w:pPr>
+            <w:r>
+              <w:rPr>
+                <w:rFonts w:ascii="Calibri" w:hAnsi="Calibri"/>
+                <w:b/>
+                <w:color w:val="FFFFFF"/>
+                <w:sz w:val="15"/>
+              </w:rPr>
+              <w:t>DR</w:t>
+            </w:r>
+          </w:p>
+        </w:tc>
+        <w:tc>
+          <w:tcPr>
+            <w:tcW w:type="dxa" w:w="510"/>
+            <w:shd w:val="clear" w:color="auto" w:fill="111827"/>
+          </w:tcPr>
+          <w:p>
+            <w:pPr>
+              <w:jc w:val="center"/>
+            </w:pPr>
+            <w:r>
+              <w:rPr>
+                <w:rFonts w:ascii="Calibri" w:hAnsi="Calibri"/>
+                <w:b/>
+                <w:color w:val="FFFFFF"/>
+                <w:sz w:val="15"/>
+              </w:rPr>
+              <w:t>UR</w:t>
+            </w:r>
+          </w:p>
+        </w:tc>
+        <w:tc>
+          <w:tcPr>
+            <w:tcW w:type="dxa" w:w="907"/>
+            <w:shd w:val="clear" w:color="auto" w:fill="111827"/>
+          </w:tcPr>
+          <w:p>
+            <w:pPr>
+              <w:jc w:val="center"/>
+            </w:pPr>
+            <w:r>
+              <w:rPr>
+                <w:rFonts w:ascii="Calibri" w:hAnsi="Calibri"/>
+                <w:b/>
+                <w:color w:val="FFFFFF"/>
+                <w:sz w:val="15"/>
+              </w:rPr>
+              <w:t>Ref. Domains</w:t>
+            </w:r>
+          </w:p>
+        </w:tc>
+        <w:tc>
+          <w:tcPr>
+            <w:tcW w:type="dxa" w:w="850"/>
+            <w:shd w:val="clear" w:color="auto" w:fill="111827"/>
+          </w:tcPr>
+          <w:p>
+            <w:pPr>
+              <w:jc w:val="center"/>
+            </w:pPr>
+            <w:r>
+              <w:rPr>
+                <w:rFonts w:ascii="Calibri" w:hAnsi="Calibri"/>
+                <w:b/>
+                <w:color w:val="FFFFFF"/>
+                <w:sz w:val="15"/>
+              </w:rPr>
+              <w:t>Traffic</w:t>
+            </w:r>
+          </w:p>
+        </w:tc>
+      </w:tr>
+      <w:tr>
+        <w:tc>
+          <w:tcPr>
+            <w:tcW w:type="dxa" w:w="454"/>
+            <w:shd w:val="clear" w:color="auto" w:fill="FFFFFF"/>
+          </w:tcPr>
+          <w:p>
+            <w:pPr>
+              <w:spacing w:before="20" w:after="20"/>
+              <w:jc w:val="center"/>
+            </w:pPr>
+            <w:r>
+              <w:rPr>
+                <w:rFonts w:ascii="Calibri" w:hAnsi="Calibri"/>
+                <w:color w:val="111827"/>
+                <w:sz w:val="15"/>
+              </w:rPr>
+              <w:t>2</w:t>
+            </w:r>
+          </w:p>
+        </w:tc>
+        <w:tc>
+          <w:tcPr>
+            <w:tcW w:type="dxa" w:w="4252"/>
+            <w:shd w:val="clear" w:color="auto" w:fill="FFFFFF"/>
+          </w:tcPr>
+          <w:p>
+            <w:pPr>
+              <w:spacing w:before="20" w:after="20"/>
+              <w:jc w:val="left"/>
+            </w:pPr>
+            <w:r>
+              <w:rPr>
+                <w:rFonts w:ascii="Calibri" w:hAnsi="Calibri"/>
+                <w:color w:val="111827"/>
+                <w:sz w:val="15"/>
+              </w:rPr>
+              <w:t>gartner.com/reviews/market/loyalty-program-vendors</w:t>
+            </w:r>
+          </w:p>
+        </w:tc>
+        <w:tc>
+          <w:tcPr>
+            <w:tcW w:type="dxa" w:w="510"/>
+            <w:shd w:val="clear" w:color="auto" w:fill="FFFFFF"/>
+          </w:tcPr>
+          <w:p>
+            <w:pPr>
+              <w:spacing w:before="20" w:after="20"/>
+              <w:jc w:val="center"/>
+            </w:pPr>
+            <w:r>
+              <w:rPr>
+                <w:rFonts w:ascii="Calibri" w:hAnsi="Calibri"/>
+                <w:color w:val="111827"/>
+                <w:sz w:val="15"/>
+              </w:rPr>
+              <w:t>92</w:t>
+            </w:r>
+          </w:p>
+        </w:tc>
+        <w:tc>
+          <w:tcPr>
+            <w:tcW w:type="dxa" w:w="510"/>
+            <w:shd w:val="clear" w:color="auto" w:fill="FFFFFF"/>
+          </w:tcPr>
+          <w:p>
+            <w:pPr>
+              <w:spacing w:before="20" w:after="20"/>
+              <w:jc w:val="center"/>
+            </w:pPr>
+            <w:r>
+              <w:rPr>
+                <w:rFonts w:ascii="Calibri" w:hAnsi="Calibri"/>
+                <w:color w:val="111827"/>
+                <w:sz w:val="15"/>
+              </w:rPr>
+              <w:t>4</w:t>
+            </w:r>
+          </w:p>
+        </w:tc>
+        <w:tc>
+          <w:tcPr>
+            <w:tcW w:type="dxa" w:w="907"/>
+            <w:shd w:val="clear" w:color="auto" w:fill="FFFFFF"/>
+          </w:tcPr>
+          <w:p>
+            <w:pPr>
+              <w:spacing w:before="20" w:after="20"/>
+              <w:jc w:val="center"/>
+            </w:pPr>
+            <w:r>
+              <w:rPr>
+                <w:rFonts w:ascii="Calibri" w:hAnsi="Calibri"/>
+                <w:color w:val="111827"/>
+                <w:sz w:val="15"/>
+              </w:rPr>
+              <w:t>14</w:t>
+            </w:r>
+          </w:p>
+        </w:tc>
+        <w:tc>
+          <w:tcPr>
+            <w:tcW w:type="dxa" w:w="850"/>
+            <w:shd w:val="clear" w:color="auto" w:fill="FFFFFF"/>
+          </w:tcPr>
+          <w:p>
+            <w:pPr>
+              <w:spacing w:before="20" w:after="20"/>
+              <w:jc w:val="center"/>
+            </w:pPr>
+            <w:r>
+              <w:rPr>
+                <w:rFonts w:ascii="Calibri" w:hAnsi="Calibri"/>
+                <w:color w:val="111827"/>
+                <w:sz w:val="15"/>
+              </w:rPr>
+              <w:t>4741</w:t>
+            </w:r>
+          </w:p>
+        </w:tc>
+      </w:tr>
+      <w:tr>
+        <w:tc>
+          <w:tcPr>
+            <w:tcW w:type="dxa" w:w="454"/>
+            <w:shd w:val="clear" w:color="auto" w:fill="EBF5FF"/>
+          </w:tcPr>
+          <w:p>
+            <w:pPr>
+              <w:spacing w:before="20" w:after="20"/>
+              <w:jc w:val="center"/>
+            </w:pPr>
+            <w:r>
+              <w:rPr>
+                <w:rFonts w:ascii="Calibri" w:hAnsi="Calibri"/>
+                <w:b/>
+                <w:color w:val="1A56DB"/>
+                <w:sz w:val="15"/>
+              </w:rPr>
+              <w:t>4</w:t>
+            </w:r>
+          </w:p>
+        </w:tc>
+        <w:tc>
+          <w:tcPr>
+            <w:tcW w:type="dxa" w:w="4252"/>
+            <w:shd w:val="clear" w:color="auto" w:fill="EBF5FF"/>
+          </w:tcPr>
+          <w:p>
+            <w:pPr>
+              <w:spacing w:before="20" w:after="20"/>
+              <w:jc w:val="left"/>
+            </w:pPr>
+            <w:r>
+              <w:rPr>
+                <w:rFonts w:ascii="Calibri" w:hAnsi="Calibri"/>
+                <w:b/>
+                <w:color w:val="1A56DB"/>
+                <w:sz w:val="15"/>
+              </w:rPr>
+              <w:t>openloyalty.io/</w:t>
+            </w:r>
+          </w:p>
+        </w:tc>
+        <w:tc>
+          <w:tcPr>
+            <w:tcW w:type="dxa" w:w="510"/>
+            <w:shd w:val="clear" w:color="auto" w:fill="EBF5FF"/>
+          </w:tcPr>
+          <w:p>
+            <w:pPr>
+              <w:spacing w:before="20" w:after="20"/>
+              <w:jc w:val="center"/>
+            </w:pPr>
+            <w:r>
+              <w:rPr>
+                <w:rFonts w:ascii="Calibri" w:hAnsi="Calibri"/>
+                <w:b/>
+                <w:color w:val="1A56DB"/>
+                <w:sz w:val="15"/>
+              </w:rPr>
+              <w:t>69</w:t>
+            </w:r>
+          </w:p>
+        </w:tc>
+        <w:tc>
+          <w:tcPr>
+            <w:tcW w:type="dxa" w:w="510"/>
+            <w:shd w:val="clear" w:color="auto" w:fill="EBF5FF"/>
+          </w:tcPr>
+          <w:p>
+            <w:pPr>
+              <w:spacing w:before="20" w:after="20"/>
+              <w:jc w:val="center"/>
+            </w:pPr>
+            <w:r>
+              <w:rPr>
+                <w:rFonts w:ascii="Calibri" w:hAnsi="Calibri"/>
+                <w:b/>
+                <w:color w:val="1A56DB"/>
+                <w:sz w:val="15"/>
+              </w:rPr>
+              <w:t>11</w:t>
+            </w:r>
+          </w:p>
+        </w:tc>
+        <w:tc>
+          <w:tcPr>
+            <w:tcW w:type="dxa" w:w="907"/>
+            <w:shd w:val="clear" w:color="auto" w:fill="EBF5FF"/>
+          </w:tcPr>
+          <w:p>
+            <w:pPr>
+              <w:spacing w:before="20" w:after="20"/>
+              <w:jc w:val="center"/>
+            </w:pPr>
+            <w:r>
+              <w:rPr>
+                <w:rFonts w:ascii="Calibri" w:hAnsi="Calibri"/>
+                <w:b/>
+                <w:color w:val="1A56DB"/>
+                <w:sz w:val="15"/>
+              </w:rPr>
+              <w:t>735</w:t>
+            </w:r>
+          </w:p>
+        </w:tc>
+        <w:tc>
+          <w:tcPr>
+            <w:tcW w:type="dxa" w:w="850"/>
+            <w:shd w:val="clear" w:color="auto" w:fill="EBF5FF"/>
+          </w:tcPr>
+          <w:p>
+            <w:pPr>
+              <w:spacing w:before="20" w:after="20"/>
+              <w:jc w:val="center"/>
+            </w:pPr>
+            <w:r>
+              <w:rPr>
+                <w:rFonts w:ascii="Calibri" w:hAnsi="Calibri"/>
+                <w:b/>
+                <w:color w:val="1A56DB"/>
+                <w:sz w:val="15"/>
+              </w:rPr>
+              <w:t>2066</w:t>
+            </w:r>
+          </w:p>
+        </w:tc>
+      </w:tr>
+      <w:tr>
+        <w:tc>
+          <w:tcPr>
+            <w:tcW w:type="dxa" w:w="454"/>
+            <w:shd w:val="clear" w:color="auto" w:fill="FFFFFF"/>
+          </w:tcPr>
+          <w:p>
+            <w:pPr>
+              <w:spacing w:before="20" w:after="20"/>
+              <w:jc w:val="center"/>
+            </w:pPr>
+            <w:r>
+              <w:rPr>
+                <w:rFonts w:ascii="Calibri" w:hAnsi="Calibri"/>
+                <w:color w:val="111827"/>
+                <w:sz w:val="15"/>
+              </w:rPr>
+              <w:t>5</w:t>
+            </w:r>
+          </w:p>
+        </w:tc>
+        <w:tc>
+          <w:tcPr>
+            <w:tcW w:type="dxa" w:w="4252"/>
+            <w:shd w:val="clear" w:color="auto" w:fill="FFFFFF"/>
+          </w:tcPr>
+          <w:p>
+            <w:pPr>
+              <w:spacing w:before="20" w:after="20"/>
+              <w:jc w:val="left"/>
+            </w:pPr>
+            <w:r>
+              <w:rPr>
+                <w:rFonts w:ascii="Calibri" w:hAnsi="Calibri"/>
+                <w:color w:val="111827"/>
+                <w:sz w:val="15"/>
+              </w:rPr>
+              <w:t>loopyloyalty.com/</w:t>
+            </w:r>
+          </w:p>
+        </w:tc>
+        <w:tc>
+          <w:tcPr>
+            <w:tcW w:type="dxa" w:w="510"/>
+            <w:shd w:val="clear" w:color="auto" w:fill="FFFFFF"/>
+          </w:tcPr>
+          <w:p>
+            <w:pPr>
+              <w:spacing w:before="20" w:after="20"/>
+              <w:jc w:val="center"/>
+            </w:pPr>
+            <w:r>
+              <w:rPr>
+                <w:rFonts w:ascii="Calibri" w:hAnsi="Calibri"/>
+                <w:color w:val="111827"/>
+                <w:sz w:val="15"/>
+              </w:rPr>
+              <w:t>64</w:t>
+            </w:r>
+          </w:p>
+        </w:tc>
+        <w:tc>
+          <w:tcPr>
+            <w:tcW w:type="dxa" w:w="510"/>
+            <w:shd w:val="clear" w:color="auto" w:fill="FFFFFF"/>
+          </w:tcPr>
+          <w:p>
+            <w:pPr>
+              <w:spacing w:before="20" w:after="20"/>
+              <w:jc w:val="center"/>
+            </w:pPr>
+            <w:r>
+              <w:rPr>
+                <w:rFonts w:ascii="Calibri" w:hAnsi="Calibri"/>
+                <w:color w:val="111827"/>
+                <w:sz w:val="15"/>
+              </w:rPr>
+              <w:t>11</w:t>
+            </w:r>
+          </w:p>
+        </w:tc>
+        <w:tc>
+          <w:tcPr>
+            <w:tcW w:type="dxa" w:w="907"/>
+            <w:shd w:val="clear" w:color="auto" w:fill="FFFFFF"/>
+          </w:tcPr>
+          <w:p>
+            <w:pPr>
+              <w:spacing w:before="20" w:after="20"/>
+              <w:jc w:val="center"/>
+            </w:pPr>
+            <w:r>
+              <w:rPr>
+                <w:rFonts w:ascii="Calibri" w:hAnsi="Calibri"/>
+                <w:color w:val="111827"/>
+                <w:sz w:val="15"/>
+              </w:rPr>
+              <w:t>502</w:t>
+            </w:r>
+          </w:p>
+        </w:tc>
+        <w:tc>
+          <w:tcPr>
+            <w:tcW w:type="dxa" w:w="850"/>
+            <w:shd w:val="clear" w:color="auto" w:fill="FFFFFF"/>
+          </w:tcPr>
+          <w:p>
+            <w:pPr>
+              <w:spacing w:before="20" w:after="20"/>
+              <w:jc w:val="center"/>
+            </w:pPr>
+            <w:r>
+              <w:rPr>
+                <w:rFonts w:ascii="Calibri" w:hAnsi="Calibri"/>
+                <w:color w:val="111827"/>
+                <w:sz w:val="15"/>
+              </w:rPr>
+              <w:t>6237</w:t>
+            </w:r>
+          </w:p>
+        </w:tc>
+      </w:tr>
+      <w:tr>
+        <w:tc>
+          <w:tcPr>
+            <w:tcW w:type="dxa" w:w="454"/>
+            <w:shd w:val="clear" w:color="auto" w:fill="FFFFFF"/>
+          </w:tcPr>
+          <w:p>
+            <w:pPr>
+              <w:spacing w:before="20" w:after="20"/>
+              <w:jc w:val="center"/>
+            </w:pPr>
+            <w:r>
+              <w:rPr>
+                <w:rFonts w:ascii="Calibri" w:hAnsi="Calibri"/>
+                <w:color w:val="111827"/>
+                <w:sz w:val="15"/>
+              </w:rPr>
+              <w:t>6</w:t>
+            </w:r>
+          </w:p>
+        </w:tc>
+        <w:tc>
+          <w:tcPr>
+            <w:tcW w:type="dxa" w:w="4252"/>
+            <w:shd w:val="clear" w:color="auto" w:fill="FFFFFF"/>
+          </w:tcPr>
+          <w:p>
+            <w:pPr>
+              <w:spacing w:before="20" w:after="20"/>
+              <w:jc w:val="left"/>
+            </w:pPr>
+            <w:r>
+              <w:rPr>
+                <w:rFonts w:ascii="Calibri" w:hAnsi="Calibri"/>
+                <w:color w:val="111827"/>
+                <w:sz w:val="15"/>
+              </w:rPr>
+              <w:t>smile.io/</w:t>
+            </w:r>
+          </w:p>
+        </w:tc>
+        <w:tc>
+          <w:tcPr>
+            <w:tcW w:type="dxa" w:w="510"/>
+            <w:shd w:val="clear" w:color="auto" w:fill="FFFFFF"/>
+          </w:tcPr>
+          <w:p>
+            <w:pPr>
+              <w:spacing w:before="20" w:after="20"/>
+              <w:jc w:val="center"/>
+            </w:pPr>
+            <w:r>
+              <w:rPr>
+                <w:rFonts w:ascii="Calibri" w:hAnsi="Calibri"/>
+                <w:color w:val="111827"/>
+                <w:sz w:val="15"/>
+              </w:rPr>
+              <w:t>78</w:t>
+            </w:r>
+          </w:p>
+        </w:tc>
+        <w:tc>
+          <w:tcPr>
+            <w:tcW w:type="dxa" w:w="510"/>
+            <w:shd w:val="clear" w:color="auto" w:fill="FFFFFF"/>
+          </w:tcPr>
+          <w:p>
+            <w:pPr>
+              <w:spacing w:before="20" w:after="20"/>
+              <w:jc w:val="center"/>
+            </w:pPr>
+            <w:r>
+              <w:rPr>
+                <w:rFonts w:ascii="Calibri" w:hAnsi="Calibri"/>
+                <w:color w:val="111827"/>
+                <w:sz w:val="15"/>
+              </w:rPr>
+              <w:t>17</w:t>
+            </w:r>
+          </w:p>
+        </w:tc>
+        <w:tc>
+          <w:tcPr>
+            <w:tcW w:type="dxa" w:w="907"/>
+            <w:shd w:val="clear" w:color="auto" w:fill="FFFFFF"/>
+          </w:tcPr>
+          <w:p>
+            <w:pPr>
+              <w:spacing w:before="20" w:after="20"/>
+              <w:jc w:val="center"/>
+            </w:pPr>
+            <w:r>
+              <w:rPr>
+                <w:rFonts w:ascii="Calibri" w:hAnsi="Calibri"/>
+                <w:color w:val="111827"/>
+                <w:sz w:val="15"/>
+              </w:rPr>
+              <w:t>4822</w:t>
+            </w:r>
+          </w:p>
+        </w:tc>
+        <w:tc>
+          <w:tcPr>
+            <w:tcW w:type="dxa" w:w="850"/>
+            <w:shd w:val="clear" w:color="auto" w:fill="FFFFFF"/>
+          </w:tcPr>
+          <w:p>
+            <w:pPr>
+              <w:spacing w:before="20" w:after="20"/>
+              <w:jc w:val="center"/>
+            </w:pPr>
+            <w:r>
+              <w:rPr>
+                <w:rFonts w:ascii="Calibri" w:hAnsi="Calibri"/>
+                <w:color w:val="111827"/>
+                <w:sz w:val="15"/>
+              </w:rPr>
+              <w:t>4050</w:t>
+            </w:r>
+          </w:p>
+        </w:tc>
+      </w:tr>
+      <w:tr>
+        <w:tc>
+          <w:tcPr>
+            <w:tcW w:type="dxa" w:w="454"/>
+            <w:shd w:val="clear" w:color="auto" w:fill="FFFFFF"/>
+          </w:tcPr>
+          <w:p>
+            <w:pPr>
+              <w:spacing w:before="20" w:after="20"/>
+              <w:jc w:val="center"/>
+            </w:pPr>
+            <w:r>
+              <w:rPr>
+                <w:rFonts w:ascii="Calibri" w:hAnsi="Calibri"/>
+                <w:color w:val="111827"/>
+                <w:sz w:val="15"/>
+              </w:rPr>
+              <w:t>7</w:t>
+            </w:r>
+          </w:p>
+        </w:tc>
+        <w:tc>
+          <w:tcPr>
+            <w:tcW w:type="dxa" w:w="4252"/>
+            <w:shd w:val="clear" w:color="auto" w:fill="FFFFFF"/>
+          </w:tcPr>
+          <w:p>
+            <w:pPr>
+              <w:spacing w:before="20" w:after="20"/>
+              <w:jc w:val="left"/>
+            </w:pPr>
+            <w:r>
+              <w:rPr>
+                <w:rFonts w:ascii="Calibri" w:hAnsi="Calibri"/>
+                <w:color w:val="111827"/>
+                <w:sz w:val="15"/>
+              </w:rPr>
+              <w:t>yotpo.com/platform/loyalty/</w:t>
+            </w:r>
+          </w:p>
+        </w:tc>
+        <w:tc>
+          <w:tcPr>
+            <w:tcW w:type="dxa" w:w="510"/>
+            <w:shd w:val="clear" w:color="auto" w:fill="FFFFFF"/>
+          </w:tcPr>
+          <w:p>
+            <w:pPr>
+              <w:spacing w:before="20" w:after="20"/>
+              <w:jc w:val="center"/>
+            </w:pPr>
+            <w:r>
+              <w:rPr>
+                <w:rFonts w:ascii="Calibri" w:hAnsi="Calibri"/>
+                <w:color w:val="111827"/>
+                <w:sz w:val="15"/>
+              </w:rPr>
+              <w:t>88</w:t>
+            </w:r>
+          </w:p>
+        </w:tc>
+        <w:tc>
+          <w:tcPr>
+            <w:tcW w:type="dxa" w:w="510"/>
+            <w:shd w:val="clear" w:color="auto" w:fill="FFFFFF"/>
+          </w:tcPr>
+          <w:p>
+            <w:pPr>
+              <w:spacing w:before="20" w:after="20"/>
+              <w:jc w:val="center"/>
+            </w:pPr>
+            <w:r>
+              <w:rPr>
+                <w:rFonts w:ascii="Calibri" w:hAnsi="Calibri"/>
+                <w:color w:val="111827"/>
+                <w:sz w:val="15"/>
+              </w:rPr>
+              <w:t>13</w:t>
+            </w:r>
+          </w:p>
+        </w:tc>
+        <w:tc>
+          <w:tcPr>
+            <w:tcW w:type="dxa" w:w="907"/>
+            <w:shd w:val="clear" w:color="auto" w:fill="FFFFFF"/>
+          </w:tcPr>
+          <w:p>
+            <w:pPr>
+              <w:spacing w:before="20" w:after="20"/>
+              <w:jc w:val="center"/>
+            </w:pPr>
+            <w:r>
+              <w:rPr>
+                <w:rFonts w:ascii="Calibri" w:hAnsi="Calibri"/>
+                <w:color w:val="111827"/>
+                <w:sz w:val="15"/>
+              </w:rPr>
+              <w:t>511</w:t>
+            </w:r>
+          </w:p>
+        </w:tc>
+        <w:tc>
+          <w:tcPr>
+            <w:tcW w:type="dxa" w:w="850"/>
+            <w:shd w:val="clear" w:color="auto" w:fill="FFFFFF"/>
+          </w:tcPr>
+          <w:p>
+            <w:pPr>
+              <w:spacing w:before="20" w:after="20"/>
+              <w:jc w:val="center"/>
+            </w:pPr>
+            <w:r>
+              <w:rPr>
+                <w:rFonts w:ascii="Calibri" w:hAnsi="Calibri"/>
+                <w:color w:val="111827"/>
+                <w:sz w:val="15"/>
+              </w:rPr>
+              <w:t>2216</w:t>
+            </w:r>
+          </w:p>
+        </w:tc>
+      </w:tr>
+      <w:tr>
+        <w:tc>
+          <w:tcPr>
+            <w:tcW w:type="dxa" w:w="454"/>
+            <w:shd w:val="clear" w:color="auto" w:fill="FFFFFF"/>
+          </w:tcPr>
+          <w:p>
+            <w:pPr>
+              <w:spacing w:before="20" w:after="20"/>
+              <w:jc w:val="center"/>
+            </w:pPr>
+            <w:r>
+              <w:rPr>
+                <w:rFonts w:ascii="Calibri" w:hAnsi="Calibri"/>
+                <w:color w:val="111827"/>
+                <w:sz w:val="15"/>
+              </w:rPr>
+              <w:t>8</w:t>
+            </w:r>
+          </w:p>
+        </w:tc>
+        <w:tc>
+          <w:tcPr>
+            <w:tcW w:type="dxa" w:w="4252"/>
+            <w:shd w:val="clear" w:color="auto" w:fill="FFFFFF"/>
+          </w:tcPr>
+          <w:p>
+            <w:pPr>
+              <w:spacing w:before="20" w:after="20"/>
+              <w:jc w:val="left"/>
+            </w:pPr>
+            <w:r>
+              <w:rPr>
+                <w:rFonts w:ascii="Calibri" w:hAnsi="Calibri"/>
+                <w:color w:val="111827"/>
+                <w:sz w:val="15"/>
+              </w:rPr>
+              <w:t>g2.com/categories/loyalty-management</w:t>
+            </w:r>
+          </w:p>
+        </w:tc>
+        <w:tc>
+          <w:tcPr>
+            <w:tcW w:type="dxa" w:w="510"/>
+            <w:shd w:val="clear" w:color="auto" w:fill="FFFFFF"/>
+          </w:tcPr>
+          <w:p>
+            <w:pPr>
+              <w:spacing w:before="20" w:after="20"/>
+              <w:jc w:val="center"/>
+            </w:pPr>
+            <w:r>
+              <w:rPr>
+                <w:rFonts w:ascii="Calibri" w:hAnsi="Calibri"/>
+                <w:color w:val="111827"/>
+                <w:sz w:val="15"/>
+              </w:rPr>
+              <w:t>91</w:t>
+            </w:r>
+          </w:p>
+        </w:tc>
+        <w:tc>
+          <w:tcPr>
+            <w:tcW w:type="dxa" w:w="510"/>
+            <w:shd w:val="clear" w:color="auto" w:fill="FFFFFF"/>
+          </w:tcPr>
+          <w:p>
+            <w:pPr>
+              <w:spacing w:before="20" w:after="20"/>
+              <w:jc w:val="center"/>
+            </w:pPr>
+            <w:r>
+              <w:rPr>
+                <w:rFonts w:ascii="Calibri" w:hAnsi="Calibri"/>
+                <w:color w:val="111827"/>
+                <w:sz w:val="15"/>
+              </w:rPr>
+              <w:t>15</w:t>
+            </w:r>
+          </w:p>
+        </w:tc>
+        <w:tc>
+          <w:tcPr>
+            <w:tcW w:type="dxa" w:w="907"/>
+            <w:shd w:val="clear" w:color="auto" w:fill="FFFFFF"/>
+          </w:tcPr>
+          <w:p>
+            <w:pPr>
+              <w:spacing w:before="20" w:after="20"/>
+              <w:jc w:val="center"/>
+            </w:pPr>
+            <w:r>
+              <w:rPr>
+                <w:rFonts w:ascii="Calibri" w:hAnsi="Calibri"/>
+                <w:color w:val="111827"/>
+                <w:sz w:val="15"/>
+              </w:rPr>
+              <w:t>53</w:t>
+            </w:r>
+          </w:p>
+        </w:tc>
+        <w:tc>
+          <w:tcPr>
+            <w:tcW w:type="dxa" w:w="850"/>
+            <w:shd w:val="clear" w:color="auto" w:fill="FFFFFF"/>
+          </w:tcPr>
+          <w:p>
+            <w:pPr>
+              <w:spacing w:before="20" w:after="20"/>
+              <w:jc w:val="center"/>
+            </w:pPr>
+            <w:r>
+              <w:rPr>
+                <w:rFonts w:ascii="Calibri" w:hAnsi="Calibri"/>
+                <w:color w:val="111827"/>
+                <w:sz w:val="15"/>
+              </w:rPr>
+              <w:t>312</w:t>
+            </w:r>
+          </w:p>
+        </w:tc>
+      </w:tr>
+      <w:tr>
+        <w:tc>
+          <w:tcPr>
+            <w:tcW w:type="dxa" w:w="454"/>
+            <w:shd w:val="clear" w:color="auto" w:fill="FFFFFF"/>
+          </w:tcPr>
+          <w:p>
+            <w:pPr>
+              <w:spacing w:before="20" w:after="20"/>
+              <w:jc w:val="center"/>
+            </w:pPr>
+            <w:r>
+              <w:rPr>
+                <w:rFonts w:ascii="Calibri" w:hAnsi="Calibri"/>
+                <w:color w:val="111827"/>
+                <w:sz w:val="15"/>
+              </w:rPr>
+              <w:t>9</w:t>
+            </w:r>
+          </w:p>
+        </w:tc>
+        <w:tc>
+          <w:tcPr>
+            <w:tcW w:type="dxa" w:w="4252"/>
+            <w:shd w:val="clear" w:color="auto" w:fill="FFFFFF"/>
+          </w:tcPr>
+          <w:p>
+            <w:pPr>
+              <w:spacing w:before="20" w:after="20"/>
+              <w:jc w:val="left"/>
+            </w:pPr>
+            <w:r>
+              <w:rPr>
+                <w:rFonts w:ascii="Calibri" w:hAnsi="Calibri"/>
+                <w:color w:val="111827"/>
+                <w:sz w:val="15"/>
+              </w:rPr>
+              <w:t>squareup.com/us/en/software/loyalty</w:t>
+            </w:r>
+          </w:p>
+        </w:tc>
+        <w:tc>
+          <w:tcPr>
+            <w:tcW w:type="dxa" w:w="510"/>
+            <w:shd w:val="clear" w:color="auto" w:fill="FFFFFF"/>
+          </w:tcPr>
+          <w:p>
+            <w:pPr>
+              <w:spacing w:before="20" w:after="20"/>
+              <w:jc w:val="center"/>
+            </w:pPr>
+            <w:r>
+              <w:rPr>
+                <w:rFonts w:ascii="Calibri" w:hAnsi="Calibri"/>
+                <w:color w:val="111827"/>
+                <w:sz w:val="15"/>
+              </w:rPr>
+              <w:t>93</w:t>
+            </w:r>
+          </w:p>
+        </w:tc>
+        <w:tc>
+          <w:tcPr>
+            <w:tcW w:type="dxa" w:w="510"/>
+            <w:shd w:val="clear" w:color="auto" w:fill="FFFFFF"/>
+          </w:tcPr>
+          <w:p>
+            <w:pPr>
+              <w:spacing w:before="20" w:after="20"/>
+              <w:jc w:val="center"/>
+            </w:pPr>
+            <w:r>
+              <w:rPr>
+                <w:rFonts w:ascii="Calibri" w:hAnsi="Calibri"/>
+                <w:color w:val="111827"/>
+                <w:sz w:val="15"/>
+              </w:rPr>
+              <w:t>16</w:t>
+            </w:r>
+          </w:p>
+        </w:tc>
+        <w:tc>
+          <w:tcPr>
+            <w:tcW w:type="dxa" w:w="907"/>
+            <w:shd w:val="clear" w:color="auto" w:fill="FFFFFF"/>
+          </w:tcPr>
+          <w:p>
+            <w:pPr>
+              <w:spacing w:before="20" w:after="20"/>
+              <w:jc w:val="center"/>
+            </w:pPr>
+            <w:r>
+              <w:rPr>
+                <w:rFonts w:ascii="Calibri" w:hAnsi="Calibri"/>
+                <w:color w:val="111827"/>
+                <w:sz w:val="15"/>
+              </w:rPr>
+              <w:t>180</w:t>
+            </w:r>
+          </w:p>
+        </w:tc>
+        <w:tc>
+          <w:tcPr>
+            <w:tcW w:type="dxa" w:w="850"/>
+            <w:shd w:val="clear" w:color="auto" w:fill="FFFFFF"/>
+          </w:tcPr>
+          <w:p>
+            <w:pPr>
+              <w:spacing w:before="20" w:after="20"/>
+              <w:jc w:val="center"/>
+            </w:pPr>
+            <w:r>
+              <w:rPr>
+                <w:rFonts w:ascii="Calibri" w:hAnsi="Calibri"/>
+                <w:color w:val="111827"/>
+                <w:sz w:val="15"/>
+              </w:rPr>
+              <w:t>8036</w:t>
+            </w:r>
+          </w:p>
+        </w:tc>
+      </w:tr>
+      <w:tr>
+        <w:tc>
+          <w:tcPr>
+            <w:tcW w:type="dxa" w:w="454"/>
+            <w:shd w:val="clear" w:color="auto" w:fill="FFFFFF"/>
+          </w:tcPr>
+          <w:p>
+            <w:pPr>
+              <w:spacing w:before="20" w:after="20"/>
+              <w:jc w:val="center"/>
+            </w:pPr>
+            <w:r>
+              <w:rPr>
+                <w:rFonts w:ascii="Calibri" w:hAnsi="Calibri"/>
+                <w:color w:val="111827"/>
+                <w:sz w:val="15"/>
+              </w:rPr>
+              <w:t>10</w:t>
+            </w:r>
+          </w:p>
+        </w:tc>
+        <w:tc>
+          <w:tcPr>
+            <w:tcW w:type="dxa" w:w="4252"/>
+            <w:shd w:val="clear" w:color="auto" w:fill="FFFFFF"/>
+          </w:tcPr>
+          <w:p>
+            <w:pPr>
+              <w:spacing w:before="20" w:after="20"/>
+              <w:jc w:val="left"/>
+            </w:pPr>
+            <w:r>
+              <w:rPr>
+                <w:rFonts w:ascii="Calibri" w:hAnsi="Calibri"/>
+                <w:color w:val="111827"/>
+                <w:sz w:val="15"/>
+              </w:rPr>
+              <w:t>brierley.com/blog/the-best-loyalty-software-vendors-for-2025-…</w:t>
+            </w:r>
+          </w:p>
+        </w:tc>
+        <w:tc>
+          <w:tcPr>
+            <w:tcW w:type="dxa" w:w="510"/>
+            <w:shd w:val="clear" w:color="auto" w:fill="FFFFFF"/>
+          </w:tcPr>
+          <w:p>
+            <w:pPr>
+              <w:spacing w:before="20" w:after="20"/>
+              <w:jc w:val="center"/>
+            </w:pPr>
+            <w:r>
+              <w:rPr>
+                <w:rFonts w:ascii="Calibri" w:hAnsi="Calibri"/>
+                <w:color w:val="111827"/>
+                <w:sz w:val="15"/>
+              </w:rPr>
+              <w:t>35</w:t>
+            </w:r>
+          </w:p>
+        </w:tc>
+        <w:tc>
+          <w:tcPr>
+            <w:tcW w:type="dxa" w:w="510"/>
+            <w:shd w:val="clear" w:color="auto" w:fill="FFFFFF"/>
+          </w:tcPr>
+          <w:p>
+            <w:pPr>
+              <w:spacing w:before="20" w:after="20"/>
+              <w:jc w:val="center"/>
+            </w:pPr>
+            <w:r>
+              <w:rPr>
+                <w:rFonts w:ascii="Calibri" w:hAnsi="Calibri"/>
+                <w:color w:val="111827"/>
+                <w:sz w:val="15"/>
+              </w:rPr>
+              <w:t>4</w:t>
+            </w:r>
+          </w:p>
+        </w:tc>
+        <w:tc>
+          <w:tcPr>
+            <w:tcW w:type="dxa" w:w="907"/>
+            <w:shd w:val="clear" w:color="auto" w:fill="FFFFFF"/>
+          </w:tcPr>
+          <w:p>
+            <w:pPr>
+              <w:spacing w:before="20" w:after="20"/>
+              <w:jc w:val="center"/>
+            </w:pPr>
+            <w:r>
+              <w:rPr>
+                <w:rFonts w:ascii="Calibri" w:hAnsi="Calibri"/>
+                <w:color w:val="111827"/>
+                <w:sz w:val="15"/>
+              </w:rPr>
+              <w:t>22</w:t>
+            </w:r>
+          </w:p>
+        </w:tc>
+        <w:tc>
+          <w:tcPr>
+            <w:tcW w:type="dxa" w:w="850"/>
+            <w:shd w:val="clear" w:color="auto" w:fill="FFFFFF"/>
+          </w:tcPr>
+          <w:p>
+            <w:pPr>
+              <w:spacing w:before="20" w:after="20"/>
+              <w:jc w:val="center"/>
+            </w:pPr>
+            <w:r>
+              <w:rPr>
+                <w:rFonts w:ascii="Calibri" w:hAnsi="Calibri"/>
+                <w:color w:val="111827"/>
+                <w:sz w:val="15"/>
+              </w:rPr>
+              <w:t>1051</w:t>
+            </w:r>
+          </w:p>
+        </w:tc>
+      </w:tr>
+      <w:tr>
+        <w:tc>
+          <w:tcPr>
+            <w:tcW w:type="dxa" w:w="454"/>
+            <w:shd w:val="clear" w:color="auto" w:fill="FFFFFF"/>
+          </w:tcPr>
+          <w:p>
+            <w:pPr>
+              <w:spacing w:before="20" w:after="20"/>
+              <w:jc w:val="center"/>
+            </w:pPr>
+            <w:r>
+              <w:rPr>
+                <w:rFonts w:ascii="Calibri" w:hAnsi="Calibri"/>
+                <w:color w:val="111827"/>
+                <w:sz w:val="15"/>
+              </w:rPr>
+              <w:t>13</w:t>
+            </w:r>
+          </w:p>
+        </w:tc>
+        <w:tc>
+          <w:tcPr>
+            <w:tcW w:type="dxa" w:w="4252"/>
+            <w:shd w:val="clear" w:color="auto" w:fill="FFFFFF"/>
+          </w:tcPr>
+          <w:p>
+            <w:pPr>
+              <w:spacing w:before="20" w:after="20"/>
+              <w:jc w:val="left"/>
+            </w:pPr>
+            <w:r>
+              <w:rPr>
+                <w:rFonts w:ascii="Calibri" w:hAnsi="Calibri"/>
+                <w:color w:val="111827"/>
+                <w:sz w:val="15"/>
+              </w:rPr>
+              <w:t>talon.one/blog/top-10-enterprise-loyalty-program-software-for-2026</w:t>
+            </w:r>
+          </w:p>
+        </w:tc>
+        <w:tc>
+          <w:tcPr>
+            <w:tcW w:type="dxa" w:w="510"/>
+            <w:shd w:val="clear" w:color="auto" w:fill="FFFFFF"/>
+          </w:tcPr>
+          <w:p>
+            <w:pPr>
+              <w:spacing w:before="20" w:after="20"/>
+              <w:jc w:val="center"/>
+            </w:pPr>
+            <w:r>
+              <w:rPr>
+                <w:rFonts w:ascii="Calibri" w:hAnsi="Calibri"/>
+                <w:color w:val="111827"/>
+                <w:sz w:val="15"/>
+              </w:rPr>
+              <w:t>70</w:t>
+            </w:r>
+          </w:p>
+        </w:tc>
+        <w:tc>
+          <w:tcPr>
+            <w:tcW w:type="dxa" w:w="510"/>
+            <w:shd w:val="clear" w:color="auto" w:fill="FFFFFF"/>
+          </w:tcPr>
+          <w:p>
+            <w:pPr>
+              <w:spacing w:before="20" w:after="20"/>
+              <w:jc w:val="center"/>
+            </w:pPr>
+            <w:r>
+              <w:rPr>
+                <w:rFonts w:ascii="Calibri" w:hAnsi="Calibri"/>
+                <w:color w:val="111827"/>
+                <w:sz w:val="15"/>
+              </w:rPr>
+              <w:t>4</w:t>
+            </w:r>
+          </w:p>
+        </w:tc>
+        <w:tc>
+          <w:tcPr>
+            <w:tcW w:type="dxa" w:w="907"/>
+            <w:shd w:val="clear" w:color="auto" w:fill="FFFFFF"/>
+          </w:tcPr>
+          <w:p>
+            <w:pPr>
+              <w:spacing w:before="20" w:after="20"/>
+              <w:jc w:val="center"/>
+            </w:pPr>
+            <w:r>
+              <w:rPr>
+                <w:rFonts w:ascii="Calibri" w:hAnsi="Calibri"/>
+                <w:color w:val="111827"/>
+                <w:sz w:val="15"/>
+              </w:rPr>
+              <w:t>11</w:t>
+            </w:r>
+          </w:p>
+        </w:tc>
+        <w:tc>
+          <w:tcPr>
+            <w:tcW w:type="dxa" w:w="850"/>
+            <w:shd w:val="clear" w:color="auto" w:fill="FFFFFF"/>
+          </w:tcPr>
+          <w:p>
+            <w:pPr>
+              <w:spacing w:before="20" w:after="20"/>
+              <w:jc w:val="center"/>
+            </w:pPr>
+            <w:r>
+              <w:rPr>
+                <w:rFonts w:ascii="Calibri" w:hAnsi="Calibri"/>
+                <w:color w:val="111827"/>
+                <w:sz w:val="15"/>
+              </w:rPr>
+              <w:t>243</w:t>
+            </w:r>
+          </w:p>
+        </w:tc>
+      </w:tr>
+    </w:tbl>
+    <w:p/>
+    <w:p>
+      <w:pPr>
+        <w:spacing w:before="40" w:after="160"/>
+      </w:pPr>
+      <w:r>
+        <w:rPr>
+          <w:rFonts w:ascii="Calibri" w:hAnsi="Calibri"/>
+          <w:b/>
+          <w:i w:val="0"/>
+          <w:color w:val="111827"/>
+          <w:sz w:val="18"/>
+        </w:rPr>
+        <w:t xml:space="preserve">SERP Character: </w:t>
+      </w:r>
+      <w:r>
+        <w:rPr>
+          <w:rFonts w:ascii="Calibri" w:hAnsi="Calibri"/>
+          <w:b w:val="0"/>
+          <w:i w:val="0"/>
+          <w:color w:val="6B7280"/>
+          <w:sz w:val="18"/>
+        </w:rPr>
+        <w:t>Heavily AI Overview-dominated SERP — positions 1–3 are AI-generated features (null data). First real organic result is Gartner (DR92, only 14 RDs) at pos 2, confirming DR trumps backlink volume here. Open Loyalty ranks pos 4 with 735 RDs — already well above the top-5 median of 502 RDs, so no backlink gap exists. Main competition comes from SMB tools (Loopy Loyalty, Smile.io) not enterprise peers: Antavo, Voucherify, and LoyaltyLion do not appear in the top 20 at all. Path to pos 1–3 is content depth and AI Overview inclusion, not backlinks.</w:t>
       </w:r>
     </w:p>
     <w:p>

</xml_diff>